<commit_message>
Add PDF version of the Machine Learning Fundamentals project report
</commit_message>
<xml_diff>
--- a/Sem1/Machine Learning Fundamentals/project-assignment/report.docx
+++ b/Sem1/Machine Learning Fundamentals/project-assignment/report.docx
@@ -207,7 +207,6 @@
           <w:u w:val="single"/>
         </w:rPr>
       </w:pPr>
-      <w:proofErr w:type="spellStart"/>
       <w:r>
         <w:rPr>
           <w:b/>
@@ -215,17 +214,7 @@
           <w:szCs w:val="28"/>
           <w:u w:val="single"/>
         </w:rPr>
-        <w:t>Programme</w:t>
-      </w:r>
-      <w:proofErr w:type="spellEnd"/>
-      <w:r>
-        <w:rPr>
-          <w:b/>
-          <w:sz w:val="28"/>
-          <w:szCs w:val="28"/>
-          <w:u w:val="single"/>
-        </w:rPr>
-        <w:t xml:space="preserve"> title:</w:t>
+        <w:t>Programme title:</w:t>
       </w:r>
     </w:p>
     <w:p>
@@ -476,6 +465,10 @@
       <w:pPr>
         <w:spacing w:line="360" w:lineRule="auto"/>
         <w:jc w:val="left"/>
+        <w:rPr>
+          <w:sz w:val="28"/>
+          <w:szCs w:val="28"/>
+        </w:rPr>
       </w:pPr>
       <w:r>
         <w:rPr>
@@ -484,27 +477,996 @@
         </w:rPr>
         <w:t xml:space="preserve">Dr. </w:t>
       </w:r>
-      <w:proofErr w:type="spellStart"/>
       <w:r>
         <w:rPr>
           <w:sz w:val="28"/>
           <w:szCs w:val="28"/>
         </w:rPr>
-        <w:t>Fahmid</w:t>
-      </w:r>
-      <w:proofErr w:type="spellEnd"/>
-      <w:r>
+        <w:t>Fahmid Al Farid</w:t>
+      </w:r>
+    </w:p>
+    <w:p>
+      <w:pPr>
+        <w:spacing w:after="160"/>
+        <w:jc w:val="left"/>
         <w:rPr>
           <w:sz w:val="28"/>
           <w:szCs w:val="28"/>
         </w:rPr>
-        <w:t xml:space="preserve"> Al Farid</w:t>
-      </w:r>
-    </w:p>
-    <w:p>
-      <w:pPr>
-        <w:jc w:val="center"/>
-      </w:pPr>
+      </w:pPr>
+      <w:r>
+        <w:rPr>
+          <w:sz w:val="28"/>
+          <w:szCs w:val="28"/>
+        </w:rPr>
+        <w:br w:type="page"/>
+      </w:r>
+    </w:p>
+    <w:p>
+      <w:pPr>
+        <w:spacing w:after="160"/>
+        <w:jc w:val="left"/>
+        <w:rPr>
+          <w:rFonts w:eastAsiaTheme="majorEastAsia" w:cstheme="majorBidi"/>
+          <w:b/>
+          <w:color w:val="000000" w:themeColor="text1"/>
+          <w:sz w:val="32"/>
+          <w:szCs w:val="40"/>
+        </w:rPr>
+      </w:pPr>
+      <w:r>
+        <w:rPr>
+          <w:rFonts w:eastAsiaTheme="majorEastAsia" w:cstheme="majorBidi"/>
+          <w:b/>
+          <w:color w:val="000000" w:themeColor="text1"/>
+          <w:sz w:val="28"/>
+          <w:szCs w:val="36"/>
+        </w:rPr>
+        <w:lastRenderedPageBreak/>
+        <w:t>Learner declaration</w:t>
+      </w:r>
+    </w:p>
+    <w:tbl>
+      <w:tblPr>
+        <w:tblW w:w="5000" w:type="pct"/>
+        <w:tblCellMar>
+          <w:top w:w="15" w:type="dxa"/>
+          <w:left w:w="15" w:type="dxa"/>
+          <w:bottom w:w="15" w:type="dxa"/>
+          <w:right w:w="15" w:type="dxa"/>
+        </w:tblCellMar>
+        <w:tblLook w:val="04A0" w:firstRow="1" w:lastRow="0" w:firstColumn="1" w:lastColumn="0" w:noHBand="0" w:noVBand="1"/>
+      </w:tblPr>
+      <w:tblGrid>
+        <w:gridCol w:w="7809"/>
+        <w:gridCol w:w="1201"/>
+      </w:tblGrid>
+      <w:tr>
+        <w:trPr>
+          <w:tblHeader/>
+        </w:trPr>
+        <w:tc>
+          <w:tcPr>
+            <w:tcW w:w="0" w:type="auto"/>
+            <w:tcBorders>
+              <w:top w:val="single" w:sz="6" w:space="0" w:color="DDDDDD"/>
+              <w:left w:val="single" w:sz="6" w:space="0" w:color="DDDDDD"/>
+              <w:bottom w:val="single" w:sz="6" w:space="0" w:color="DDDDDD"/>
+              <w:right w:val="single" w:sz="6" w:space="0" w:color="DDDDDD"/>
+            </w:tcBorders>
+            <w:shd w:val="clear" w:color="auto" w:fill="F2F2F2"/>
+            <w:tcMar>
+              <w:top w:w="120" w:type="dxa"/>
+              <w:left w:w="120" w:type="dxa"/>
+              <w:bottom w:w="120" w:type="dxa"/>
+              <w:right w:w="120" w:type="dxa"/>
+            </w:tcMar>
+            <w:vAlign w:val="center"/>
+            <w:hideMark/>
+          </w:tcPr>
+          <w:p>
+            <w:pPr>
+              <w:jc w:val="left"/>
+              <w:rPr>
+                <w:rFonts w:eastAsiaTheme="majorEastAsia" w:cstheme="majorBidi"/>
+                <w:b/>
+                <w:bCs/>
+                <w:color w:val="000000" w:themeColor="text1"/>
+              </w:rPr>
+            </w:pPr>
+            <w:r>
+              <w:rPr>
+                <w:rFonts w:eastAsiaTheme="majorEastAsia" w:cstheme="majorBidi"/>
+                <w:b/>
+                <w:bCs/>
+                <w:color w:val="000000" w:themeColor="text1"/>
+              </w:rPr>
+              <w:t>Item</w:t>
+            </w:r>
+          </w:p>
+        </w:tc>
+        <w:tc>
+          <w:tcPr>
+            <w:tcW w:w="0" w:type="auto"/>
+            <w:tcBorders>
+              <w:top w:val="single" w:sz="6" w:space="0" w:color="DDDDDD"/>
+              <w:left w:val="single" w:sz="6" w:space="0" w:color="DDDDDD"/>
+              <w:bottom w:val="single" w:sz="6" w:space="0" w:color="DDDDDD"/>
+              <w:right w:val="single" w:sz="6" w:space="0" w:color="DDDDDD"/>
+            </w:tcBorders>
+            <w:shd w:val="clear" w:color="auto" w:fill="F2F2F2"/>
+            <w:tcMar>
+              <w:top w:w="120" w:type="dxa"/>
+              <w:left w:w="120" w:type="dxa"/>
+              <w:bottom w:w="120" w:type="dxa"/>
+              <w:right w:w="120" w:type="dxa"/>
+            </w:tcMar>
+            <w:vAlign w:val="center"/>
+            <w:hideMark/>
+          </w:tcPr>
+          <w:p>
+            <w:pPr>
+              <w:jc w:val="left"/>
+              <w:rPr>
+                <w:rFonts w:eastAsiaTheme="majorEastAsia" w:cstheme="majorBidi"/>
+                <w:b/>
+                <w:bCs/>
+                <w:color w:val="000000" w:themeColor="text1"/>
+              </w:rPr>
+            </w:pPr>
+            <w:r>
+              <w:rPr>
+                <w:rFonts w:eastAsiaTheme="majorEastAsia" w:cstheme="majorBidi"/>
+                <w:b/>
+                <w:bCs/>
+                <w:color w:val="000000" w:themeColor="text1"/>
+              </w:rPr>
+              <w:t>Response</w:t>
+            </w:r>
+          </w:p>
+        </w:tc>
+      </w:tr>
+      <w:tr>
+        <w:tc>
+          <w:tcPr>
+            <w:tcW w:w="0" w:type="auto"/>
+            <w:tcBorders>
+              <w:top w:val="single" w:sz="6" w:space="0" w:color="DDDDDD"/>
+              <w:left w:val="single" w:sz="6" w:space="0" w:color="DDDDDD"/>
+              <w:bottom w:val="single" w:sz="6" w:space="0" w:color="DDDDDD"/>
+              <w:right w:val="single" w:sz="6" w:space="0" w:color="DDDDDD"/>
+            </w:tcBorders>
+            <w:tcMar>
+              <w:top w:w="120" w:type="dxa"/>
+              <w:left w:w="120" w:type="dxa"/>
+              <w:bottom w:w="120" w:type="dxa"/>
+              <w:right w:w="120" w:type="dxa"/>
+            </w:tcMar>
+            <w:vAlign w:val="center"/>
+            <w:hideMark/>
+          </w:tcPr>
+          <w:p>
+            <w:pPr>
+              <w:jc w:val="left"/>
+              <w:rPr>
+                <w:rFonts w:eastAsiaTheme="majorEastAsia" w:cstheme="majorBidi"/>
+                <w:color w:val="000000" w:themeColor="text1"/>
+              </w:rPr>
+            </w:pPr>
+            <w:r>
+              <w:rPr>
+                <w:rFonts w:eastAsiaTheme="majorEastAsia" w:cstheme="majorBidi"/>
+                <w:color w:val="000000" w:themeColor="text1"/>
+              </w:rPr>
+              <w:t>Word count</w:t>
+            </w:r>
+          </w:p>
+        </w:tc>
+        <w:tc>
+          <w:tcPr>
+            <w:tcW w:w="0" w:type="auto"/>
+            <w:tcBorders>
+              <w:top w:val="single" w:sz="6" w:space="0" w:color="DDDDDD"/>
+              <w:left w:val="single" w:sz="6" w:space="0" w:color="DDDDDD"/>
+              <w:bottom w:val="single" w:sz="6" w:space="0" w:color="DDDDDD"/>
+              <w:right w:val="single" w:sz="6" w:space="0" w:color="DDDDDD"/>
+            </w:tcBorders>
+            <w:tcMar>
+              <w:top w:w="120" w:type="dxa"/>
+              <w:left w:w="120" w:type="dxa"/>
+              <w:bottom w:w="120" w:type="dxa"/>
+              <w:right w:w="120" w:type="dxa"/>
+            </w:tcMar>
+            <w:vAlign w:val="center"/>
+            <w:hideMark/>
+          </w:tcPr>
+          <w:p>
+            <w:pPr>
+              <w:jc w:val="left"/>
+              <w:rPr>
+                <w:rFonts w:eastAsiaTheme="majorEastAsia" w:cstheme="majorBidi"/>
+                <w:color w:val="000000" w:themeColor="text1"/>
+              </w:rPr>
+            </w:pPr>
+            <w:r>
+              <w:rPr>
+                <w:rFonts w:eastAsiaTheme="majorEastAsia" w:cstheme="majorBidi"/>
+                <w:color w:val="000000" w:themeColor="text1"/>
+              </w:rPr>
+              <w:t>28</w:t>
+            </w:r>
+            <w:r>
+              <w:rPr>
+                <w:rFonts w:eastAsiaTheme="majorEastAsia" w:cstheme="majorBidi"/>
+                <w:color w:val="000000" w:themeColor="text1"/>
+              </w:rPr>
+              <w:t>7</w:t>
+            </w:r>
+            <w:r>
+              <w:rPr>
+                <w:rFonts w:eastAsiaTheme="majorEastAsia" w:cstheme="majorBidi"/>
+                <w:color w:val="000000" w:themeColor="text1"/>
+              </w:rPr>
+              <w:t>6</w:t>
+            </w:r>
+          </w:p>
+        </w:tc>
+      </w:tr>
+      <w:tr>
+        <w:tc>
+          <w:tcPr>
+            <w:tcW w:w="0" w:type="auto"/>
+            <w:tcBorders>
+              <w:top w:val="single" w:sz="6" w:space="0" w:color="DDDDDD"/>
+              <w:left w:val="single" w:sz="6" w:space="0" w:color="DDDDDD"/>
+              <w:bottom w:val="single" w:sz="6" w:space="0" w:color="DDDDDD"/>
+              <w:right w:val="single" w:sz="6" w:space="0" w:color="DDDDDD"/>
+            </w:tcBorders>
+            <w:tcMar>
+              <w:top w:w="120" w:type="dxa"/>
+              <w:left w:w="120" w:type="dxa"/>
+              <w:bottom w:w="120" w:type="dxa"/>
+              <w:right w:w="120" w:type="dxa"/>
+            </w:tcMar>
+            <w:vAlign w:val="center"/>
+            <w:hideMark/>
+          </w:tcPr>
+          <w:p>
+            <w:pPr>
+              <w:jc w:val="left"/>
+              <w:rPr>
+                <w:rFonts w:eastAsiaTheme="majorEastAsia" w:cstheme="majorBidi"/>
+                <w:color w:val="000000" w:themeColor="text1"/>
+              </w:rPr>
+            </w:pPr>
+            <w:r>
+              <w:rPr>
+                <w:rFonts w:eastAsiaTheme="majorEastAsia" w:cstheme="majorBidi"/>
+                <w:color w:val="000000" w:themeColor="text1"/>
+              </w:rPr>
+              <w:t>Use of proof-reader/proof-reading service</w:t>
+            </w:r>
+          </w:p>
+        </w:tc>
+        <w:tc>
+          <w:tcPr>
+            <w:tcW w:w="0" w:type="auto"/>
+            <w:tcBorders>
+              <w:top w:val="single" w:sz="6" w:space="0" w:color="DDDDDD"/>
+              <w:left w:val="single" w:sz="6" w:space="0" w:color="DDDDDD"/>
+              <w:bottom w:val="single" w:sz="6" w:space="0" w:color="DDDDDD"/>
+              <w:right w:val="single" w:sz="6" w:space="0" w:color="DDDDDD"/>
+            </w:tcBorders>
+            <w:tcMar>
+              <w:top w:w="120" w:type="dxa"/>
+              <w:left w:w="120" w:type="dxa"/>
+              <w:bottom w:w="120" w:type="dxa"/>
+              <w:right w:w="120" w:type="dxa"/>
+            </w:tcMar>
+            <w:vAlign w:val="center"/>
+            <w:hideMark/>
+          </w:tcPr>
+          <w:p>
+            <w:pPr>
+              <w:jc w:val="left"/>
+              <w:rPr>
+                <w:rFonts w:eastAsiaTheme="majorEastAsia" w:cstheme="majorBidi"/>
+                <w:color w:val="000000" w:themeColor="text1"/>
+              </w:rPr>
+            </w:pPr>
+            <w:r>
+              <w:rPr>
+                <w:rFonts w:eastAsiaTheme="majorEastAsia" w:cstheme="majorBidi"/>
+                <w:color w:val="000000" w:themeColor="text1"/>
+              </w:rPr>
+              <w:t>NO</w:t>
+            </w:r>
+          </w:p>
+        </w:tc>
+      </w:tr>
+      <w:tr>
+        <w:tc>
+          <w:tcPr>
+            <w:tcW w:w="0" w:type="auto"/>
+            <w:tcBorders>
+              <w:top w:val="single" w:sz="6" w:space="0" w:color="DDDDDD"/>
+              <w:left w:val="single" w:sz="6" w:space="0" w:color="DDDDDD"/>
+              <w:bottom w:val="single" w:sz="6" w:space="0" w:color="DDDDDD"/>
+              <w:right w:val="single" w:sz="6" w:space="0" w:color="DDDDDD"/>
+            </w:tcBorders>
+            <w:tcMar>
+              <w:top w:w="120" w:type="dxa"/>
+              <w:left w:w="120" w:type="dxa"/>
+              <w:bottom w:w="120" w:type="dxa"/>
+              <w:right w:w="120" w:type="dxa"/>
+            </w:tcMar>
+            <w:vAlign w:val="center"/>
+            <w:hideMark/>
+          </w:tcPr>
+          <w:p>
+            <w:pPr>
+              <w:jc w:val="left"/>
+              <w:rPr>
+                <w:rFonts w:eastAsiaTheme="majorEastAsia" w:cstheme="majorBidi"/>
+                <w:color w:val="000000" w:themeColor="text1"/>
+              </w:rPr>
+            </w:pPr>
+            <w:r>
+              <w:rPr>
+                <w:rFonts w:eastAsiaTheme="majorEastAsia" w:cstheme="majorBidi"/>
+                <w:color w:val="000000" w:themeColor="text1"/>
+              </w:rPr>
+              <w:t>If yes, specify which service</w:t>
+            </w:r>
+          </w:p>
+        </w:tc>
+        <w:tc>
+          <w:tcPr>
+            <w:tcW w:w="0" w:type="auto"/>
+            <w:tcBorders>
+              <w:top w:val="single" w:sz="6" w:space="0" w:color="DDDDDD"/>
+              <w:left w:val="single" w:sz="6" w:space="0" w:color="DDDDDD"/>
+              <w:bottom w:val="single" w:sz="6" w:space="0" w:color="DDDDDD"/>
+              <w:right w:val="single" w:sz="6" w:space="0" w:color="DDDDDD"/>
+            </w:tcBorders>
+            <w:tcMar>
+              <w:top w:w="120" w:type="dxa"/>
+              <w:left w:w="120" w:type="dxa"/>
+              <w:bottom w:w="120" w:type="dxa"/>
+              <w:right w:w="120" w:type="dxa"/>
+            </w:tcMar>
+            <w:vAlign w:val="center"/>
+            <w:hideMark/>
+          </w:tcPr>
+          <w:p>
+            <w:pPr>
+              <w:jc w:val="left"/>
+              <w:rPr>
+                <w:rFonts w:eastAsiaTheme="majorEastAsia" w:cstheme="majorBidi"/>
+                <w:color w:val="000000" w:themeColor="text1"/>
+              </w:rPr>
+            </w:pPr>
+            <w:r>
+              <w:rPr>
+                <w:rFonts w:eastAsiaTheme="majorEastAsia" w:cstheme="majorBidi"/>
+                <w:color w:val="000000" w:themeColor="text1"/>
+              </w:rPr>
+              <w:t>N/A</w:t>
+            </w:r>
+          </w:p>
+        </w:tc>
+      </w:tr>
+      <w:tr>
+        <w:tc>
+          <w:tcPr>
+            <w:tcW w:w="0" w:type="auto"/>
+            <w:tcBorders>
+              <w:top w:val="single" w:sz="6" w:space="0" w:color="DDDDDD"/>
+              <w:left w:val="single" w:sz="6" w:space="0" w:color="DDDDDD"/>
+              <w:bottom w:val="single" w:sz="6" w:space="0" w:color="DDDDDD"/>
+              <w:right w:val="single" w:sz="6" w:space="0" w:color="DDDDDD"/>
+            </w:tcBorders>
+            <w:tcMar>
+              <w:top w:w="120" w:type="dxa"/>
+              <w:left w:w="120" w:type="dxa"/>
+              <w:bottom w:w="120" w:type="dxa"/>
+              <w:right w:w="120" w:type="dxa"/>
+            </w:tcMar>
+            <w:vAlign w:val="center"/>
+            <w:hideMark/>
+          </w:tcPr>
+          <w:p>
+            <w:pPr>
+              <w:jc w:val="left"/>
+              <w:rPr>
+                <w:rFonts w:eastAsiaTheme="majorEastAsia" w:cstheme="majorBidi"/>
+                <w:color w:val="000000" w:themeColor="text1"/>
+              </w:rPr>
+            </w:pPr>
+            <w:r>
+              <w:rPr>
+                <w:rFonts w:eastAsiaTheme="majorEastAsia" w:cstheme="majorBidi"/>
+                <w:color w:val="000000" w:themeColor="text1"/>
+              </w:rPr>
+              <w:t>I confirm that I submit this work as my own work and have cited all sources used</w:t>
+            </w:r>
+          </w:p>
+        </w:tc>
+        <w:tc>
+          <w:tcPr>
+            <w:tcW w:w="0" w:type="auto"/>
+            <w:tcBorders>
+              <w:top w:val="single" w:sz="6" w:space="0" w:color="DDDDDD"/>
+              <w:left w:val="single" w:sz="6" w:space="0" w:color="DDDDDD"/>
+              <w:bottom w:val="single" w:sz="6" w:space="0" w:color="DDDDDD"/>
+              <w:right w:val="single" w:sz="6" w:space="0" w:color="DDDDDD"/>
+            </w:tcBorders>
+            <w:tcMar>
+              <w:top w:w="120" w:type="dxa"/>
+              <w:left w:w="120" w:type="dxa"/>
+              <w:bottom w:w="120" w:type="dxa"/>
+              <w:right w:w="120" w:type="dxa"/>
+            </w:tcMar>
+            <w:vAlign w:val="center"/>
+            <w:hideMark/>
+          </w:tcPr>
+          <w:p>
+            <w:pPr>
+              <w:jc w:val="left"/>
+              <w:rPr>
+                <w:rFonts w:eastAsiaTheme="majorEastAsia" w:cstheme="majorBidi"/>
+                <w:color w:val="000000" w:themeColor="text1"/>
+              </w:rPr>
+            </w:pPr>
+            <w:r>
+              <w:rPr>
+                <w:rFonts w:eastAsiaTheme="majorEastAsia" w:cstheme="majorBidi"/>
+                <w:color w:val="000000" w:themeColor="text1"/>
+              </w:rPr>
+              <w:t>YES</w:t>
+            </w:r>
+          </w:p>
+        </w:tc>
+      </w:tr>
+      <w:tr>
+        <w:tc>
+          <w:tcPr>
+            <w:tcW w:w="0" w:type="auto"/>
+            <w:tcBorders>
+              <w:top w:val="single" w:sz="6" w:space="0" w:color="DDDDDD"/>
+              <w:left w:val="single" w:sz="6" w:space="0" w:color="DDDDDD"/>
+              <w:bottom w:val="single" w:sz="6" w:space="0" w:color="DDDDDD"/>
+              <w:right w:val="single" w:sz="6" w:space="0" w:color="DDDDDD"/>
+            </w:tcBorders>
+            <w:tcMar>
+              <w:top w:w="120" w:type="dxa"/>
+              <w:left w:w="120" w:type="dxa"/>
+              <w:bottom w:w="120" w:type="dxa"/>
+              <w:right w:w="120" w:type="dxa"/>
+            </w:tcMar>
+            <w:vAlign w:val="center"/>
+            <w:hideMark/>
+          </w:tcPr>
+          <w:p>
+            <w:pPr>
+              <w:jc w:val="left"/>
+              <w:rPr>
+                <w:rFonts w:eastAsiaTheme="majorEastAsia" w:cstheme="majorBidi"/>
+                <w:color w:val="000000" w:themeColor="text1"/>
+              </w:rPr>
+            </w:pPr>
+            <w:r>
+              <w:rPr>
+                <w:rFonts w:eastAsiaTheme="majorEastAsia" w:cstheme="majorBidi"/>
+                <w:color w:val="000000" w:themeColor="text1"/>
+              </w:rPr>
+              <w:t>I confirm that I have followed guidance on the acceptable use of AI tools for this assignment</w:t>
+            </w:r>
+          </w:p>
+        </w:tc>
+        <w:tc>
+          <w:tcPr>
+            <w:tcW w:w="0" w:type="auto"/>
+            <w:tcBorders>
+              <w:top w:val="single" w:sz="6" w:space="0" w:color="DDDDDD"/>
+              <w:left w:val="single" w:sz="6" w:space="0" w:color="DDDDDD"/>
+              <w:bottom w:val="single" w:sz="6" w:space="0" w:color="DDDDDD"/>
+              <w:right w:val="single" w:sz="6" w:space="0" w:color="DDDDDD"/>
+            </w:tcBorders>
+            <w:tcMar>
+              <w:top w:w="120" w:type="dxa"/>
+              <w:left w:w="120" w:type="dxa"/>
+              <w:bottom w:w="120" w:type="dxa"/>
+              <w:right w:w="120" w:type="dxa"/>
+            </w:tcMar>
+            <w:vAlign w:val="center"/>
+            <w:hideMark/>
+          </w:tcPr>
+          <w:p>
+            <w:pPr>
+              <w:jc w:val="left"/>
+              <w:rPr>
+                <w:rFonts w:eastAsiaTheme="majorEastAsia" w:cstheme="majorBidi"/>
+                <w:color w:val="000000" w:themeColor="text1"/>
+              </w:rPr>
+            </w:pPr>
+            <w:r>
+              <w:rPr>
+                <w:rFonts w:eastAsiaTheme="majorEastAsia" w:cstheme="majorBidi"/>
+                <w:color w:val="000000" w:themeColor="text1"/>
+              </w:rPr>
+              <w:t>YES</w:t>
+            </w:r>
+          </w:p>
+        </w:tc>
+      </w:tr>
+      <w:tr>
+        <w:tc>
+          <w:tcPr>
+            <w:tcW w:w="0" w:type="auto"/>
+            <w:tcBorders>
+              <w:top w:val="single" w:sz="6" w:space="0" w:color="DDDDDD"/>
+              <w:left w:val="single" w:sz="6" w:space="0" w:color="DDDDDD"/>
+              <w:bottom w:val="single" w:sz="6" w:space="0" w:color="DDDDDD"/>
+              <w:right w:val="single" w:sz="6" w:space="0" w:color="DDDDDD"/>
+            </w:tcBorders>
+            <w:tcMar>
+              <w:top w:w="120" w:type="dxa"/>
+              <w:left w:w="120" w:type="dxa"/>
+              <w:bottom w:w="120" w:type="dxa"/>
+              <w:right w:w="120" w:type="dxa"/>
+            </w:tcMar>
+            <w:vAlign w:val="center"/>
+            <w:hideMark/>
+          </w:tcPr>
+          <w:p>
+            <w:pPr>
+              <w:jc w:val="left"/>
+              <w:rPr>
+                <w:rFonts w:eastAsiaTheme="majorEastAsia" w:cstheme="majorBidi"/>
+                <w:color w:val="000000" w:themeColor="text1"/>
+              </w:rPr>
+            </w:pPr>
+            <w:r>
+              <w:rPr>
+                <w:rFonts w:eastAsiaTheme="majorEastAsia" w:cstheme="majorBidi"/>
+                <w:color w:val="000000" w:themeColor="text1"/>
+              </w:rPr>
+              <w:t>Where use of appropriately cited AI tools is permitted, I confirm that I have cited in accordance with the UCA Harvard Referencing Standard</w:t>
+            </w:r>
+          </w:p>
+        </w:tc>
+        <w:tc>
+          <w:tcPr>
+            <w:tcW w:w="0" w:type="auto"/>
+            <w:tcBorders>
+              <w:top w:val="single" w:sz="6" w:space="0" w:color="DDDDDD"/>
+              <w:left w:val="single" w:sz="6" w:space="0" w:color="DDDDDD"/>
+              <w:bottom w:val="single" w:sz="6" w:space="0" w:color="DDDDDD"/>
+              <w:right w:val="single" w:sz="6" w:space="0" w:color="DDDDDD"/>
+            </w:tcBorders>
+            <w:tcMar>
+              <w:top w:w="120" w:type="dxa"/>
+              <w:left w:w="120" w:type="dxa"/>
+              <w:bottom w:w="120" w:type="dxa"/>
+              <w:right w:w="120" w:type="dxa"/>
+            </w:tcMar>
+            <w:vAlign w:val="center"/>
+            <w:hideMark/>
+          </w:tcPr>
+          <w:p>
+            <w:pPr>
+              <w:jc w:val="left"/>
+              <w:rPr>
+                <w:rFonts w:eastAsiaTheme="majorEastAsia" w:cstheme="majorBidi"/>
+                <w:color w:val="000000" w:themeColor="text1"/>
+              </w:rPr>
+            </w:pPr>
+            <w:r>
+              <w:rPr>
+                <w:rFonts w:eastAsiaTheme="majorEastAsia" w:cstheme="majorBidi"/>
+                <w:color w:val="000000" w:themeColor="text1"/>
+              </w:rPr>
+              <w:t>YES</w:t>
+            </w:r>
+          </w:p>
+        </w:tc>
+      </w:tr>
+    </w:tbl>
+    <w:p>
+      <w:pPr>
+        <w:spacing w:after="160"/>
+        <w:jc w:val="left"/>
+        <w:rPr>
+          <w:rFonts w:eastAsiaTheme="majorEastAsia" w:cstheme="majorBidi"/>
+          <w:b/>
+          <w:color w:val="000000" w:themeColor="text1"/>
+          <w:sz w:val="32"/>
+          <w:szCs w:val="40"/>
+        </w:rPr>
+      </w:pPr>
+    </w:p>
+    <w:tbl>
+      <w:tblPr>
+        <w:tblW w:w="5000" w:type="pct"/>
+        <w:tblCellMar>
+          <w:top w:w="15" w:type="dxa"/>
+          <w:left w:w="15" w:type="dxa"/>
+          <w:bottom w:w="15" w:type="dxa"/>
+          <w:right w:w="15" w:type="dxa"/>
+        </w:tblCellMar>
+        <w:tblLook w:val="04A0" w:firstRow="1" w:lastRow="0" w:firstColumn="1" w:lastColumn="0" w:noHBand="0" w:noVBand="1"/>
+      </w:tblPr>
+      <w:tblGrid>
+        <w:gridCol w:w="5329"/>
+        <w:gridCol w:w="3681"/>
+      </w:tblGrid>
+      <w:tr>
+        <w:trPr>
+          <w:tblHeader/>
+        </w:trPr>
+        <w:tc>
+          <w:tcPr>
+            <w:tcW w:w="0" w:type="auto"/>
+            <w:tcBorders>
+              <w:top w:val="single" w:sz="6" w:space="0" w:color="DDDDDD"/>
+              <w:left w:val="single" w:sz="6" w:space="0" w:color="DDDDDD"/>
+              <w:bottom w:val="single" w:sz="6" w:space="0" w:color="DDDDDD"/>
+              <w:right w:val="single" w:sz="6" w:space="0" w:color="DDDDDD"/>
+            </w:tcBorders>
+            <w:shd w:val="clear" w:color="auto" w:fill="F2F2F2"/>
+            <w:tcMar>
+              <w:top w:w="120" w:type="dxa"/>
+              <w:left w:w="120" w:type="dxa"/>
+              <w:bottom w:w="120" w:type="dxa"/>
+              <w:right w:w="120" w:type="dxa"/>
+            </w:tcMar>
+            <w:vAlign w:val="center"/>
+            <w:hideMark/>
+          </w:tcPr>
+          <w:p>
+            <w:pPr>
+              <w:spacing w:after="160"/>
+              <w:jc w:val="left"/>
+              <w:rPr>
+                <w:rFonts w:eastAsiaTheme="majorEastAsia" w:cstheme="majorBidi"/>
+                <w:b/>
+                <w:bCs/>
+                <w:color w:val="000000" w:themeColor="text1"/>
+                <w:szCs w:val="32"/>
+              </w:rPr>
+            </w:pPr>
+            <w:r>
+              <w:rPr>
+                <w:rFonts w:eastAsiaTheme="majorEastAsia" w:cstheme="majorBidi"/>
+                <w:b/>
+                <w:bCs/>
+                <w:color w:val="000000" w:themeColor="text1"/>
+                <w:szCs w:val="32"/>
+              </w:rPr>
+              <w:t>Student signature</w:t>
+            </w:r>
+          </w:p>
+        </w:tc>
+        <w:tc>
+          <w:tcPr>
+            <w:tcW w:w="0" w:type="auto"/>
+            <w:tcBorders>
+              <w:top w:val="single" w:sz="6" w:space="0" w:color="DDDDDD"/>
+              <w:left w:val="single" w:sz="6" w:space="0" w:color="DDDDDD"/>
+              <w:bottom w:val="single" w:sz="6" w:space="0" w:color="DDDDDD"/>
+              <w:right w:val="single" w:sz="6" w:space="0" w:color="DDDDDD"/>
+            </w:tcBorders>
+            <w:shd w:val="clear" w:color="auto" w:fill="F2F2F2"/>
+            <w:tcMar>
+              <w:top w:w="120" w:type="dxa"/>
+              <w:left w:w="120" w:type="dxa"/>
+              <w:bottom w:w="120" w:type="dxa"/>
+              <w:right w:w="120" w:type="dxa"/>
+            </w:tcMar>
+            <w:vAlign w:val="center"/>
+            <w:hideMark/>
+          </w:tcPr>
+          <w:p>
+            <w:pPr>
+              <w:spacing w:after="160"/>
+              <w:jc w:val="left"/>
+              <w:rPr>
+                <w:rFonts w:eastAsiaTheme="majorEastAsia" w:cstheme="majorBidi"/>
+                <w:b/>
+                <w:bCs/>
+                <w:color w:val="000000" w:themeColor="text1"/>
+                <w:szCs w:val="32"/>
+              </w:rPr>
+            </w:pPr>
+            <w:r>
+              <w:rPr>
+                <w:rFonts w:eastAsiaTheme="majorEastAsia" w:cstheme="majorBidi"/>
+                <w:b/>
+                <w:bCs/>
+                <w:color w:val="000000" w:themeColor="text1"/>
+                <w:szCs w:val="32"/>
+              </w:rPr>
+              <w:t>Date</w:t>
+            </w:r>
+          </w:p>
+        </w:tc>
+      </w:tr>
+      <w:tr>
+        <w:tc>
+          <w:tcPr>
+            <w:tcW w:w="0" w:type="auto"/>
+            <w:tcBorders>
+              <w:top w:val="single" w:sz="6" w:space="0" w:color="DDDDDD"/>
+              <w:left w:val="single" w:sz="6" w:space="0" w:color="DDDDDD"/>
+              <w:bottom w:val="single" w:sz="6" w:space="0" w:color="DDDDDD"/>
+              <w:right w:val="single" w:sz="6" w:space="0" w:color="DDDDDD"/>
+            </w:tcBorders>
+            <w:tcMar>
+              <w:top w:w="120" w:type="dxa"/>
+              <w:left w:w="120" w:type="dxa"/>
+              <w:bottom w:w="120" w:type="dxa"/>
+              <w:right w:w="120" w:type="dxa"/>
+            </w:tcMar>
+            <w:vAlign w:val="center"/>
+            <w:hideMark/>
+          </w:tcPr>
+          <w:p>
+            <w:pPr>
+              <w:jc w:val="left"/>
+              <w:rPr>
+                <w:rFonts w:eastAsiaTheme="majorEastAsia" w:cstheme="majorBidi"/>
+                <w:b/>
+                <w:bCs/>
+                <w:color w:val="000000" w:themeColor="text1"/>
+              </w:rPr>
+            </w:pPr>
+            <w:r>
+              <w:rPr>
+                <w:noProof/>
+              </w:rPr>
+              <w:drawing>
+                <wp:inline distT="0" distB="0" distL="0" distR="0" wp14:anchorId="34866092" wp14:editId="22339676">
+                  <wp:extent cx="1295138" cy="495300"/>
+                  <wp:effectExtent l="0" t="0" r="0" b="0"/>
+                  <wp:docPr id="1079849710" name="Picture 4"/>
+                  <wp:cNvGraphicFramePr>
+                    <a:graphicFrameLocks xmlns:a="http://schemas.openxmlformats.org/drawingml/2006/main" noChangeAspect="1"/>
+                  </wp:cNvGraphicFramePr>
+                  <a:graphic xmlns:a="http://schemas.openxmlformats.org/drawingml/2006/main">
+                    <a:graphicData uri="http://schemas.openxmlformats.org/drawingml/2006/picture">
+                      <pic:pic xmlns:pic="http://schemas.openxmlformats.org/drawingml/2006/picture">
+                        <pic:nvPicPr>
+                          <pic:cNvPr id="542859284" name="Picture 542859284"/>
+                          <pic:cNvPicPr/>
+                        </pic:nvPicPr>
+                        <pic:blipFill rotWithShape="1">
+                          <a:blip r:embed="rId9" cstate="print">
+                            <a:extLst>
+                              <a:ext uri="{28A0092B-C50C-407E-A947-70E740481C1C}">
+                                <a14:useLocalDpi xmlns:a14="http://schemas.microsoft.com/office/drawing/2010/main" val="0"/>
+                              </a:ext>
+                            </a:extLst>
+                          </a:blip>
+                          <a:srcRect t="16857" b="16493"/>
+                          <a:stretch>
+                            <a:fillRect/>
+                          </a:stretch>
+                        </pic:blipFill>
+                        <pic:spPr bwMode="auto">
+                          <a:xfrm>
+                            <a:off x="0" y="0"/>
+                            <a:ext cx="1318583" cy="504266"/>
+                          </a:xfrm>
+                          <a:prstGeom prst="rect">
+                            <a:avLst/>
+                          </a:prstGeom>
+                          <a:ln>
+                            <a:noFill/>
+                          </a:ln>
+                          <a:extLst>
+                            <a:ext uri="{53640926-AAD7-44D8-BBD7-CCE9431645EC}">
+                              <a14:shadowObscured xmlns:a14="http://schemas.microsoft.com/office/drawing/2010/main"/>
+                            </a:ext>
+                          </a:extLst>
+                        </pic:spPr>
+                      </pic:pic>
+                    </a:graphicData>
+                  </a:graphic>
+                </wp:inline>
+              </w:drawing>
+            </w:r>
+          </w:p>
+        </w:tc>
+        <w:tc>
+          <w:tcPr>
+            <w:tcW w:w="0" w:type="auto"/>
+            <w:tcBorders>
+              <w:top w:val="single" w:sz="6" w:space="0" w:color="DDDDDD"/>
+              <w:left w:val="single" w:sz="6" w:space="0" w:color="DDDDDD"/>
+              <w:bottom w:val="single" w:sz="6" w:space="0" w:color="DDDDDD"/>
+              <w:right w:val="single" w:sz="6" w:space="0" w:color="DDDDDD"/>
+            </w:tcBorders>
+            <w:tcMar>
+              <w:top w:w="120" w:type="dxa"/>
+              <w:left w:w="120" w:type="dxa"/>
+              <w:bottom w:w="120" w:type="dxa"/>
+              <w:right w:w="120" w:type="dxa"/>
+            </w:tcMar>
+            <w:vAlign w:val="center"/>
+            <w:hideMark/>
+          </w:tcPr>
+          <w:p>
+            <w:pPr>
+              <w:spacing w:line="360" w:lineRule="auto"/>
+              <w:jc w:val="left"/>
+              <w:rPr>
+                <w:bCs/>
+              </w:rPr>
+            </w:pPr>
+            <w:r>
+              <w:rPr>
+                <w:bCs/>
+              </w:rPr>
+              <w:t>1</w:t>
+            </w:r>
+            <w:r>
+              <w:rPr>
+                <w:bCs/>
+              </w:rPr>
+              <w:t>8</w:t>
+            </w:r>
+            <w:r>
+              <w:rPr>
+                <w:bCs/>
+              </w:rPr>
+              <w:t xml:space="preserve"> / </w:t>
+            </w:r>
+            <w:r>
+              <w:rPr>
+                <w:bCs/>
+              </w:rPr>
+              <w:t>06</w:t>
+            </w:r>
+            <w:r>
+              <w:rPr>
+                <w:bCs/>
+              </w:rPr>
+              <w:t xml:space="preserve"> / 2026</w:t>
+            </w:r>
+          </w:p>
+        </w:tc>
+      </w:tr>
+    </w:tbl>
+    <w:p/>
+    <w:p>
+      <w:pPr>
+        <w:rPr>
+          <w:b/>
+          <w:bCs/>
+          <w:sz w:val="28"/>
+          <w:szCs w:val="28"/>
+        </w:rPr>
+      </w:pPr>
+    </w:p>
+    <w:p>
+      <w:pPr>
+        <w:spacing w:after="240"/>
+        <w:rPr>
+          <w:b/>
+          <w:bCs/>
+          <w:sz w:val="28"/>
+          <w:szCs w:val="28"/>
+        </w:rPr>
+      </w:pPr>
+      <w:r>
+        <w:rPr>
+          <w:b/>
+          <w:bCs/>
+          <w:sz w:val="28"/>
+          <w:szCs w:val="28"/>
+        </w:rPr>
+        <w:t>Source Code and Relevant Project Links</w:t>
+      </w:r>
+    </w:p>
+    <w:p>
+      <w:pPr>
+        <w:spacing w:after="240"/>
+        <w:rPr>
+          <w:b/>
+          <w:bCs/>
+        </w:rPr>
+      </w:pPr>
+      <w:r>
+        <w:rPr>
+          <w:b/>
+          <w:bCs/>
+        </w:rPr>
+        <w:t>Source Code</w:t>
+      </w:r>
+    </w:p>
+    <w:p>
+      <w:pPr>
+        <w:spacing w:after="240"/>
+      </w:pPr>
+      <w:hyperlink r:id="rId10" w:history="1">
+        <w:r>
+          <w:rPr>
+            <w:rStyle w:val="Hyperlink"/>
+          </w:rPr>
+          <w:t>https://github.com/Amaan9136/bsbi-assignments/blob/main/Sem1/Machine%20Learning%20Fundamentals/project-assignment/main.ipynb</w:t>
+        </w:r>
+      </w:hyperlink>
+      <w:r>
+        <w:t xml:space="preserve"> </w:t>
+      </w:r>
+    </w:p>
+    <w:p>
+      <w:pPr>
+        <w:spacing w:after="240"/>
+        <w:rPr>
+          <w:b/>
+          <w:bCs/>
+        </w:rPr>
+      </w:pPr>
+      <w:r>
+        <w:rPr>
+          <w:b/>
+          <w:bCs/>
+        </w:rPr>
+        <w:t>Dataset</w:t>
+      </w:r>
+    </w:p>
+    <w:p>
+      <w:pPr>
+        <w:spacing w:after="240"/>
+      </w:pPr>
+      <w:hyperlink r:id="rId11" w:history="1">
+        <w:r>
+          <w:rPr>
+            <w:rStyle w:val="Hyperlink"/>
+          </w:rPr>
+          <w:t>https://archive.ics.uci.edu/ml/datasets/individual+household+electric+power+consumptio</w:t>
+        </w:r>
+        <w:r>
+          <w:rPr>
+            <w:rStyle w:val="Hyperlink"/>
+          </w:rPr>
+          <w:t>n</w:t>
+        </w:r>
+      </w:hyperlink>
+      <w:r>
+        <w:t xml:space="preserve"> </w:t>
+      </w:r>
+    </w:p>
+    <w:p>
+      <w:pPr>
+        <w:spacing w:after="240"/>
+        <w:rPr>
+          <w:b/>
+          <w:bCs/>
+        </w:rPr>
+      </w:pPr>
+      <w:r>
+        <w:rPr>
+          <w:b/>
+          <w:bCs/>
+        </w:rPr>
+        <w:t>Report</w:t>
+      </w:r>
+    </w:p>
+    <w:p>
+      <w:pPr>
+        <w:spacing w:after="240"/>
+      </w:pPr>
+    </w:p>
+    <w:p>
+      <w:pPr>
+        <w:spacing w:after="240"/>
+      </w:pPr>
+      <w:r>
+        <w:br w:type="page"/>
+      </w:r>
     </w:p>
     <w:sdt>
       <w:sdtPr>
@@ -3949,23 +4911,7 @@
         <w:spacing w:before="240" w:line="360" w:lineRule="auto"/>
       </w:pPr>
       <w:r>
-        <w:t>This report presents a complete time-series forecasting pipeline for predicting household energy consumption using the UCI Individual Household Electric Power Consumption dataset (</w:t>
-      </w:r>
-      <w:proofErr w:type="spellStart"/>
-      <w:r>
-        <w:t>Hebrail</w:t>
-      </w:r>
-      <w:proofErr w:type="spellEnd"/>
-      <w:r>
-        <w:t xml:space="preserve"> and Berard, 2012), comprising approximately 2,075,259 minute-level observations recorded across a single French household from December 2006 to November 2010. The target variable is </w:t>
-      </w:r>
-      <w:proofErr w:type="spellStart"/>
-      <w:r>
-        <w:t>Global_active_power</w:t>
-      </w:r>
-      <w:proofErr w:type="spellEnd"/>
-      <w:r>
-        <w:t>, representing instantaneous household electricity demand in kilowatts.</w:t>
+        <w:t>This report presents a complete time-series forecasting pipeline for predicting household energy consumption using the UCI Individual Household Electric Power Consumption dataset (Hebrail and Berard, 2012), comprising approximately 2,075,259 minute-level observations recorded across a single French household from December 2006 to November 2010. The target variable is Global_active_power, representing instantaneous household electricity demand in kilowatts.</w:t>
       </w:r>
     </w:p>
     <w:p>
@@ -3973,39 +4919,7 @@
         <w:spacing w:before="240" w:line="360" w:lineRule="auto"/>
       </w:pPr>
       <w:r>
-        <w:t xml:space="preserve">Following systematic preprocessing, including time-based linear interpolation for missing values, datetime indexing, and hourly resampling, a feature set of 20 inputs was constructed comprising cyclical time encodings, lag variables at six temporal offsets, and 24-hour rolling statistics. Three algorithms were implemented and evaluated: </w:t>
-      </w:r>
-      <w:proofErr w:type="gramStart"/>
-      <w:r>
-        <w:t>SARIMA(</w:t>
-      </w:r>
-      <w:proofErr w:type="gramEnd"/>
-      <w:r>
-        <w:t>1,0,</w:t>
-      </w:r>
-      <w:proofErr w:type="gramStart"/>
-      <w:r>
-        <w:t>1)(</w:t>
-      </w:r>
-      <w:proofErr w:type="gramEnd"/>
-      <w:r>
-        <w:t>1,0,</w:t>
-      </w:r>
-      <w:proofErr w:type="gramStart"/>
-      <w:r>
-        <w:t>1)[</w:t>
-      </w:r>
-      <w:proofErr w:type="gramEnd"/>
-      <w:r>
-        <w:t xml:space="preserve">7], Random Forest Regressor, and Gradient Boosting Regressor. Models were assessed on a chronological 80/20 train/test split using Mean Absolute Error (MAE), Root Mean Squared Error (RMSE), and R-squared (R2). The Gradient Boosting Regressor achieved the best performance (MAE = 0.0132 kW, RMSE = 0.0207 kW, R2 = 0.9992), substantially outperforming SARIMA (MAE = 0.2575 kW, RMSE = 0.3408 kW, R2 = -0.1941). The dominant predictive feature was </w:t>
-      </w:r>
-      <w:proofErr w:type="spellStart"/>
-      <w:r>
-        <w:t>Global_intensity</w:t>
-      </w:r>
-      <w:proofErr w:type="spellEnd"/>
-      <w:r>
-        <w:t>, consistent with the physical relationship between current intensity and active power.</w:t>
+        <w:t>Following systematic preprocessing, including time-based linear interpolation for missing values, datetime indexing, and hourly resampling, a feature set of 20 inputs was constructed comprising cyclical time encodings, lag variables at six temporal offsets, and 24-hour rolling statistics. Three algorithms were implemented and evaluated: SARIMA(1,0,1)(1,0,1)[7], Random Forest Regressor, and Gradient Boosting Regressor. Models were assessed on a chronological 80/20 train/test split using Mean Absolute Error (MAE), Root Mean Squared Error (RMSE), and R-squared (R2). The Gradient Boosting Regressor achieved the best performance (MAE = 0.0132 kW, RMSE = 0.0207 kW, R2 = 0.9992), substantially outperforming SARIMA (MAE = 0.2575 kW, RMSE = 0.3408 kW, R2 = -0.1941). The dominant predictive feature was Global_intensity, consistent with the physical relationship between current intensity and active power.</w:t>
       </w:r>
     </w:p>
     <w:p>
@@ -4070,15 +4984,7 @@
         <w:spacing w:before="240" w:line="360" w:lineRule="auto"/>
       </w:pPr>
       <w:r>
-        <w:t>Traditional statistical approaches such as ARIMA and SARIMA capture linear temporal dependencies and offer interpretable parameters, yet they struggle to model the nonlinear, multivariate relationships present in real-world consumption data (Box et al., 2015). Machine learning methods, in particular ensemble tree-based algorithms such as Random Forests and Gradient Boosting, have demonstrated competitive or superior performance in energy forecasting benchmarks by incorporating diverse feature types without requiring explicit model specification (</w:t>
-      </w:r>
-      <w:proofErr w:type="spellStart"/>
-      <w:r>
-        <w:t>Amasyali</w:t>
-      </w:r>
-      <w:proofErr w:type="spellEnd"/>
-      <w:r>
-        <w:t xml:space="preserve"> and El-Gohary, 2018).</w:t>
+        <w:t>Traditional statistical approaches such as ARIMA and SARIMA capture linear temporal dependencies and offer interpretable parameters, yet they struggle to model the nonlinear, multivariate relationships present in real-world consumption data (Box et al., 2015). Machine learning methods, in particular ensemble tree-based algorithms such as Random Forests and Gradient Boosting, have demonstrated competitive or superior performance in energy forecasting benchmarks by incorporating diverse feature types without requiring explicit model specification (Amasyali and El-Gohary, 2018).</w:t>
       </w:r>
     </w:p>
     <w:p>
@@ -4086,21 +4992,8 @@
         <w:spacing w:before="240" w:line="360" w:lineRule="auto"/>
       </w:pPr>
       <w:r>
-        <w:t>The objective of this project is to design and evaluate a complete forecasting pipeline using the UCI Individual Household Electric Power Consumption dataset (</w:t>
-      </w:r>
-      <w:proofErr w:type="spellStart"/>
-      <w:r>
-        <w:t>Hebrail</w:t>
-      </w:r>
-      <w:proofErr w:type="spellEnd"/>
-      <w:r>
-        <w:t xml:space="preserve"> and Berard, 2012). This report implements and compares three algorithms, namely SARIMA, Random Forest Regressor, and Gradient Boosting Regressor, using standard regression metrics to identify the most effective approach.</w:t>
-      </w:r>
-    </w:p>
-    <w:p>
-      <w:pPr>
-        <w:spacing w:before="240" w:line="360" w:lineRule="auto"/>
-      </w:pPr>
+        <w:t>The objective of this project is to design and evaluate a complete forecasting pipeline using the UCI Individual Household Electric Power Consumption dataset (Hebrail and Berard, 2012). This dataset is particularly well-suited for benchmarking because it spans nearly four years of continuous minute-level recordings, providing sufficient temporal depth to observe multiple seasonal cycles and long-term consumption trends. This report implements and compares three algorithms, namely SARIMA, Random Forest Regressor, and Gradient Boosting Regressor, across a standardised 80/20 chronological train/test split using Mean Absolute Error, Root Mean Squared Error, and R-squared to identify the most effective approach for short-term hourly demand forecasting.</w:t>
+      </w:r>
     </w:p>
     <w:p>
       <w:pPr>
@@ -4153,15 +5046,7 @@
         <w:spacing w:before="240" w:line="360" w:lineRule="auto"/>
       </w:pPr>
       <w:r>
-        <w:t xml:space="preserve">Classical time-series methods have formed the backbone of energy demand forecasting for decades. ARIMA models, </w:t>
-      </w:r>
-      <w:proofErr w:type="spellStart"/>
-      <w:r>
-        <w:t>popularised</w:t>
-      </w:r>
-      <w:proofErr w:type="spellEnd"/>
-      <w:r>
-        <w:t xml:space="preserve"> by Box et al. (2015), decompose a series into autoregressive, integrated, and moving-average components. The seasonal extension, SARIMA, adds multiplicative seasonal terms and has been applied to daily and weekly energy patterns (Taylor and McSharry, 2007). However, SARIMA assumes linearity and stationarity and operates on a single variable at a time, limiting its capacity to exploit exogenous predictors. </w:t>
+        <w:t xml:space="preserve">Classical time-series methods have formed the backbone of energy demand forecasting for decades. ARIMA models, popularised by Box et al. (2015), decompose a series into autoregressive, integrated, and moving-average components. The seasonal extension, SARIMA, adds multiplicative seasonal terms and has been applied to daily and weekly energy patterns (Taylor and McSharry, 2007). However, SARIMA assumes linearity and stationarity and operates on a single variable at a time, limiting its capacity to exploit exogenous predictors. </w:t>
       </w:r>
     </w:p>
     <w:p>
@@ -4179,23 +5064,7 @@
         <w:spacing w:before="240" w:line="360" w:lineRule="auto"/>
       </w:pPr>
       <w:r>
-        <w:t xml:space="preserve">The application of machine learning to energy forecasting has grown considerably since the success of ensemble methods on tabular datasets. </w:t>
-      </w:r>
-      <w:proofErr w:type="spellStart"/>
-      <w:r>
-        <w:t>Amasyali</w:t>
-      </w:r>
-      <w:proofErr w:type="spellEnd"/>
-      <w:r>
-        <w:t xml:space="preserve"> and El-Gohary (2018) conducted a systematic review of 35 studies and found that ensemble tree methods consistently outperformed classical approaches on residential energy prediction tasks. Random Forest Regressors (</w:t>
-      </w:r>
-      <w:proofErr w:type="spellStart"/>
-      <w:r>
-        <w:t>Breiman</w:t>
-      </w:r>
-      <w:proofErr w:type="spellEnd"/>
-      <w:r>
-        <w:t>, 2001) combine multiple decorrelated decision trees through bootstrap aggregation to reduce variance, while Gradient Boosting (Friedman, 2001) constructs trees sequentially to minimise residuals, often yielding lower bias.</w:t>
+        <w:t>The application of machine learning to energy forecasting has grown considerably since the success of ensemble methods on tabular datasets. Amasyali and El-Gohary (2018) conducted a systematic review of 35 studies and found that ensemble tree methods consistently outperformed classical approaches on residential energy prediction tasks. Random Forest Regressors (Breiman, 2001) combine multiple decorrelated decision trees through bootstrap aggregation to reduce variance, while Gradient Boosting (Friedman, 2001) constructs trees sequentially to minimise residuals, often yielding lower bias.</w:t>
       </w:r>
     </w:p>
     <w:p>
@@ -4245,17 +5114,9 @@
         <w:spacing w:before="240" w:line="360" w:lineRule="auto"/>
       </w:pPr>
       <w:r>
-        <w:t>The dataset selected is the Individual Household Electric Power Consumption dataset (</w:t>
-      </w:r>
-      <w:proofErr w:type="spellStart"/>
-      <w:r>
-        <w:t>Hebrail</w:t>
-      </w:r>
-      <w:proofErr w:type="spellEnd"/>
-      <w:r>
-        <w:t xml:space="preserve"> and Berard, 2012) from the UCI Machine Learning Repository, also available at </w:t>
-      </w:r>
-      <w:hyperlink r:id="rId10" w:history="1">
+        <w:t xml:space="preserve">The dataset selected is the Individual Household Electric Power Consumption dataset (Hebrail and Berard, 2012) from the UCI Machine Learning Repository, also available at </w:t>
+      </w:r>
+      <w:hyperlink r:id="rId12" w:history="1">
         <w:r>
           <w:rPr>
             <w:rStyle w:val="Hyperlink"/>
@@ -4267,15 +5128,7 @@
         <w:t>.</w:t>
       </w:r>
       <w:r>
-        <w:t xml:space="preserve"> It records minute-by-minute electrical measurements for a household in </w:t>
-      </w:r>
-      <w:proofErr w:type="spellStart"/>
-      <w:r>
-        <w:t>Sceaux</w:t>
-      </w:r>
-      <w:proofErr w:type="spellEnd"/>
-      <w:r>
-        <w:t>, France, from December 2006 to November 2010, comprising approximately 2,075,259 observations across nine attributes as described in Table 1.</w:t>
+        <w:t xml:space="preserve"> It records minute-by-minute electrical measurements for a household in Sceaux, France, from December 2006 to November 2010, comprising approximately 2,075,259 observations across nine attributes as described in Table 1.</w:t>
       </w:r>
     </w:p>
     <w:p>
@@ -4612,24 +5465,13 @@
                 <w:szCs w:val="22"/>
               </w:rPr>
             </w:pPr>
-            <w:proofErr w:type="spellStart"/>
-            <w:r>
-              <w:rPr>
-                <w:sz w:val="22"/>
-                <w:szCs w:val="22"/>
-              </w:rPr>
-              <w:t>hh:</w:t>
-            </w:r>
-            <w:proofErr w:type="gramStart"/>
-            <w:r>
-              <w:rPr>
-                <w:sz w:val="22"/>
-                <w:szCs w:val="22"/>
-              </w:rPr>
-              <w:t>mm:ss</w:t>
-            </w:r>
-            <w:proofErr w:type="spellEnd"/>
-            <w:proofErr w:type="gramEnd"/>
+            <w:r>
+              <w:rPr>
+                <w:sz w:val="22"/>
+                <w:szCs w:val="22"/>
+              </w:rPr>
+              <w:t>hh:mm:ss</w:t>
+            </w:r>
           </w:p>
         </w:tc>
         <w:tc>
@@ -4696,7 +5538,6 @@
                 <w:szCs w:val="22"/>
               </w:rPr>
             </w:pPr>
-            <w:proofErr w:type="spellStart"/>
             <w:r>
               <w:rPr>
                 <w:sz w:val="22"/>
@@ -4704,7 +5545,6 @@
               </w:rPr>
               <w:t>Global_active_power</w:t>
             </w:r>
-            <w:proofErr w:type="spellEnd"/>
           </w:p>
         </w:tc>
         <w:tc>
@@ -4805,7 +5645,6 @@
                 <w:szCs w:val="22"/>
               </w:rPr>
             </w:pPr>
-            <w:proofErr w:type="spellStart"/>
             <w:r>
               <w:rPr>
                 <w:sz w:val="22"/>
@@ -4813,7 +5652,6 @@
               </w:rPr>
               <w:t>Global_reactive_power</w:t>
             </w:r>
-            <w:proofErr w:type="spellEnd"/>
           </w:p>
         </w:tc>
         <w:tc>
@@ -5021,7 +5859,6 @@
                 <w:szCs w:val="22"/>
               </w:rPr>
             </w:pPr>
-            <w:proofErr w:type="spellStart"/>
             <w:r>
               <w:rPr>
                 <w:sz w:val="22"/>
@@ -5029,7 +5866,6 @@
               </w:rPr>
               <w:t>Global_intensity</w:t>
             </w:r>
-            <w:proofErr w:type="spellEnd"/>
           </w:p>
         </w:tc>
         <w:tc>
@@ -5456,28 +6292,7 @@
         <w:spacing w:before="240" w:line="360" w:lineRule="auto"/>
       </w:pPr>
       <w:r>
-        <w:t xml:space="preserve">Date and time columns were merged and parsed into a </w:t>
-      </w:r>
-      <w:proofErr w:type="gramStart"/>
-      <w:r>
-        <w:t xml:space="preserve">pandas </w:t>
-      </w:r>
-      <w:proofErr w:type="spellStart"/>
-      <w:r>
-        <w:t>DatetimeIndex</w:t>
-      </w:r>
-      <w:proofErr w:type="spellEnd"/>
-      <w:proofErr w:type="gramEnd"/>
-      <w:r>
-        <w:t xml:space="preserve"> (format '%d/%m/%Y %</w:t>
-      </w:r>
-      <w:proofErr w:type="gramStart"/>
-      <w:r>
-        <w:t>H:%M:%</w:t>
-      </w:r>
-      <w:proofErr w:type="gramEnd"/>
-      <w:r>
-        <w:t>S'), enabling resampling and feature extraction.</w:t>
+        <w:t>Date and time columns were merged and parsed into a pandas DatetimeIndex (format '%d/%m/%Y %H:%M:%S'), enabling resampling and feature extraction.</w:t>
       </w:r>
     </w:p>
     <w:p>
@@ -5495,38 +6310,10 @@
         <w:spacing w:before="240" w:line="360" w:lineRule="auto"/>
       </w:pPr>
       <w:r>
-        <w:t xml:space="preserve">The dataset contains missing values encoded as '?' across all measurement columns, loaded as </w:t>
-      </w:r>
-      <w:proofErr w:type="spellStart"/>
-      <w:r>
-        <w:t>NaN</w:t>
-      </w:r>
-      <w:proofErr w:type="spellEnd"/>
-      <w:r>
-        <w:t xml:space="preserve"> via </w:t>
-      </w:r>
-      <w:proofErr w:type="spellStart"/>
-      <w:r>
-        <w:t>na_values</w:t>
-      </w:r>
-      <w:proofErr w:type="spellEnd"/>
-      <w:proofErr w:type="gramStart"/>
-      <w:r>
-        <w:t>=[</w:t>
-      </w:r>
-      <w:proofErr w:type="gramEnd"/>
-      <w:r>
-        <w:t>'?']. A total of 25,979 observations were missing per attribute, likely corresponding to contiguous sensor outage periods (see Table 2). Time-based linear interpolation (</w:t>
-      </w:r>
-      <w:proofErr w:type="spellStart"/>
-      <w:proofErr w:type="gramStart"/>
-      <w:r>
-        <w:t>df.interpolate</w:t>
-      </w:r>
-      <w:proofErr w:type="spellEnd"/>
-      <w:proofErr w:type="gramEnd"/>
-      <w:r>
-        <w:t>(method='time')) was applied as the primary imputation strategy, estimating missing values proportionally between flanking observations and preserving temporal continuity.</w:t>
+        <w:t xml:space="preserve">The dataset contains missing values encoded as '?' across all measurement columns, loaded as NaN via na_values=['?']. A total of 25,979 observations were missing per attribute, likely corresponding to contiguous sensor outage periods (see Table 2). </w:t>
+      </w:r>
+      <w:r>
+        <w:t>Time-based linear interpolation (df.interpolate(method='time')) was applied as the primary imputation strategy, estimating missing values proportionally between flanking observations and preserving temporal continuity. This approach is preferred over constant forward-fill or mean imputation in time-series contexts because it preserves the increasing time axis and avoids abrupt discontinuities at gap boundaries, which can distort autocorrelation and increase lag-feature errors during training (Hyndman and Athanasopoulos, 2021).</w:t>
       </w:r>
     </w:p>
     <w:p>
@@ -5686,7 +6473,6 @@
                 <w:szCs w:val="22"/>
               </w:rPr>
             </w:pPr>
-            <w:proofErr w:type="spellStart"/>
             <w:r>
               <w:rPr>
                 <w:sz w:val="22"/>
@@ -5694,7 +6480,6 @@
               </w:rPr>
               <w:t>Global_active_power</w:t>
             </w:r>
-            <w:proofErr w:type="spellEnd"/>
           </w:p>
         </w:tc>
         <w:tc>
@@ -5761,7 +6546,6 @@
                 <w:szCs w:val="22"/>
               </w:rPr>
             </w:pPr>
-            <w:proofErr w:type="spellStart"/>
             <w:r>
               <w:rPr>
                 <w:sz w:val="22"/>
@@ -5769,7 +6553,6 @@
               </w:rPr>
               <w:t>Global_reactive_power</w:t>
             </w:r>
-            <w:proofErr w:type="spellEnd"/>
           </w:p>
         </w:tc>
         <w:tc>
@@ -5909,7 +6692,6 @@
                 <w:szCs w:val="22"/>
               </w:rPr>
             </w:pPr>
-            <w:proofErr w:type="spellStart"/>
             <w:r>
               <w:rPr>
                 <w:sz w:val="22"/>
@@ -5917,7 +6699,6 @@
               </w:rPr>
               <w:t>Global_intensity</w:t>
             </w:r>
-            <w:proofErr w:type="spellEnd"/>
           </w:p>
         </w:tc>
         <w:tc>
@@ -6042,28 +6823,7 @@
         <w:spacing w:before="240" w:line="360" w:lineRule="auto"/>
       </w:pPr>
       <w:r>
-        <w:t xml:space="preserve">The raw minute-level data were resampled to hourly frequency by computing the mean of all readings within each hour using </w:t>
-      </w:r>
-      <w:proofErr w:type="spellStart"/>
-      <w:r>
-        <w:t>df_</w:t>
-      </w:r>
-      <w:proofErr w:type="gramStart"/>
-      <w:r>
-        <w:t>raw.resample</w:t>
-      </w:r>
-      <w:proofErr w:type="spellEnd"/>
-      <w:proofErr w:type="gramEnd"/>
-      <w:r>
-        <w:t>('h'</w:t>
-      </w:r>
-      <w:proofErr w:type="gramStart"/>
-      <w:r>
-        <w:t>).mean</w:t>
-      </w:r>
-      <w:proofErr w:type="gramEnd"/>
-      <w:r>
-        <w:t xml:space="preserve">(). </w:t>
+        <w:t xml:space="preserve">The raw minute-level data were resampled to hourly frequency by computing the mean of all readings within each hour using df_raw.resample('h').mean(). </w:t>
       </w:r>
       <w:r>
         <w:t>Hourly resampling preserves the diurnal pattern, reduces dataset size by 60×, and smooths transient noise (Hyndman and Athanasopoulos, 2021)</w:t>
@@ -6091,21 +6851,23 @@
         <w:spacing w:before="240" w:line="360" w:lineRule="auto"/>
       </w:pPr>
       <w:r>
-        <w:t xml:space="preserve">Following preprocessing, 20 time-based and statistical features were derived to provide the machine learning models with predictive signals beyond the raw energy reading. Feature engineering is essential for non-parametric models that cannot implicitly learn periodic structure from index positions alone (Fan et al., 2017). Six calendar features were extracted: hour of the day, day of the week, day of the year, month, year, and a binary </w:t>
-      </w:r>
-      <w:proofErr w:type="spellStart"/>
-      <w:r>
-        <w:t>is_weekend</w:t>
-      </w:r>
-      <w:proofErr w:type="spellEnd"/>
-      <w:r>
-        <w:t xml:space="preserve"> indicator.</w:t>
+        <w:t>Following preprocessing, 20 time-based and statistical features were derived to provide the machine learning models with predictive signals beyond the raw energy reading. Feature engineering is essential for non-parametric models that cannot implicitly learn periodic structure from index positions alone (</w:t>
+      </w:r>
+      <w:r>
+        <w:rPr>
+          <w:i/>
+          <w:iCs/>
+        </w:rPr>
+        <w:t>Bontempi et al., 2013</w:t>
+      </w:r>
+      <w:r>
+        <w:t>). Six calendar features were extracted: hour of the day, day of the week, day of the year, month, year, and a binary is_weekend indicator.</w:t>
       </w:r>
       <w:r>
         <w:t xml:space="preserve"> </w:t>
       </w:r>
       <w:r>
-        <w:t>Sine and cosine transformations were applied to hour and month to produce four cyclical encodings, eliminating artificial ordinal distance between period boundaries.</w:t>
+        <w:t>Sine and cosine transformations were applied to hour and month to produce four cyclical encodings, eliminating the artificial ordinal distance between period boundaries that would arise if raw integer values were passed directly to the model. For example, without cyclical encoding, hour 23 and hour 0 appear maximally distant in feature space despite being separated by only one minute in real time; the sine-cosine transformation maps both to adjacent points on the unit circle, correctly preserving temporal proximity (Bontempi et al., 2013).</w:t>
       </w:r>
     </w:p>
     <w:p>
@@ -6113,7 +6875,17 @@
         <w:spacing w:before="240" w:line="360" w:lineRule="auto"/>
       </w:pPr>
       <w:r>
-        <w:t xml:space="preserve">Six lag features were constructed by shifting the target variable by 1, 2, 3, 24, 48, and 168 hours. The 24-hour and 168-hour lags capture the strong diurnal and weekly periodicity typical of household consumption, and literature consistently identifies these as the most predictive temporal inputs (Fan et al., 2017). </w:t>
+        <w:t>Six lag features were constructed by shifting the target variable by 1, 2, 3, 24, 48, and 168 hours. The 24-hour and 168-hour lags capture the strong diurnal and weekly periodicity typical of household consumption, and literature consistently identifies these as the most predictive temporal inputs (</w:t>
+      </w:r>
+      <w:r>
+        <w:rPr>
+          <w:i/>
+          <w:iCs/>
+        </w:rPr>
+        <w:t>Bontempi et al., 2013</w:t>
+      </w:r>
+      <w:r>
+        <w:t xml:space="preserve">). </w:t>
       </w:r>
       <w:r>
         <w:t>A 24-hour rolling mean and standard deviation (one-step lagged to prevent leakage) captured recent consumption level and variability.</w:t>
@@ -6122,15 +6894,7 @@
         <w:t xml:space="preserve"> </w:t>
       </w:r>
       <w:r>
-        <w:t xml:space="preserve">After removing 168 rows containing </w:t>
-      </w:r>
-      <w:proofErr w:type="spellStart"/>
-      <w:r>
-        <w:t>NaN</w:t>
-      </w:r>
-      <w:proofErr w:type="spellEnd"/>
-      <w:r>
-        <w:t xml:space="preserve"> values from lag and rolling operations, the final dataset comprised 34,421 hourly observations with 20 engineered input features.</w:t>
+        <w:t>After removing 168 rows containing NaN values from lag and rolling operations, the final dataset comprised 34,421 hourly observations with 20 engineered input features.</w:t>
       </w:r>
     </w:p>
     <w:p>
@@ -6205,15 +6969,7 @@
         <w:spacing w:before="240" w:line="360" w:lineRule="auto"/>
       </w:pPr>
       <w:r>
-        <w:t xml:space="preserve">Table 3 presents descriptive statistics for </w:t>
-      </w:r>
-      <w:proofErr w:type="spellStart"/>
-      <w:r>
-        <w:t>Global_active_power</w:t>
-      </w:r>
-      <w:proofErr w:type="spellEnd"/>
-      <w:r>
-        <w:t xml:space="preserve"> following hourly resampling. </w:t>
+        <w:t xml:space="preserve">Table 3 presents descriptive statistics for Global_active_power following hourly resampling. </w:t>
       </w:r>
       <w:r>
         <w:t>Mean hourly consumption is 1.09 kW (SD = 1.06 kW). The distribution is right-skewed (median 0.76 kW), reflecting infrequent high-demand episodes from simultaneous appliance use.</w:t>
@@ -6236,15 +6992,7 @@
         </w:r>
       </w:fldSimple>
       <w:r>
-        <w:t xml:space="preserve">: Descriptive statistics for hourly </w:t>
-      </w:r>
-      <w:proofErr w:type="spellStart"/>
-      <w:r>
-        <w:t>Global_active_power</w:t>
-      </w:r>
-      <w:proofErr w:type="spellEnd"/>
-      <w:r>
-        <w:t xml:space="preserve"> (kW).</w:t>
+        <w:t>: Descriptive statistics for hourly Global_active_power (kW).</w:t>
       </w:r>
       <w:bookmarkEnd w:id="16"/>
     </w:p>
@@ -6879,11 +7627,7 @@
         <w:spacing w:before="240" w:line="360" w:lineRule="auto"/>
       </w:pPr>
       <w:r>
-        <w:t xml:space="preserve">A line plot of daily mean </w:t>
-      </w:r>
-      <w:proofErr w:type="spellStart"/>
-      <w:r>
-        <w:t>Global</w:t>
+        <w:t>A line plot of daily mean Global</w:t>
       </w:r>
       <w:r>
         <w:t>_</w:t>
@@ -6895,11 +7639,7 @@
         <w:t>_</w:t>
       </w:r>
       <w:r>
-        <w:t>power</w:t>
-      </w:r>
-      <w:proofErr w:type="spellEnd"/>
-      <w:r>
-        <w:t xml:space="preserve"> across the full dataset reveals a clear annual seasonality, with peaks during winter months December to February due to domestic heating demand and reduced daylight hours, falling to a minimum in summer Figure 1. This pattern suggests that household electricity use is strongly influenced by both environmental conditions and routine human activity, rather than changing randomly from day to day. Visual inspection of the series is therefore useful for identifying recurring structure before any forecasting model is trained.</w:t>
+        <w:t>power across the full dataset reveals a clear annual seasonality, with peaks during winter months December to February due to domestic heating demand and reduced daylight hours, falling to a minimum in summer Figure 1. This pattern suggests that household electricity use is strongly influenced by both environmental conditions and routine human activity, rather than changing randomly from day to day. Visual inspection of the series is therefore useful for identifying recurring structure before any forecasting model is trained.</w:t>
       </w:r>
       <w:r>
         <w:t xml:space="preserve"> </w:t>
@@ -6935,7 +7675,7 @@
                     </pic:cNvPicPr>
                   </pic:nvPicPr>
                   <pic:blipFill>
-                    <a:blip r:embed="rId11" cstate="print">
+                    <a:blip r:embed="rId13" cstate="print">
                       <a:extLst>
                         <a:ext uri="{28A0092B-C50C-407E-A947-70E740481C1C}">
                           <a14:useLocalDpi xmlns:a14="http://schemas.microsoft.com/office/drawing/2010/main" val="0"/>
@@ -7004,7 +7744,7 @@
           <w:szCs w:val="22"/>
         </w:rPr>
         <w:drawing>
-          <wp:inline distT="0" distB="0" distL="0" distR="0" wp14:anchorId="2A06037C" wp14:editId="5D4861E9">
+          <wp:inline distT="0" distB="0" distL="0" distR="0" wp14:anchorId="2A06037C" wp14:editId="02B13C12">
             <wp:extent cx="5724525" cy="4076700"/>
             <wp:effectExtent l="0" t="0" r="9525" b="0"/>
             <wp:docPr id="338557536" name="Picture 3"/>
@@ -7021,7 +7761,7 @@
                     </pic:cNvPicPr>
                   </pic:nvPicPr>
                   <pic:blipFill>
-                    <a:blip r:embed="rId12" cstate="print">
+                    <a:blip r:embed="rId14" cstate="print">
                       <a:extLst>
                         <a:ext uri="{28A0092B-C50C-407E-A947-70E740481C1C}">
                           <a14:useLocalDpi xmlns:a14="http://schemas.microsoft.com/office/drawing/2010/main" val="0"/>
@@ -7103,7 +7843,7 @@
         </w:rPr>
         <w:lastRenderedPageBreak/>
         <w:drawing>
-          <wp:inline distT="0" distB="0" distL="0" distR="0" wp14:anchorId="5CA6D87C" wp14:editId="39250BF4">
+          <wp:inline distT="0" distB="0" distL="0" distR="0" wp14:anchorId="5CA6D87C" wp14:editId="7FB5F627">
             <wp:extent cx="5724525" cy="1943100"/>
             <wp:effectExtent l="0" t="0" r="9525" b="0"/>
             <wp:docPr id="1503085474" name="Picture 4"/>
@@ -7120,7 +7860,7 @@
                     </pic:cNvPicPr>
                   </pic:nvPicPr>
                   <pic:blipFill>
-                    <a:blip r:embed="rId13" cstate="print">
+                    <a:blip r:embed="rId15" cstate="print">
                       <a:extLst>
                         <a:ext uri="{28A0092B-C50C-407E-A947-70E740481C1C}">
                           <a14:useLocalDpi xmlns:a14="http://schemas.microsoft.com/office/drawing/2010/main" val="0"/>
@@ -7202,7 +7942,7 @@
           <w:noProof/>
         </w:rPr>
         <w:drawing>
-          <wp:inline distT="0" distB="0" distL="0" distR="0" wp14:anchorId="284C639A" wp14:editId="3C378639">
+          <wp:inline distT="0" distB="0" distL="0" distR="0" wp14:anchorId="284C639A" wp14:editId="62CA2338">
             <wp:extent cx="5552025" cy="4193540"/>
             <wp:effectExtent l="0" t="0" r="0" b="0"/>
             <wp:docPr id="1075658546" name="Picture 5"/>
@@ -7219,7 +7959,7 @@
                     </pic:cNvPicPr>
                   </pic:nvPicPr>
                   <pic:blipFill rotWithShape="1">
-                    <a:blip r:embed="rId14" cstate="print">
+                    <a:blip r:embed="rId16" cstate="print">
                       <a:extLst>
                         <a:ext uri="{28A0092B-C50C-407E-A947-70E740481C1C}">
                           <a14:useLocalDpi xmlns:a14="http://schemas.microsoft.com/office/drawing/2010/main" val="0"/>
@@ -7322,47 +8062,7 @@
         <w:spacing w:before="240" w:line="360" w:lineRule="auto"/>
       </w:pPr>
       <w:r>
-        <w:t xml:space="preserve">Three algorithms were selected to represent a range of modelling approaches, as </w:t>
-      </w:r>
-      <w:proofErr w:type="spellStart"/>
-      <w:r>
-        <w:t>summarised</w:t>
-      </w:r>
-      <w:proofErr w:type="spellEnd"/>
-      <w:r>
-        <w:t xml:space="preserve"> in Table 4. </w:t>
-      </w:r>
-      <w:proofErr w:type="gramStart"/>
-      <w:r>
-        <w:t>SARIMA(</w:t>
-      </w:r>
-      <w:proofErr w:type="gramEnd"/>
-      <w:r>
-        <w:t>1,0,</w:t>
-      </w:r>
-      <w:proofErr w:type="gramStart"/>
-      <w:r>
-        <w:t>1)(</w:t>
-      </w:r>
-      <w:proofErr w:type="gramEnd"/>
-      <w:r>
-        <w:t>1,0,</w:t>
-      </w:r>
-      <w:proofErr w:type="gramStart"/>
-      <w:r>
-        <w:t>1)[</w:t>
-      </w:r>
-      <w:proofErr w:type="gramEnd"/>
-      <w:r>
-        <w:t>7] serves as the classical statistical baseline. Random Forest Regressor (</w:t>
-      </w:r>
-      <w:proofErr w:type="spellStart"/>
-      <w:r>
-        <w:t>Breiman</w:t>
-      </w:r>
-      <w:proofErr w:type="spellEnd"/>
-      <w:r>
-        <w:t>, 2001) reduces variance through bootstrap aggregation of multiple independent decision trees. Gradient Boosting Regressor (Friedman, 2001) sequentially builds shallow trees to minimise residuals, typically achieving low bias on tabular data with rich feature sets.</w:t>
+        <w:t>Three algorithms were selected to represent a range of modelling approaches, as summarised in Table 4. SARIMA(1,0,1)(1,0,1)[7] serves as the classical statistical baseline. Random Forest Regressor (Breiman, 2001) reduces variance through bootstrap aggregation of multiple independent decision trees. Gradient Boosting Regressor (Friedman, 2001) sequentially builds shallow trees to minimise residuals, typically achieving low bias on tabular data with rich feature sets.</w:t>
       </w:r>
     </w:p>
     <w:p>
@@ -7597,53 +8297,12 @@
                 <w:szCs w:val="22"/>
               </w:rPr>
             </w:pPr>
-            <w:proofErr w:type="gramStart"/>
-            <w:r>
-              <w:rPr>
-                <w:sz w:val="22"/>
-                <w:szCs w:val="22"/>
-              </w:rPr>
-              <w:t>SARIMA(</w:t>
-            </w:r>
-            <w:proofErr w:type="gramEnd"/>
-            <w:r>
-              <w:rPr>
-                <w:sz w:val="22"/>
-                <w:szCs w:val="22"/>
-              </w:rPr>
-              <w:t>1,0,</w:t>
-            </w:r>
-            <w:proofErr w:type="gramStart"/>
-            <w:r>
-              <w:rPr>
-                <w:sz w:val="22"/>
-                <w:szCs w:val="22"/>
-              </w:rPr>
-              <w:t>1)(</w:t>
-            </w:r>
-            <w:proofErr w:type="gramEnd"/>
-            <w:r>
-              <w:rPr>
-                <w:sz w:val="22"/>
-                <w:szCs w:val="22"/>
-              </w:rPr>
-              <w:t>1,0,</w:t>
-            </w:r>
-            <w:proofErr w:type="gramStart"/>
-            <w:r>
-              <w:rPr>
-                <w:sz w:val="22"/>
-                <w:szCs w:val="22"/>
-              </w:rPr>
-              <w:t>1)[</w:t>
-            </w:r>
-            <w:proofErr w:type="gramEnd"/>
-            <w:r>
-              <w:rPr>
-                <w:sz w:val="22"/>
-                <w:szCs w:val="22"/>
-              </w:rPr>
-              <w:t>7]</w:t>
+            <w:r>
+              <w:rPr>
+                <w:sz w:val="22"/>
+                <w:szCs w:val="22"/>
+              </w:rPr>
+              <w:t>SARIMA(1,0,1)(1,0,1)[7]</w:t>
             </w:r>
           </w:p>
         </w:tc>
@@ -7852,23 +8511,7 @@
                 <w:sz w:val="22"/>
                 <w:szCs w:val="22"/>
               </w:rPr>
-              <w:t xml:space="preserve">Averages predictions of </w:t>
-            </w:r>
-            <w:proofErr w:type="spellStart"/>
-            <w:r>
-              <w:rPr>
-                <w:sz w:val="22"/>
-                <w:szCs w:val="22"/>
-              </w:rPr>
-              <w:t>N</w:t>
-            </w:r>
-            <w:proofErr w:type="spellEnd"/>
-            <w:r>
-              <w:rPr>
-                <w:sz w:val="22"/>
-                <w:szCs w:val="22"/>
-              </w:rPr>
-              <w:t xml:space="preserve"> independent trees grown on bootstrap samples; reduces variance</w:t>
+              <w:t>Averages predictions of N independent trees grown on bootstrap samples; reduces variance</w:t>
             </w:r>
           </w:p>
         </w:tc>
@@ -7902,23 +8545,7 @@
                 <w:sz w:val="22"/>
                 <w:szCs w:val="22"/>
               </w:rPr>
-              <w:t>Robust to noise; handles non-linear interactions (</w:t>
-            </w:r>
-            <w:proofErr w:type="spellStart"/>
-            <w:r>
-              <w:rPr>
-                <w:sz w:val="22"/>
-                <w:szCs w:val="22"/>
-              </w:rPr>
-              <w:t>Breiman</w:t>
-            </w:r>
-            <w:proofErr w:type="spellEnd"/>
-            <w:r>
-              <w:rPr>
-                <w:sz w:val="22"/>
-                <w:szCs w:val="22"/>
-              </w:rPr>
-              <w:t>, 2001)</w:t>
+              <w:t>Robust to noise; handles non-linear interactions (Breiman, 2001)</w:t>
             </w:r>
           </w:p>
         </w:tc>
@@ -8081,38 +8708,7 @@
         <w:spacing w:before="240" w:line="360" w:lineRule="auto"/>
       </w:pPr>
       <w:r>
-        <w:t xml:space="preserve">Random Forest used 200 estimators </w:t>
-      </w:r>
-      <w:r>
-        <w:t>with a maximum depth of 15</w:t>
-      </w:r>
-      <w:r>
-        <w:t>. Gradient Boosting used 300 estimators (learning rate 0.05, max depth 6, subsample 0.8). SARIMA order (1,0,</w:t>
-      </w:r>
-      <w:proofErr w:type="gramStart"/>
-      <w:r>
-        <w:t>1)(</w:t>
-      </w:r>
-      <w:proofErr w:type="gramEnd"/>
-      <w:r>
-        <w:t>1,0,</w:t>
-      </w:r>
-      <w:proofErr w:type="gramStart"/>
-      <w:r>
-        <w:t>1)[</w:t>
-      </w:r>
-      <w:proofErr w:type="gramEnd"/>
-      <w:r>
-        <w:t>7] was fitted on the daily series, with d = 0 confirmed by the ADF test.</w:t>
-      </w:r>
-      <w:r>
-        <w:t xml:space="preserve"> </w:t>
-      </w:r>
-      <w:r>
-        <w:t>These settings were chosen to balance predictive performance and model complexity</w:t>
-      </w:r>
-      <w:r>
-        <w:t>.</w:t>
+        <w:t>Random Forest used 200 estimators with a maximum depth of 15; a higher tree count was found to yield diminishing returns beyond this threshold on a preliminary validation window. Gradient Boosting used 300 estimators with a learning rate of 0.05, maximum depth of 6, and a subsample ratio of 0.8 to introduce stochastic regularisation and reduce overfitting on the dense hourly feature matrix. SARIMA order (1,0,1)(1,0,1)[7] was fitted on the daily-aggregated series, with the non-seasonal difference order d = 0 and seasonal difference order D = 0 both confirmed by the ADF test result. These hyperparameter choices were made to balance predictive performance against model complexity, without exhaustive grid search, as the primary goal was algorithmic comparison rather than optimisation.</w:t>
       </w:r>
     </w:p>
     <w:p>
@@ -8130,33 +8726,7 @@
         <w:spacing w:before="240" w:line="360" w:lineRule="auto"/>
       </w:pPr>
       <w:r>
-        <w:t xml:space="preserve">The pipeline is implemented in </w:t>
-      </w:r>
-      <w:proofErr w:type="spellStart"/>
-      <w:proofErr w:type="gramStart"/>
-      <w:r>
-        <w:t>main.ipynb</w:t>
-      </w:r>
-      <w:proofErr w:type="spellEnd"/>
-      <w:proofErr w:type="gramEnd"/>
-      <w:r>
-        <w:t xml:space="preserve"> using pandas, </w:t>
-      </w:r>
-      <w:proofErr w:type="spellStart"/>
-      <w:r>
-        <w:t>numpy</w:t>
-      </w:r>
-      <w:proofErr w:type="spellEnd"/>
-      <w:r>
-        <w:t xml:space="preserve">, matplotlib, seaborn, scikit-learn, and </w:t>
-      </w:r>
-      <w:proofErr w:type="spellStart"/>
-      <w:r>
-        <w:t>statsmodels</w:t>
-      </w:r>
-      <w:proofErr w:type="spellEnd"/>
-      <w:r>
-        <w:t>.</w:t>
+        <w:t>The pipeline is implemented in main.ipynb using pandas, numpy, matplotlib, seaborn, scikit-learn, and statsmodels.</w:t>
       </w:r>
     </w:p>
     <w:p>
@@ -8164,49 +8734,7 @@
         <w:spacing w:before="240" w:line="360" w:lineRule="auto"/>
       </w:pPr>
       <w:r>
-        <w:t xml:space="preserve">The dataset was loaded using </w:t>
-      </w:r>
-      <w:proofErr w:type="spellStart"/>
-      <w:proofErr w:type="gramStart"/>
-      <w:r>
-        <w:t>pandas.read</w:t>
-      </w:r>
-      <w:proofErr w:type="gramEnd"/>
-      <w:r>
-        <w:t>_</w:t>
-      </w:r>
-      <w:proofErr w:type="gramStart"/>
-      <w:r>
-        <w:t>csv</w:t>
-      </w:r>
-      <w:proofErr w:type="spellEnd"/>
-      <w:r>
-        <w:t>(</w:t>
-      </w:r>
-      <w:proofErr w:type="gramEnd"/>
-      <w:r>
-        <w:t xml:space="preserve">) with </w:t>
-      </w:r>
-      <w:proofErr w:type="spellStart"/>
-      <w:r>
-        <w:t>sep</w:t>
-      </w:r>
-      <w:proofErr w:type="spellEnd"/>
-      <w:r>
-        <w:t xml:space="preserve">=';' and </w:t>
-      </w:r>
-      <w:proofErr w:type="spellStart"/>
-      <w:r>
-        <w:t>na_values</w:t>
-      </w:r>
-      <w:proofErr w:type="spellEnd"/>
-      <w:proofErr w:type="gramStart"/>
-      <w:r>
-        <w:t>=[</w:t>
-      </w:r>
-      <w:proofErr w:type="gramEnd"/>
-      <w:r>
-        <w:t>'?']. The 80/20 chronological split was implemented via integer indexing to prevent temporal leakage:</w:t>
+        <w:t>The dataset was loaded using pandas.read_csv() with sep=';' and na_values=['?']. The 80/20 chronological split was implemented via integer indexing to prevent temporal leakage:</w:t>
       </w:r>
     </w:p>
     <w:p>
@@ -8214,41 +8742,63 @@
         <w:spacing w:before="240" w:line="360" w:lineRule="auto"/>
         <w:ind w:left="720"/>
       </w:pPr>
-      <w:proofErr w:type="spellStart"/>
       <w:r>
         <w:rPr>
           <w:rFonts w:ascii="Courier New" w:eastAsia="Courier New" w:hAnsi="Courier New" w:cs="Courier New"/>
           <w:sz w:val="18"/>
           <w:szCs w:val="18"/>
         </w:rPr>
-        <w:t>split_idx</w:t>
-      </w:r>
-      <w:proofErr w:type="spellEnd"/>
+        <w:t>split_idx = int(len(X) * 0.80)</w:t>
+      </w:r>
+    </w:p>
+    <w:p>
+      <w:pPr>
+        <w:spacing w:line="360" w:lineRule="auto"/>
+        <w:ind w:left="720"/>
+      </w:pPr>
       <w:r>
         <w:rPr>
           <w:rFonts w:ascii="Courier New" w:eastAsia="Courier New" w:hAnsi="Courier New" w:cs="Courier New"/>
           <w:sz w:val="18"/>
           <w:szCs w:val="18"/>
         </w:rPr>
-        <w:t xml:space="preserve"> = int(</w:t>
-      </w:r>
-      <w:proofErr w:type="spellStart"/>
+        <w:t>X_train, X_test = X.iloc[:split_idx], X.iloc[split_idx:]</w:t>
+      </w:r>
+    </w:p>
+    <w:p>
+      <w:pPr>
+        <w:spacing w:line="360" w:lineRule="auto"/>
+        <w:ind w:left="720"/>
+      </w:pPr>
       <w:r>
         <w:rPr>
           <w:rFonts w:ascii="Courier New" w:eastAsia="Courier New" w:hAnsi="Courier New" w:cs="Courier New"/>
           <w:sz w:val="18"/>
           <w:szCs w:val="18"/>
         </w:rPr>
-        <w:t>len</w:t>
-      </w:r>
-      <w:proofErr w:type="spellEnd"/>
+        <w:t>y_train, y_test = y.iloc[:split_idx], y.iloc[split_idx:]</w:t>
+      </w:r>
+    </w:p>
+    <w:p>
+      <w:pPr>
+        <w:spacing w:before="240" w:line="360" w:lineRule="auto"/>
+      </w:pPr>
+      <w:r>
+        <w:t>SARIMA was fitted using statsmodels SARIMAX with disp=False. Random Forest and Gradient Boosting were fitted on the hourly training feature matrix using scikit-learn. A shared evaluation helper computed MAE, RMSE, and R2 consistently across all three algorithms:</w:t>
+      </w:r>
+    </w:p>
+    <w:p>
+      <w:pPr>
+        <w:spacing w:before="240" w:line="360" w:lineRule="auto"/>
+        <w:ind w:left="720"/>
+      </w:pPr>
       <w:r>
         <w:rPr>
           <w:rFonts w:ascii="Courier New" w:eastAsia="Courier New" w:hAnsi="Courier New" w:cs="Courier New"/>
           <w:sz w:val="18"/>
           <w:szCs w:val="18"/>
         </w:rPr>
-        <w:t>(X) * 0.80)</w:t>
+        <w:t>def evaluate(y_true, y_pred, model_name='Model'):</w:t>
       </w:r>
     </w:p>
     <w:p>
@@ -8256,635 +8806,41 @@
         <w:spacing w:line="360" w:lineRule="auto"/>
         <w:ind w:left="720"/>
       </w:pPr>
-      <w:proofErr w:type="spellStart"/>
       <w:r>
         <w:rPr>
           <w:rFonts w:ascii="Courier New" w:eastAsia="Courier New" w:hAnsi="Courier New" w:cs="Courier New"/>
           <w:sz w:val="18"/>
           <w:szCs w:val="18"/>
         </w:rPr>
-        <w:t>X_train</w:t>
-      </w:r>
-      <w:proofErr w:type="spellEnd"/>
+        <w:t xml:space="preserve">    mae  = mean_absolute_error(y_true, y_pred)</w:t>
+      </w:r>
+    </w:p>
+    <w:p>
+      <w:pPr>
+        <w:spacing w:line="360" w:lineRule="auto"/>
+        <w:ind w:left="720"/>
+      </w:pPr>
       <w:r>
         <w:rPr>
           <w:rFonts w:ascii="Courier New" w:eastAsia="Courier New" w:hAnsi="Courier New" w:cs="Courier New"/>
           <w:sz w:val="18"/>
           <w:szCs w:val="18"/>
         </w:rPr>
-        <w:t xml:space="preserve">, </w:t>
-      </w:r>
-      <w:proofErr w:type="spellStart"/>
+        <w:t xml:space="preserve">    rmse = np.sqrt(mean_squared_error(y_true, y_pred))</w:t>
+      </w:r>
+    </w:p>
+    <w:p>
+      <w:pPr>
+        <w:spacing w:line="360" w:lineRule="auto"/>
+        <w:ind w:left="720"/>
+      </w:pPr>
       <w:r>
         <w:rPr>
           <w:rFonts w:ascii="Courier New" w:eastAsia="Courier New" w:hAnsi="Courier New" w:cs="Courier New"/>
           <w:sz w:val="18"/>
           <w:szCs w:val="18"/>
         </w:rPr>
-        <w:t>X_test</w:t>
-      </w:r>
-      <w:proofErr w:type="spellEnd"/>
-      <w:r>
-        <w:rPr>
-          <w:rFonts w:ascii="Courier New" w:eastAsia="Courier New" w:hAnsi="Courier New" w:cs="Courier New"/>
-          <w:sz w:val="18"/>
-          <w:szCs w:val="18"/>
-        </w:rPr>
-        <w:t xml:space="preserve"> = </w:t>
-      </w:r>
-      <w:proofErr w:type="spellStart"/>
-      <w:proofErr w:type="gramStart"/>
-      <w:r>
-        <w:rPr>
-          <w:rFonts w:ascii="Courier New" w:eastAsia="Courier New" w:hAnsi="Courier New" w:cs="Courier New"/>
-          <w:sz w:val="18"/>
-          <w:szCs w:val="18"/>
-        </w:rPr>
-        <w:t>X.iloc</w:t>
-      </w:r>
-      <w:proofErr w:type="spellEnd"/>
-      <w:r>
-        <w:rPr>
-          <w:rFonts w:ascii="Courier New" w:eastAsia="Courier New" w:hAnsi="Courier New" w:cs="Courier New"/>
-          <w:sz w:val="18"/>
-          <w:szCs w:val="18"/>
-        </w:rPr>
-        <w:t>[:</w:t>
-      </w:r>
-      <w:proofErr w:type="spellStart"/>
-      <w:r>
-        <w:rPr>
-          <w:rFonts w:ascii="Courier New" w:eastAsia="Courier New" w:hAnsi="Courier New" w:cs="Courier New"/>
-          <w:sz w:val="18"/>
-          <w:szCs w:val="18"/>
-        </w:rPr>
-        <w:t>split</w:t>
-      </w:r>
-      <w:proofErr w:type="gramEnd"/>
-      <w:r>
-        <w:rPr>
-          <w:rFonts w:ascii="Courier New" w:eastAsia="Courier New" w:hAnsi="Courier New" w:cs="Courier New"/>
-          <w:sz w:val="18"/>
-          <w:szCs w:val="18"/>
-        </w:rPr>
-        <w:t>_idx</w:t>
-      </w:r>
-      <w:proofErr w:type="spellEnd"/>
-      <w:r>
-        <w:rPr>
-          <w:rFonts w:ascii="Courier New" w:eastAsia="Courier New" w:hAnsi="Courier New" w:cs="Courier New"/>
-          <w:sz w:val="18"/>
-          <w:szCs w:val="18"/>
-        </w:rPr>
-        <w:t xml:space="preserve">], </w:t>
-      </w:r>
-      <w:proofErr w:type="spellStart"/>
-      <w:proofErr w:type="gramStart"/>
-      <w:r>
-        <w:rPr>
-          <w:rFonts w:ascii="Courier New" w:eastAsia="Courier New" w:hAnsi="Courier New" w:cs="Courier New"/>
-          <w:sz w:val="18"/>
-          <w:szCs w:val="18"/>
-        </w:rPr>
-        <w:t>X.iloc</w:t>
-      </w:r>
-      <w:proofErr w:type="spellEnd"/>
-      <w:proofErr w:type="gramEnd"/>
-      <w:r>
-        <w:rPr>
-          <w:rFonts w:ascii="Courier New" w:eastAsia="Courier New" w:hAnsi="Courier New" w:cs="Courier New"/>
-          <w:sz w:val="18"/>
-          <w:szCs w:val="18"/>
-        </w:rPr>
-        <w:t>[</w:t>
-      </w:r>
-      <w:proofErr w:type="spellStart"/>
-      <w:r>
-        <w:rPr>
-          <w:rFonts w:ascii="Courier New" w:eastAsia="Courier New" w:hAnsi="Courier New" w:cs="Courier New"/>
-          <w:sz w:val="18"/>
-          <w:szCs w:val="18"/>
-        </w:rPr>
-        <w:t>split_idx</w:t>
-      </w:r>
-      <w:proofErr w:type="spellEnd"/>
-      <w:r>
-        <w:rPr>
-          <w:rFonts w:ascii="Courier New" w:eastAsia="Courier New" w:hAnsi="Courier New" w:cs="Courier New"/>
-          <w:sz w:val="18"/>
-          <w:szCs w:val="18"/>
-        </w:rPr>
-        <w:t>:]</w:t>
-      </w:r>
-    </w:p>
-    <w:p>
-      <w:pPr>
-        <w:spacing w:line="360" w:lineRule="auto"/>
-        <w:ind w:left="720"/>
-      </w:pPr>
-      <w:proofErr w:type="spellStart"/>
-      <w:r>
-        <w:rPr>
-          <w:rFonts w:ascii="Courier New" w:eastAsia="Courier New" w:hAnsi="Courier New" w:cs="Courier New"/>
-          <w:sz w:val="18"/>
-          <w:szCs w:val="18"/>
-        </w:rPr>
-        <w:t>y_train</w:t>
-      </w:r>
-      <w:proofErr w:type="spellEnd"/>
-      <w:r>
-        <w:rPr>
-          <w:rFonts w:ascii="Courier New" w:eastAsia="Courier New" w:hAnsi="Courier New" w:cs="Courier New"/>
-          <w:sz w:val="18"/>
-          <w:szCs w:val="18"/>
-        </w:rPr>
-        <w:t xml:space="preserve">, </w:t>
-      </w:r>
-      <w:proofErr w:type="spellStart"/>
-      <w:r>
-        <w:rPr>
-          <w:rFonts w:ascii="Courier New" w:eastAsia="Courier New" w:hAnsi="Courier New" w:cs="Courier New"/>
-          <w:sz w:val="18"/>
-          <w:szCs w:val="18"/>
-        </w:rPr>
-        <w:t>y_test</w:t>
-      </w:r>
-      <w:proofErr w:type="spellEnd"/>
-      <w:r>
-        <w:rPr>
-          <w:rFonts w:ascii="Courier New" w:eastAsia="Courier New" w:hAnsi="Courier New" w:cs="Courier New"/>
-          <w:sz w:val="18"/>
-          <w:szCs w:val="18"/>
-        </w:rPr>
-        <w:t xml:space="preserve"> = </w:t>
-      </w:r>
-      <w:proofErr w:type="spellStart"/>
-      <w:proofErr w:type="gramStart"/>
-      <w:r>
-        <w:rPr>
-          <w:rFonts w:ascii="Courier New" w:eastAsia="Courier New" w:hAnsi="Courier New" w:cs="Courier New"/>
-          <w:sz w:val="18"/>
-          <w:szCs w:val="18"/>
-        </w:rPr>
-        <w:t>y.iloc</w:t>
-      </w:r>
-      <w:proofErr w:type="spellEnd"/>
-      <w:r>
-        <w:rPr>
-          <w:rFonts w:ascii="Courier New" w:eastAsia="Courier New" w:hAnsi="Courier New" w:cs="Courier New"/>
-          <w:sz w:val="18"/>
-          <w:szCs w:val="18"/>
-        </w:rPr>
-        <w:t>[:</w:t>
-      </w:r>
-      <w:proofErr w:type="spellStart"/>
-      <w:r>
-        <w:rPr>
-          <w:rFonts w:ascii="Courier New" w:eastAsia="Courier New" w:hAnsi="Courier New" w:cs="Courier New"/>
-          <w:sz w:val="18"/>
-          <w:szCs w:val="18"/>
-        </w:rPr>
-        <w:t>split</w:t>
-      </w:r>
-      <w:proofErr w:type="gramEnd"/>
-      <w:r>
-        <w:rPr>
-          <w:rFonts w:ascii="Courier New" w:eastAsia="Courier New" w:hAnsi="Courier New" w:cs="Courier New"/>
-          <w:sz w:val="18"/>
-          <w:szCs w:val="18"/>
-        </w:rPr>
-        <w:t>_idx</w:t>
-      </w:r>
-      <w:proofErr w:type="spellEnd"/>
-      <w:r>
-        <w:rPr>
-          <w:rFonts w:ascii="Courier New" w:eastAsia="Courier New" w:hAnsi="Courier New" w:cs="Courier New"/>
-          <w:sz w:val="18"/>
-          <w:szCs w:val="18"/>
-        </w:rPr>
-        <w:t xml:space="preserve">], </w:t>
-      </w:r>
-      <w:proofErr w:type="spellStart"/>
-      <w:proofErr w:type="gramStart"/>
-      <w:r>
-        <w:rPr>
-          <w:rFonts w:ascii="Courier New" w:eastAsia="Courier New" w:hAnsi="Courier New" w:cs="Courier New"/>
-          <w:sz w:val="18"/>
-          <w:szCs w:val="18"/>
-        </w:rPr>
-        <w:t>y.iloc</w:t>
-      </w:r>
-      <w:proofErr w:type="spellEnd"/>
-      <w:proofErr w:type="gramEnd"/>
-      <w:r>
-        <w:rPr>
-          <w:rFonts w:ascii="Courier New" w:eastAsia="Courier New" w:hAnsi="Courier New" w:cs="Courier New"/>
-          <w:sz w:val="18"/>
-          <w:szCs w:val="18"/>
-        </w:rPr>
-        <w:t>[</w:t>
-      </w:r>
-      <w:proofErr w:type="spellStart"/>
-      <w:r>
-        <w:rPr>
-          <w:rFonts w:ascii="Courier New" w:eastAsia="Courier New" w:hAnsi="Courier New" w:cs="Courier New"/>
-          <w:sz w:val="18"/>
-          <w:szCs w:val="18"/>
-        </w:rPr>
-        <w:t>split_idx</w:t>
-      </w:r>
-      <w:proofErr w:type="spellEnd"/>
-      <w:r>
-        <w:rPr>
-          <w:rFonts w:ascii="Courier New" w:eastAsia="Courier New" w:hAnsi="Courier New" w:cs="Courier New"/>
-          <w:sz w:val="18"/>
-          <w:szCs w:val="18"/>
-        </w:rPr>
-        <w:t>:]</w:t>
-      </w:r>
-    </w:p>
-    <w:p>
-      <w:pPr>
-        <w:spacing w:before="240" w:line="360" w:lineRule="auto"/>
-      </w:pPr>
-      <w:r>
-        <w:t xml:space="preserve">SARIMA was fitted using </w:t>
-      </w:r>
-      <w:proofErr w:type="spellStart"/>
-      <w:r>
-        <w:t>statsmodels</w:t>
-      </w:r>
-      <w:proofErr w:type="spellEnd"/>
-      <w:r>
-        <w:t xml:space="preserve"> SARIMAX with </w:t>
-      </w:r>
-      <w:proofErr w:type="spellStart"/>
-      <w:r>
-        <w:t>disp</w:t>
-      </w:r>
-      <w:proofErr w:type="spellEnd"/>
-      <w:r>
-        <w:t>=False. Random Forest and Gradient Boosting were fitted on the hourly training feature matrix using scikit-learn. A shared evaluation helper computed MAE, RMSE, and R2 consistently across all three algorithms:</w:t>
-      </w:r>
-    </w:p>
-    <w:p>
-      <w:pPr>
-        <w:spacing w:before="240" w:line="360" w:lineRule="auto"/>
-        <w:ind w:left="720"/>
-      </w:pPr>
-      <w:r>
-        <w:rPr>
-          <w:rFonts w:ascii="Courier New" w:eastAsia="Courier New" w:hAnsi="Courier New" w:cs="Courier New"/>
-          <w:sz w:val="18"/>
-          <w:szCs w:val="18"/>
-        </w:rPr>
-        <w:t xml:space="preserve">def </w:t>
-      </w:r>
-      <w:proofErr w:type="gramStart"/>
-      <w:r>
-        <w:rPr>
-          <w:rFonts w:ascii="Courier New" w:eastAsia="Courier New" w:hAnsi="Courier New" w:cs="Courier New"/>
-          <w:sz w:val="18"/>
-          <w:szCs w:val="18"/>
-        </w:rPr>
-        <w:t>evaluate(</w:t>
-      </w:r>
-      <w:proofErr w:type="spellStart"/>
-      <w:proofErr w:type="gramEnd"/>
-      <w:r>
-        <w:rPr>
-          <w:rFonts w:ascii="Courier New" w:eastAsia="Courier New" w:hAnsi="Courier New" w:cs="Courier New"/>
-          <w:sz w:val="18"/>
-          <w:szCs w:val="18"/>
-        </w:rPr>
-        <w:t>y_true</w:t>
-      </w:r>
-      <w:proofErr w:type="spellEnd"/>
-      <w:r>
-        <w:rPr>
-          <w:rFonts w:ascii="Courier New" w:eastAsia="Courier New" w:hAnsi="Courier New" w:cs="Courier New"/>
-          <w:sz w:val="18"/>
-          <w:szCs w:val="18"/>
-        </w:rPr>
-        <w:t xml:space="preserve">, </w:t>
-      </w:r>
-      <w:proofErr w:type="spellStart"/>
-      <w:r>
-        <w:rPr>
-          <w:rFonts w:ascii="Courier New" w:eastAsia="Courier New" w:hAnsi="Courier New" w:cs="Courier New"/>
-          <w:sz w:val="18"/>
-          <w:szCs w:val="18"/>
-        </w:rPr>
-        <w:t>y_pred</w:t>
-      </w:r>
-      <w:proofErr w:type="spellEnd"/>
-      <w:r>
-        <w:rPr>
-          <w:rFonts w:ascii="Courier New" w:eastAsia="Courier New" w:hAnsi="Courier New" w:cs="Courier New"/>
-          <w:sz w:val="18"/>
-          <w:szCs w:val="18"/>
-        </w:rPr>
-        <w:t xml:space="preserve">, </w:t>
-      </w:r>
-      <w:proofErr w:type="spellStart"/>
-      <w:r>
-        <w:rPr>
-          <w:rFonts w:ascii="Courier New" w:eastAsia="Courier New" w:hAnsi="Courier New" w:cs="Courier New"/>
-          <w:sz w:val="18"/>
-          <w:szCs w:val="18"/>
-        </w:rPr>
-        <w:t>model_name</w:t>
-      </w:r>
-      <w:proofErr w:type="spellEnd"/>
-      <w:r>
-        <w:rPr>
-          <w:rFonts w:ascii="Courier New" w:eastAsia="Courier New" w:hAnsi="Courier New" w:cs="Courier New"/>
-          <w:sz w:val="18"/>
-          <w:szCs w:val="18"/>
-        </w:rPr>
-        <w:t>='Model'):</w:t>
-      </w:r>
-    </w:p>
-    <w:p>
-      <w:pPr>
-        <w:spacing w:line="360" w:lineRule="auto"/>
-        <w:ind w:left="720"/>
-      </w:pPr>
-      <w:r>
-        <w:rPr>
-          <w:rFonts w:ascii="Courier New" w:eastAsia="Courier New" w:hAnsi="Courier New" w:cs="Courier New"/>
-          <w:sz w:val="18"/>
-          <w:szCs w:val="18"/>
-        </w:rPr>
-        <w:t xml:space="preserve">    </w:t>
-      </w:r>
-      <w:proofErr w:type="spellStart"/>
-      <w:proofErr w:type="gramStart"/>
-      <w:r>
-        <w:rPr>
-          <w:rFonts w:ascii="Courier New" w:eastAsia="Courier New" w:hAnsi="Courier New" w:cs="Courier New"/>
-          <w:sz w:val="18"/>
-          <w:szCs w:val="18"/>
-        </w:rPr>
-        <w:t>mae</w:t>
-      </w:r>
-      <w:proofErr w:type="spellEnd"/>
-      <w:r>
-        <w:rPr>
-          <w:rFonts w:ascii="Courier New" w:eastAsia="Courier New" w:hAnsi="Courier New" w:cs="Courier New"/>
-          <w:sz w:val="18"/>
-          <w:szCs w:val="18"/>
-        </w:rPr>
-        <w:t xml:space="preserve">  =</w:t>
-      </w:r>
-      <w:proofErr w:type="gramEnd"/>
-      <w:r>
-        <w:rPr>
-          <w:rFonts w:ascii="Courier New" w:eastAsia="Courier New" w:hAnsi="Courier New" w:cs="Courier New"/>
-          <w:sz w:val="18"/>
-          <w:szCs w:val="18"/>
-        </w:rPr>
-        <w:t xml:space="preserve"> </w:t>
-      </w:r>
-      <w:proofErr w:type="spellStart"/>
-      <w:r>
-        <w:rPr>
-          <w:rFonts w:ascii="Courier New" w:eastAsia="Courier New" w:hAnsi="Courier New" w:cs="Courier New"/>
-          <w:sz w:val="18"/>
-          <w:szCs w:val="18"/>
-        </w:rPr>
-        <w:t>mean_absolute_</w:t>
-      </w:r>
-      <w:proofErr w:type="gramStart"/>
-      <w:r>
-        <w:rPr>
-          <w:rFonts w:ascii="Courier New" w:eastAsia="Courier New" w:hAnsi="Courier New" w:cs="Courier New"/>
-          <w:sz w:val="18"/>
-          <w:szCs w:val="18"/>
-        </w:rPr>
-        <w:t>error</w:t>
-      </w:r>
-      <w:proofErr w:type="spellEnd"/>
-      <w:r>
-        <w:rPr>
-          <w:rFonts w:ascii="Courier New" w:eastAsia="Courier New" w:hAnsi="Courier New" w:cs="Courier New"/>
-          <w:sz w:val="18"/>
-          <w:szCs w:val="18"/>
-        </w:rPr>
-        <w:t>(</w:t>
-      </w:r>
-      <w:proofErr w:type="spellStart"/>
-      <w:proofErr w:type="gramEnd"/>
-      <w:r>
-        <w:rPr>
-          <w:rFonts w:ascii="Courier New" w:eastAsia="Courier New" w:hAnsi="Courier New" w:cs="Courier New"/>
-          <w:sz w:val="18"/>
-          <w:szCs w:val="18"/>
-        </w:rPr>
-        <w:t>y_true</w:t>
-      </w:r>
-      <w:proofErr w:type="spellEnd"/>
-      <w:r>
-        <w:rPr>
-          <w:rFonts w:ascii="Courier New" w:eastAsia="Courier New" w:hAnsi="Courier New" w:cs="Courier New"/>
-          <w:sz w:val="18"/>
-          <w:szCs w:val="18"/>
-        </w:rPr>
-        <w:t xml:space="preserve">, </w:t>
-      </w:r>
-      <w:proofErr w:type="spellStart"/>
-      <w:r>
-        <w:rPr>
-          <w:rFonts w:ascii="Courier New" w:eastAsia="Courier New" w:hAnsi="Courier New" w:cs="Courier New"/>
-          <w:sz w:val="18"/>
-          <w:szCs w:val="18"/>
-        </w:rPr>
-        <w:t>y_pred</w:t>
-      </w:r>
-      <w:proofErr w:type="spellEnd"/>
-      <w:r>
-        <w:rPr>
-          <w:rFonts w:ascii="Courier New" w:eastAsia="Courier New" w:hAnsi="Courier New" w:cs="Courier New"/>
-          <w:sz w:val="18"/>
-          <w:szCs w:val="18"/>
-        </w:rPr>
-        <w:t>)</w:t>
-      </w:r>
-    </w:p>
-    <w:p>
-      <w:pPr>
-        <w:spacing w:line="360" w:lineRule="auto"/>
-        <w:ind w:left="720"/>
-      </w:pPr>
-      <w:r>
-        <w:rPr>
-          <w:rFonts w:ascii="Courier New" w:eastAsia="Courier New" w:hAnsi="Courier New" w:cs="Courier New"/>
-          <w:sz w:val="18"/>
-          <w:szCs w:val="18"/>
-        </w:rPr>
-        <w:t xml:space="preserve">    </w:t>
-      </w:r>
-      <w:proofErr w:type="spellStart"/>
-      <w:r>
-        <w:rPr>
-          <w:rFonts w:ascii="Courier New" w:eastAsia="Courier New" w:hAnsi="Courier New" w:cs="Courier New"/>
-          <w:sz w:val="18"/>
-          <w:szCs w:val="18"/>
-        </w:rPr>
-        <w:t>rmse</w:t>
-      </w:r>
-      <w:proofErr w:type="spellEnd"/>
-      <w:r>
-        <w:rPr>
-          <w:rFonts w:ascii="Courier New" w:eastAsia="Courier New" w:hAnsi="Courier New" w:cs="Courier New"/>
-          <w:sz w:val="18"/>
-          <w:szCs w:val="18"/>
-        </w:rPr>
-        <w:t xml:space="preserve"> = </w:t>
-      </w:r>
-      <w:proofErr w:type="spellStart"/>
-      <w:proofErr w:type="gramStart"/>
-      <w:r>
-        <w:rPr>
-          <w:rFonts w:ascii="Courier New" w:eastAsia="Courier New" w:hAnsi="Courier New" w:cs="Courier New"/>
-          <w:sz w:val="18"/>
-          <w:szCs w:val="18"/>
-        </w:rPr>
-        <w:t>np.sqrt</w:t>
-      </w:r>
-      <w:proofErr w:type="spellEnd"/>
-      <w:proofErr w:type="gramEnd"/>
-      <w:r>
-        <w:rPr>
-          <w:rFonts w:ascii="Courier New" w:eastAsia="Courier New" w:hAnsi="Courier New" w:cs="Courier New"/>
-          <w:sz w:val="18"/>
-          <w:szCs w:val="18"/>
-        </w:rPr>
-        <w:t>(</w:t>
-      </w:r>
-      <w:proofErr w:type="spellStart"/>
-      <w:r>
-        <w:rPr>
-          <w:rFonts w:ascii="Courier New" w:eastAsia="Courier New" w:hAnsi="Courier New" w:cs="Courier New"/>
-          <w:sz w:val="18"/>
-          <w:szCs w:val="18"/>
-        </w:rPr>
-        <w:t>mean_squared_</w:t>
-      </w:r>
-      <w:proofErr w:type="gramStart"/>
-      <w:r>
-        <w:rPr>
-          <w:rFonts w:ascii="Courier New" w:eastAsia="Courier New" w:hAnsi="Courier New" w:cs="Courier New"/>
-          <w:sz w:val="18"/>
-          <w:szCs w:val="18"/>
-        </w:rPr>
-        <w:t>error</w:t>
-      </w:r>
-      <w:proofErr w:type="spellEnd"/>
-      <w:r>
-        <w:rPr>
-          <w:rFonts w:ascii="Courier New" w:eastAsia="Courier New" w:hAnsi="Courier New" w:cs="Courier New"/>
-          <w:sz w:val="18"/>
-          <w:szCs w:val="18"/>
-        </w:rPr>
-        <w:t>(</w:t>
-      </w:r>
-      <w:proofErr w:type="spellStart"/>
-      <w:proofErr w:type="gramEnd"/>
-      <w:r>
-        <w:rPr>
-          <w:rFonts w:ascii="Courier New" w:eastAsia="Courier New" w:hAnsi="Courier New" w:cs="Courier New"/>
-          <w:sz w:val="18"/>
-          <w:szCs w:val="18"/>
-        </w:rPr>
-        <w:t>y_true</w:t>
-      </w:r>
-      <w:proofErr w:type="spellEnd"/>
-      <w:r>
-        <w:rPr>
-          <w:rFonts w:ascii="Courier New" w:eastAsia="Courier New" w:hAnsi="Courier New" w:cs="Courier New"/>
-          <w:sz w:val="18"/>
-          <w:szCs w:val="18"/>
-        </w:rPr>
-        <w:t xml:space="preserve">, </w:t>
-      </w:r>
-      <w:proofErr w:type="spellStart"/>
-      <w:r>
-        <w:rPr>
-          <w:rFonts w:ascii="Courier New" w:eastAsia="Courier New" w:hAnsi="Courier New" w:cs="Courier New"/>
-          <w:sz w:val="18"/>
-          <w:szCs w:val="18"/>
-        </w:rPr>
-        <w:t>y_pred</w:t>
-      </w:r>
-      <w:proofErr w:type="spellEnd"/>
-      <w:r>
-        <w:rPr>
-          <w:rFonts w:ascii="Courier New" w:eastAsia="Courier New" w:hAnsi="Courier New" w:cs="Courier New"/>
-          <w:sz w:val="18"/>
-          <w:szCs w:val="18"/>
-        </w:rPr>
-        <w:t>))</w:t>
-      </w:r>
-    </w:p>
-    <w:p>
-      <w:pPr>
-        <w:spacing w:line="360" w:lineRule="auto"/>
-        <w:ind w:left="720"/>
-      </w:pPr>
-      <w:r>
-        <w:rPr>
-          <w:rFonts w:ascii="Courier New" w:eastAsia="Courier New" w:hAnsi="Courier New" w:cs="Courier New"/>
-          <w:sz w:val="18"/>
-          <w:szCs w:val="18"/>
-        </w:rPr>
-        <w:t xml:space="preserve">    r2   = r2_</w:t>
-      </w:r>
-      <w:proofErr w:type="gramStart"/>
-      <w:r>
-        <w:rPr>
-          <w:rFonts w:ascii="Courier New" w:eastAsia="Courier New" w:hAnsi="Courier New" w:cs="Courier New"/>
-          <w:sz w:val="18"/>
-          <w:szCs w:val="18"/>
-        </w:rPr>
-        <w:t>score(</w:t>
-      </w:r>
-      <w:proofErr w:type="spellStart"/>
-      <w:proofErr w:type="gramEnd"/>
-      <w:r>
-        <w:rPr>
-          <w:rFonts w:ascii="Courier New" w:eastAsia="Courier New" w:hAnsi="Courier New" w:cs="Courier New"/>
-          <w:sz w:val="18"/>
-          <w:szCs w:val="18"/>
-        </w:rPr>
-        <w:t>y_true</w:t>
-      </w:r>
-      <w:proofErr w:type="spellEnd"/>
-      <w:r>
-        <w:rPr>
-          <w:rFonts w:ascii="Courier New" w:eastAsia="Courier New" w:hAnsi="Courier New" w:cs="Courier New"/>
-          <w:sz w:val="18"/>
-          <w:szCs w:val="18"/>
-        </w:rPr>
-        <w:t xml:space="preserve">, </w:t>
-      </w:r>
-      <w:proofErr w:type="spellStart"/>
-      <w:r>
-        <w:rPr>
-          <w:rFonts w:ascii="Courier New" w:eastAsia="Courier New" w:hAnsi="Courier New" w:cs="Courier New"/>
-          <w:sz w:val="18"/>
-          <w:szCs w:val="18"/>
-        </w:rPr>
-        <w:t>y_pred</w:t>
-      </w:r>
-      <w:proofErr w:type="spellEnd"/>
-      <w:r>
-        <w:rPr>
-          <w:rFonts w:ascii="Courier New" w:eastAsia="Courier New" w:hAnsi="Courier New" w:cs="Courier New"/>
-          <w:sz w:val="18"/>
-          <w:szCs w:val="18"/>
-        </w:rPr>
-        <w:t>)</w:t>
+        <w:t xml:space="preserve">    r2   = r2_score(y_true, y_pred)</w:t>
       </w:r>
     </w:p>
     <w:p>
@@ -8903,72 +8859,8 @@
           <w:sz w:val="18"/>
           <w:szCs w:val="18"/>
         </w:rPr>
-        <w:t xml:space="preserve">    return {'model': </w:t>
-      </w:r>
-      <w:proofErr w:type="spellStart"/>
-      <w:r>
-        <w:rPr>
-          <w:rFonts w:ascii="Courier New" w:eastAsia="Courier New" w:hAnsi="Courier New" w:cs="Courier New"/>
-          <w:sz w:val="18"/>
-          <w:szCs w:val="18"/>
-        </w:rPr>
-        <w:t>model_name</w:t>
-      </w:r>
-      <w:proofErr w:type="spellEnd"/>
-      <w:r>
-        <w:rPr>
-          <w:rFonts w:ascii="Courier New" w:eastAsia="Courier New" w:hAnsi="Courier New" w:cs="Courier New"/>
-          <w:sz w:val="18"/>
-          <w:szCs w:val="18"/>
-        </w:rPr>
-        <w:t xml:space="preserve">, 'MAE': </w:t>
-      </w:r>
-      <w:proofErr w:type="spellStart"/>
-      <w:r>
-        <w:rPr>
-          <w:rFonts w:ascii="Courier New" w:eastAsia="Courier New" w:hAnsi="Courier New" w:cs="Courier New"/>
-          <w:sz w:val="18"/>
-          <w:szCs w:val="18"/>
-        </w:rPr>
-        <w:t>mae</w:t>
-      </w:r>
-      <w:proofErr w:type="spellEnd"/>
-      <w:r>
-        <w:rPr>
-          <w:rFonts w:ascii="Courier New" w:eastAsia="Courier New" w:hAnsi="Courier New" w:cs="Courier New"/>
-          <w:sz w:val="18"/>
-          <w:szCs w:val="18"/>
-        </w:rPr>
-        <w:t xml:space="preserve">, 'RMSE': </w:t>
-      </w:r>
-      <w:proofErr w:type="spellStart"/>
-      <w:r>
-        <w:rPr>
-          <w:rFonts w:ascii="Courier New" w:eastAsia="Courier New" w:hAnsi="Courier New" w:cs="Courier New"/>
-          <w:sz w:val="18"/>
-          <w:szCs w:val="18"/>
-        </w:rPr>
-        <w:t>rmse</w:t>
-      </w:r>
-      <w:proofErr w:type="spellEnd"/>
-      <w:r>
-        <w:rPr>
-          <w:rFonts w:ascii="Courier New" w:eastAsia="Courier New" w:hAnsi="Courier New" w:cs="Courier New"/>
-          <w:sz w:val="18"/>
-          <w:szCs w:val="18"/>
-        </w:rPr>
-        <w:t>, 'R2': r2}</w:t>
-      </w:r>
-    </w:p>
-    <w:p>
-      <w:pPr>
-        <w:spacing w:line="360" w:lineRule="auto"/>
-      </w:pPr>
-    </w:p>
-    <w:p>
-      <w:pPr>
-        <w:spacing w:line="360" w:lineRule="auto"/>
-      </w:pPr>
+        <w:t xml:space="preserve">    return {'model': model_name, 'MAE': mae, 'RMSE': rmse, 'R2': r2}</w:t>
+      </w:r>
     </w:p>
     <w:p>
       <w:pPr>
@@ -9538,53 +9430,12 @@
                 <w:szCs w:val="22"/>
               </w:rPr>
             </w:pPr>
-            <w:proofErr w:type="gramStart"/>
-            <w:r>
-              <w:rPr>
-                <w:sz w:val="22"/>
-                <w:szCs w:val="22"/>
-              </w:rPr>
-              <w:t>SARIMA(</w:t>
-            </w:r>
-            <w:proofErr w:type="gramEnd"/>
-            <w:r>
-              <w:rPr>
-                <w:sz w:val="22"/>
-                <w:szCs w:val="22"/>
-              </w:rPr>
-              <w:t>1,0,</w:t>
-            </w:r>
-            <w:proofErr w:type="gramStart"/>
-            <w:r>
-              <w:rPr>
-                <w:sz w:val="22"/>
-                <w:szCs w:val="22"/>
-              </w:rPr>
-              <w:t>1)(</w:t>
-            </w:r>
-            <w:proofErr w:type="gramEnd"/>
-            <w:r>
-              <w:rPr>
-                <w:sz w:val="22"/>
-                <w:szCs w:val="22"/>
-              </w:rPr>
-              <w:t>1,0,</w:t>
-            </w:r>
-            <w:proofErr w:type="gramStart"/>
-            <w:r>
-              <w:rPr>
-                <w:sz w:val="22"/>
-                <w:szCs w:val="22"/>
-              </w:rPr>
-              <w:t>1)[</w:t>
-            </w:r>
-            <w:proofErr w:type="gramEnd"/>
-            <w:r>
-              <w:rPr>
-                <w:sz w:val="22"/>
-                <w:szCs w:val="22"/>
-              </w:rPr>
-              <w:t>7]</w:t>
+            <w:r>
+              <w:rPr>
+                <w:sz w:val="22"/>
+                <w:szCs w:val="22"/>
+              </w:rPr>
+              <w:t>SARIMA(1,0,1)(1,0,1)[7]</w:t>
             </w:r>
           </w:p>
         </w:tc>
@@ -9697,15 +9548,7 @@
         <w:spacing w:before="240" w:line="360" w:lineRule="auto"/>
       </w:pPr>
       <w:r>
-        <w:t xml:space="preserve">The bar chart in Figure 5 </w:t>
-      </w:r>
-      <w:proofErr w:type="spellStart"/>
-      <w:r>
-        <w:t>visualises</w:t>
-      </w:r>
-      <w:proofErr w:type="spellEnd"/>
-      <w:r>
-        <w:t xml:space="preserve"> all three metrics simultaneously, confirming that Gradient Boosting outperforms Random Forest, which in turn substantially outperforms SARIMA across all evaluation criteria. Both ensemble methods achieved R2 above 0.999, indicating near-perfect fit on the test set.</w:t>
+        <w:t>The bar chart in Figure 5 visualises all three metrics simultaneously, confirming that Gradient Boosting outperforms Random Forest, which in turn substantially outperforms SARIMA across all evaluation criteria. Both ensemble methods achieved R2 above 0.999, indicating near-perfect fit on the test set.</w:t>
       </w:r>
     </w:p>
     <w:p>
@@ -9719,7 +9562,7 @@
           <w:noProof/>
         </w:rPr>
         <w:drawing>
-          <wp:inline distT="0" distB="0" distL="0" distR="0" wp14:anchorId="06A5724E" wp14:editId="78E67586">
+          <wp:inline distT="0" distB="0" distL="0" distR="0" wp14:anchorId="06A5724E" wp14:editId="43BDC8B8">
             <wp:extent cx="5715000" cy="2095500"/>
             <wp:effectExtent l="0" t="0" r="0" b="0"/>
             <wp:docPr id="838314499" name="Picture 6"/>
@@ -9736,7 +9579,7 @@
                     </pic:cNvPicPr>
                   </pic:nvPicPr>
                   <pic:blipFill>
-                    <a:blip r:embed="rId15" cstate="print">
+                    <a:blip r:embed="rId17" cstate="print">
                       <a:extLst>
                         <a:ext uri="{28A0092B-C50C-407E-A947-70E740481C1C}">
                           <a14:useLocalDpi xmlns:a14="http://schemas.microsoft.com/office/drawing/2010/main" val="0"/>
@@ -9804,15 +9647,7 @@
         <w:spacing w:before="240" w:line="360" w:lineRule="auto"/>
       </w:pPr>
       <w:r>
-        <w:t xml:space="preserve">Figure 6 presents the actual and Gradient Boosting predicted </w:t>
-      </w:r>
-      <w:proofErr w:type="spellStart"/>
-      <w:r>
-        <w:t>Global_active_power</w:t>
-      </w:r>
-      <w:proofErr w:type="spellEnd"/>
-      <w:r>
-        <w:t xml:space="preserve"> values over the final 14 days of the test set. The predicted series closely tracks the actual consumption, faithfully reproducing both the diurnal pattern and the magnitude of daily peaks. Minor discrepancies occur at sharp transient spikes, where simultaneous appliance usage produces brief demand surges that are difficult to predict from historical lag features alone.</w:t>
+        <w:t>Figure 6 presents the actual and Gradient Boosting predicted Global_active_power values over the final 14 days of the test set. The predicted series closely tracks the actual consumption, faithfully reproducing both the diurnal pattern and the magnitude of daily peaks. Minor discrepancies occur at sharp transient spikes, where simultaneous appliance usage produces brief demand surges that are difficult to predict from historical lag features alone.</w:t>
       </w:r>
     </w:p>
     <w:p>
@@ -9845,7 +9680,7 @@
                     </pic:cNvPicPr>
                   </pic:nvPicPr>
                   <pic:blipFill>
-                    <a:blip r:embed="rId16" cstate="print">
+                    <a:blip r:embed="rId18" cstate="print">
                       <a:extLst>
                         <a:ext uri="{28A0092B-C50C-407E-A947-70E740481C1C}">
                           <a14:useLocalDpi xmlns:a14="http://schemas.microsoft.com/office/drawing/2010/main" val="0"/>
@@ -9936,7 +9771,7 @@
                     </pic:cNvPicPr>
                   </pic:nvPicPr>
                   <pic:blipFill>
-                    <a:blip r:embed="rId17" cstate="print">
+                    <a:blip r:embed="rId19" cstate="print">
                       <a:extLst>
                         <a:ext uri="{28A0092B-C50C-407E-A947-70E740481C1C}">
                           <a14:useLocalDpi xmlns:a14="http://schemas.microsoft.com/office/drawing/2010/main" val="0"/>
@@ -10008,15 +9843,7 @@
         <w:spacing w:before="240" w:line="360" w:lineRule="auto"/>
       </w:pPr>
       <w:r>
-        <w:t xml:space="preserve">Feature importances from the Gradient Boosting model (Table 6, Figure 8) reveal that </w:t>
-      </w:r>
-      <w:proofErr w:type="spellStart"/>
-      <w:r>
-        <w:t>Global_intensity</w:t>
-      </w:r>
-      <w:proofErr w:type="spellEnd"/>
-      <w:r>
-        <w:t xml:space="preserve"> dominates prediction with an importance score of 0.9993, reflecting the direct physical relationship P = V x I between active power, voltage, and current intensity. Voltage contributes a further 0.0003, while the remaining 18 engineered features collectively account for less than 0.0005 of total importance. This confirms that when electrical attributes are present in the feature set, temporal and lag features contribute marginally to prediction accuracy.</w:t>
+        <w:t>Feature importances from the Gradient Boosting model (Table 6, Figure 8) reveal that Global_intensity dominates prediction with an importance score of 0.9993, reflecting the direct physical relationship P = V x I between active power, voltage, and current intensity. Voltage contributes a further 0.0003, while the remaining 18 engineered features collectively account for less than 0.0005 of total importance. This confirms that when electrical attributes are present in the feature set, temporal and lag features contribute marginally to prediction accuracy.</w:t>
       </w:r>
     </w:p>
     <w:p>
@@ -10243,7 +10070,6 @@
                 <w:szCs w:val="22"/>
               </w:rPr>
             </w:pPr>
-            <w:proofErr w:type="spellStart"/>
             <w:r>
               <w:rPr>
                 <w:sz w:val="22"/>
@@ -10251,7 +10077,6 @@
               </w:rPr>
               <w:t>Global_intensity</w:t>
             </w:r>
-            <w:proofErr w:type="spellEnd"/>
           </w:p>
         </w:tc>
         <w:tc>
@@ -10567,7 +10392,6 @@
                 <w:szCs w:val="22"/>
               </w:rPr>
             </w:pPr>
-            <w:proofErr w:type="spellStart"/>
             <w:r>
               <w:rPr>
                 <w:sz w:val="22"/>
@@ -10575,7 +10399,6 @@
               </w:rPr>
               <w:t>month_cos</w:t>
             </w:r>
-            <w:proofErr w:type="spellEnd"/>
           </w:p>
         </w:tc>
         <w:tc>
@@ -10963,7 +10786,7 @@
                     </pic:cNvPicPr>
                   </pic:nvPicPr>
                   <pic:blipFill>
-                    <a:blip r:embed="rId18">
+                    <a:blip r:embed="rId20">
                       <a:extLst>
                         <a:ext uri="{28A0092B-C50C-407E-A947-70E740481C1C}">
                           <a14:useLocalDpi xmlns:a14="http://schemas.microsoft.com/office/drawing/2010/main" val="0"/>
@@ -11066,7 +10889,7 @@
                     </pic:cNvPicPr>
                   </pic:nvPicPr>
                   <pic:blipFill>
-                    <a:blip r:embed="rId19">
+                    <a:blip r:embed="rId21">
                       <a:extLst>
                         <a:ext uri="{28A0092B-C50C-407E-A947-70E740481C1C}">
                           <a14:useLocalDpi xmlns:a14="http://schemas.microsoft.com/office/drawing/2010/main" val="0"/>
@@ -11138,31 +10961,7 @@
         <w:spacing w:before="240" w:line="360" w:lineRule="auto"/>
       </w:pPr>
       <w:r>
-        <w:t xml:space="preserve">The superiority of ensemble methods over SARIMA can be attributed to three primary factors. First, Random Forest and Gradient Boosting exploit the full 20-feature multivariate input, including electrically informative attributes such as </w:t>
-      </w:r>
-      <w:proofErr w:type="spellStart"/>
-      <w:r>
-        <w:t>Global_intensity</w:t>
-      </w:r>
-      <w:proofErr w:type="spellEnd"/>
-      <w:r>
-        <w:t xml:space="preserve"> and sub-metering readings, whereas SARIMA operates on a univariate daily series. Second, </w:t>
-      </w:r>
-      <w:proofErr w:type="spellStart"/>
-      <w:r>
-        <w:t>Global_intensity</w:t>
-      </w:r>
-      <w:proofErr w:type="spellEnd"/>
-      <w:r>
-        <w:t xml:space="preserve"> effectively provides the models with near-direct algebraic access to the target through the physics of P = V x I. Third, the ensemble models represent non-linear interactions between temporal and electrical features through tree splits, which SARIMA cannot replicate. These findings align with Taylor and McSharry (2007), who reported rapid performance deterioration of ARIMA-class models beyond one-week horizons on residential load data, and with </w:t>
-      </w:r>
-      <w:proofErr w:type="spellStart"/>
-      <w:r>
-        <w:t>Amasyali</w:t>
-      </w:r>
-      <w:proofErr w:type="spellEnd"/>
-      <w:r>
-        <w:t xml:space="preserve"> and El-Gohary (2018), who found ensemble methods consistently outperform statistical baselines in residential forecasting.</w:t>
+        <w:t>The superiority of ensemble methods over SARIMA can be attributed to three primary factors. First, Random Forest and Gradient Boosting exploit the full 20-feature multivariate input, including electrically informative attributes such as Global_intensity and sub-metering readings, whereas SARIMA operates on a univariate daily series. Second, Global_intensity effectively provides the models with near-direct algebraic access to the target through the physics of P = V x I. Third, the ensemble models represent non-linear interactions between temporal and electrical features through tree splits, which SARIMA cannot replicate. These findings align with Taylor and McSharry (2007), who reported rapid performance deterioration of ARIMA-class models beyond one-week horizons on residential load data, and with Amasyali and El-Gohary (2018), who found ensemble methods consistently outperform statistical baselines in residential forecasting.</w:t>
       </w:r>
     </w:p>
     <w:p>
@@ -11199,31 +10998,7 @@
         <w:spacing w:before="240" w:line="360" w:lineRule="auto"/>
       </w:pPr>
       <w:r>
-        <w:t xml:space="preserve">Three algorithms were assessed on a chronological 80/20 train/test split. The Gradient Boosting Regressor achieved the highest test-set accuracy (MAE = 0.0132 kW, RMSE = 0.0207 kW, R2 = 0.9992), marginally outperforming Random Forest (MAE = 0.0146 kW, R2 = 0.9990). Both ensemble methods substantially outperformed </w:t>
-      </w:r>
-      <w:proofErr w:type="gramStart"/>
-      <w:r>
-        <w:t>SARIMA(</w:t>
-      </w:r>
-      <w:proofErr w:type="gramEnd"/>
-      <w:r>
-        <w:t>1,0,</w:t>
-      </w:r>
-      <w:proofErr w:type="gramStart"/>
-      <w:r>
-        <w:t>1)(</w:t>
-      </w:r>
-      <w:proofErr w:type="gramEnd"/>
-      <w:r>
-        <w:t>1,0,</w:t>
-      </w:r>
-      <w:proofErr w:type="gramStart"/>
-      <w:r>
-        <w:t>1)[</w:t>
-      </w:r>
-      <w:proofErr w:type="gramEnd"/>
-      <w:r>
-        <w:t>7] (R2 = -0.1941),</w:t>
+        <w:t>Three algorithms were assessed on a chronological 80/20 train/test split. The Gradient Boosting Regressor achieved the highest test-set accuracy (MAE = 0.0132 kW, RMSE = 0.0207 kW, R2 = 0.9992), marginally outperforming Random Forest (MAE = 0.0146 kW, R2 = 0.9990). Both ensemble methods substantially outperformed SARIMA(1,0,1)(1,0,1)[7] (R2 = -0.1941),</w:t>
       </w:r>
     </w:p>
     <w:p>
@@ -11231,15 +11006,7 @@
         <w:spacing w:before="240" w:line="360" w:lineRule="auto"/>
       </w:pPr>
       <w:r>
-        <w:t xml:space="preserve">It should be noted that the near-perfect performance of ensemble models is largely driven by the inclusion of </w:t>
-      </w:r>
-      <w:proofErr w:type="spellStart"/>
-      <w:r>
-        <w:t>Global_intensity</w:t>
-      </w:r>
-      <w:proofErr w:type="spellEnd"/>
-      <w:r>
-        <w:t xml:space="preserve"> as a feature, which provides a direct physical proxy for the target variable. For purely forecasting applications where sub-metering and electrical attributes are unavailable at prediction time, a model architecture relying solely on lag and calendar features would provide a more practically relevant evaluation.</w:t>
+        <w:t>It should be noted that the near-perfect performance of ensemble models is largely driven by the inclusion of Global_intensity as a feature, which provides a direct physical proxy for the target variable. For purely forecasting applications where sub-metering and electrical attributes are unavailable at prediction time, a model architecture relying solely on lag and calendar features would provide a more practically relevant evaluation.</w:t>
       </w:r>
     </w:p>
     <w:p>
@@ -11247,7 +11014,10 @@
         <w:spacing w:before="240" w:line="360" w:lineRule="auto"/>
       </w:pPr>
       <w:r>
-        <w:t>Several limitations should be acknowledged. The evaluation employed a single chronological split; rolling-window or expanding-window cross-validation would yield more robust generalisation estimates. No external meteorological data were incorporated, despite temperature and humidity being well-established drivers of residential demand.</w:t>
+        <w:t>Several limitations should be acknowledged. The evaluation employed a single chronological train/test split; rolling-window or expanding-window cross-validation across multiple folds would yield more statistically robust generalisation estimates and reduce sensitivity to the specific split boundary chosen. No external meteorological data were incorporated into the feature set, despite ambient temperature and humidity being well-established drivers of residential electricity demand, particularly for heating and cooling loads (Hong and Fan, 2016). Additionally, the current pipeline does not address multi-step ahead forecasting, which is operationally important for grid operators who typically require demand predictions at horizons of six to twenty-four hours rather than a single one-step-ahead output</w:t>
+      </w:r>
+      <w:r>
+        <w:t>.</w:t>
       </w:r>
     </w:p>
     <w:p>
@@ -11272,26 +11042,52 @@
       <w:pPr>
         <w:pStyle w:val="Heading1"/>
       </w:pPr>
-      <w:bookmarkStart w:id="43" w:name="_Toc231250035"/>
+      <w:bookmarkStart w:id="43" w:name="_Toc232402496"/>
+      <w:bookmarkStart w:id="44" w:name="_Toc232626504"/>
+      <w:bookmarkStart w:id="45" w:name="_Toc231250035"/>
+      <w:r>
+        <w:lastRenderedPageBreak/>
+        <w:t>Acknowledgement</w:t>
+      </w:r>
+      <w:bookmarkEnd w:id="43"/>
+      <w:bookmarkEnd w:id="44"/>
+    </w:p>
+    <w:p>
+      <w:pPr>
+        <w:spacing w:before="240" w:line="360" w:lineRule="auto"/>
+        <w:rPr>
+          <w:rFonts w:eastAsiaTheme="majorEastAsia" w:cstheme="majorBidi"/>
+          <w:b/>
+          <w:color w:val="000000" w:themeColor="text1"/>
+          <w:sz w:val="28"/>
+          <w:szCs w:val="40"/>
+        </w:rPr>
+      </w:pPr>
+      <w:r>
+        <w:t>Perplexity AI was used in the preparation of this report to support literature searching, identify potentially relevant academic sources, and assist with grammar correction and word-limit reduction during editing. All sources included in the reference list were checked by the author and cited as the original academic works rather than citing Perplexity AI as a source. The analysis, interpretation, discussion, and final written content submitted in this report are the author’s own work and responsibility.</w:t>
+      </w:r>
+      <w:r>
+        <w:br w:type="page"/>
+      </w:r>
+    </w:p>
+    <w:p>
+      <w:pPr>
+        <w:pStyle w:val="Heading1"/>
+      </w:pPr>
       <w:r>
         <w:lastRenderedPageBreak/>
         <w:t>References</w:t>
       </w:r>
-      <w:bookmarkEnd w:id="43"/>
+      <w:bookmarkEnd w:id="45"/>
     </w:p>
     <w:p>
       <w:pPr>
         <w:spacing w:before="240" w:line="360" w:lineRule="auto"/>
       </w:pPr>
-      <w:proofErr w:type="spellStart"/>
-      <w:r>
-        <w:t>Amasyali</w:t>
-      </w:r>
-      <w:proofErr w:type="spellEnd"/>
-      <w:r>
-        <w:t xml:space="preserve">, K. and El-Gohary, N.M., 2018. A review of data-driven building energy consumption prediction studies. Renewable and Sustainable Energy Reviews, 81(1), pp.1192-1205. Available at: </w:t>
-      </w:r>
-      <w:hyperlink r:id="rId20" w:history="1">
+      <w:r>
+        <w:t xml:space="preserve">Amasyali, K. and El-Gohary, N.M., 2018. A review of data-driven building energy consumption prediction studies. Renewable and Sustainable Energy Reviews, 81(1), pp.1192-1205. Available at: </w:t>
+      </w:r>
+      <w:hyperlink r:id="rId22" w:history="1">
         <w:r>
           <w:rPr>
             <w:rStyle w:val="Hyperlink"/>
@@ -11300,7 +11096,13 @@
         </w:r>
       </w:hyperlink>
       <w:r>
-        <w:t xml:space="preserve"> [Accessed 01 June 2026].</w:t>
+        <w:t xml:space="preserve"> [Accessed </w:t>
+      </w:r>
+      <w:r>
+        <w:t>18 June 2026</w:t>
+      </w:r>
+      <w:r>
+        <w:t>].</w:t>
       </w:r>
     </w:p>
     <w:p>
@@ -11315,15 +11117,10 @@
       <w:pPr>
         <w:spacing w:before="240" w:line="360" w:lineRule="auto"/>
       </w:pPr>
-      <w:proofErr w:type="spellStart"/>
-      <w:r>
-        <w:t>Breiman</w:t>
-      </w:r>
-      <w:proofErr w:type="spellEnd"/>
-      <w:r>
-        <w:t xml:space="preserve">, L., 2001. Random forests. Machine Learning, 45(1), pp.5-32. Available at: </w:t>
-      </w:r>
-      <w:hyperlink r:id="rId21" w:history="1">
+      <w:r>
+        <w:t xml:space="preserve">Breiman, L., 2001. Random forests. Machine Learning, 45(1), pp.5-32. Available at: </w:t>
+      </w:r>
+      <w:hyperlink r:id="rId23" w:history="1">
         <w:r>
           <w:rPr>
             <w:rStyle w:val="Hyperlink"/>
@@ -11332,7 +11129,13 @@
         </w:r>
       </w:hyperlink>
       <w:r>
-        <w:t xml:space="preserve"> [Accessed 01 June 2026].</w:t>
+        <w:t xml:space="preserve"> [Accessed </w:t>
+      </w:r>
+      <w:r>
+        <w:t>18 June 2026</w:t>
+      </w:r>
+      <w:r>
+        <w:t>].</w:t>
       </w:r>
     </w:p>
     <w:p>
@@ -11340,21 +11143,27 @@
         <w:spacing w:before="240" w:line="360" w:lineRule="auto"/>
       </w:pPr>
       <w:r>
-        <w:t xml:space="preserve">Fan, C., Xiao, F., Zhao, Y. and Wang, J., 2017. Analytical investigation of autoencoder-based methods for unsupervised anomaly detection in building energy data. Applied Energy, 211, pp.1123-1135. Available at: </w:t>
-      </w:r>
-      <w:hyperlink r:id="rId22" w:history="1">
+        <w:t xml:space="preserve">Bontempi, G., Taieb, S.B. and Le Borgne, Y.-A., 2013. Machine learning strategies for time series forecasting. In: Aufaure, M.-A. and Zimányi, E., eds. Business Intelligence: Second European Summer School, eBISS 2012, Brussels, Belgium, July 15–21, 2012, Tutorial Lectures. Lecture Notes in Business Information Processing, 138. Berlin: Springer, pp.62–77. Available at: </w:t>
+      </w:r>
+      <w:hyperlink r:id="rId24" w:history="1">
         <w:r>
           <w:rPr>
             <w:rStyle w:val="Hyperlink"/>
           </w:rPr>
-          <w:t>https://doi.org/10.1016/j.apenergy.2017.12.005</w:t>
+          <w:t>https://doi.org/10.1007/978-3-642-36318-4_3</w:t>
         </w:r>
       </w:hyperlink>
       <w:r>
         <w:t xml:space="preserve"> </w:t>
       </w:r>
       <w:r>
-        <w:t>[Accessed 01 June 2026].</w:t>
+        <w:t xml:space="preserve">[Accessed </w:t>
+      </w:r>
+      <w:r>
+        <w:t>18 June 2026</w:t>
+      </w:r>
+      <w:r>
+        <w:t>].</w:t>
       </w:r>
     </w:p>
     <w:p>
@@ -11364,7 +11173,7 @@
       <w:r>
         <w:t xml:space="preserve">Friedman, J.H., 2001. Greedy function approximation: A gradient boosting machine. Annals of Statistics, 29(5), pp.1189-1232. Available at: </w:t>
       </w:r>
-      <w:hyperlink r:id="rId23" w:history="1">
+      <w:hyperlink r:id="rId25" w:history="1">
         <w:r>
           <w:rPr>
             <w:rStyle w:val="Hyperlink"/>
@@ -11376,22 +11185,23 @@
         <w:t xml:space="preserve"> </w:t>
       </w:r>
       <w:r>
-        <w:t>[Accessed 01 June 2026].</w:t>
+        <w:t xml:space="preserve">[Accessed </w:t>
+      </w:r>
+      <w:r>
+        <w:t>18 June 2026</w:t>
+      </w:r>
+      <w:r>
+        <w:t>].</w:t>
       </w:r>
     </w:p>
     <w:p>
       <w:pPr>
         <w:spacing w:before="240" w:line="360" w:lineRule="auto"/>
       </w:pPr>
-      <w:proofErr w:type="spellStart"/>
-      <w:r>
-        <w:t>Hebrail</w:t>
-      </w:r>
-      <w:proofErr w:type="spellEnd"/>
-      <w:r>
-        <w:t xml:space="preserve">, G. and Berard, A., 2012. Individual Household Electric Power Consumption Data Set. UCI Machine Learning Repository. Available at: </w:t>
-      </w:r>
-      <w:hyperlink r:id="rId24" w:history="1">
+      <w:r>
+        <w:t xml:space="preserve">Hebrail, G. and Berard, A., 2012. Individual Household Electric Power Consumption Data Set. UCI Machine Learning Repository. Available at: </w:t>
+      </w:r>
+      <w:hyperlink r:id="rId26" w:history="1">
         <w:r>
           <w:rPr>
             <w:rStyle w:val="Hyperlink"/>
@@ -11406,7 +11216,13 @@
         <w:t xml:space="preserve"> </w:t>
       </w:r>
       <w:r>
-        <w:t>[Accessed 01 June 2026].</w:t>
+        <w:t xml:space="preserve">[Accessed </w:t>
+      </w:r>
+      <w:r>
+        <w:t>18 June 2026</w:t>
+      </w:r>
+      <w:r>
+        <w:t>].</w:t>
       </w:r>
     </w:p>
     <w:p>
@@ -11416,7 +11232,7 @@
       <w:r>
         <w:t xml:space="preserve">Hong, T. and Fan, S., 2016. Probabilistic electric load forecasting: A tutorial review. International Journal of Forecasting, 32(3), pp.914-938. Available at: </w:t>
       </w:r>
-      <w:hyperlink r:id="rId25" w:history="1">
+      <w:hyperlink r:id="rId27" w:history="1">
         <w:r>
           <w:rPr>
             <w:rStyle w:val="Hyperlink"/>
@@ -11428,7 +11244,13 @@
         <w:t xml:space="preserve"> </w:t>
       </w:r>
       <w:r>
-        <w:t>[Accessed 01 June 2026].</w:t>
+        <w:t xml:space="preserve">[Accessed </w:t>
+      </w:r>
+      <w:r>
+        <w:t>18 June 2026</w:t>
+      </w:r>
+      <w:r>
+        <w:t>].</w:t>
       </w:r>
     </w:p>
     <w:p>
@@ -11436,17 +11258,9 @@
         <w:spacing w:before="240" w:line="360" w:lineRule="auto"/>
       </w:pPr>
       <w:r>
-        <w:t xml:space="preserve">Hyndman, R.J. and Athanasopoulos, G., 2021. Forecasting: Principles and Practice. 3rd ed. Melbourne: </w:t>
-      </w:r>
-      <w:proofErr w:type="spellStart"/>
-      <w:r>
-        <w:t>OTexts</w:t>
-      </w:r>
-      <w:proofErr w:type="spellEnd"/>
-      <w:r>
-        <w:t xml:space="preserve">. Available at: </w:t>
-      </w:r>
-      <w:hyperlink r:id="rId26" w:history="1">
+        <w:t xml:space="preserve">Hyndman, R.J. and Athanasopoulos, G., 2021. Forecasting: Principles and Practice. 3rd ed. Melbourne: OTexts. Available at: </w:t>
+      </w:r>
+      <w:hyperlink r:id="rId28" w:history="1">
         <w:r>
           <w:rPr>
             <w:rStyle w:val="Hyperlink"/>
@@ -11458,7 +11272,13 @@
         <w:t xml:space="preserve"> </w:t>
       </w:r>
       <w:r>
-        <w:t xml:space="preserve"> [Accessed 01 June 2026].</w:t>
+        <w:t xml:space="preserve"> [Accessed </w:t>
+      </w:r>
+      <w:r>
+        <w:t>18 June 2026</w:t>
+      </w:r>
+      <w:r>
+        <w:t>].</w:t>
       </w:r>
     </w:p>
     <w:p>
@@ -11466,9 +11286,13 @@
         <w:spacing w:before="240" w:line="360" w:lineRule="auto"/>
       </w:pPr>
       <w:r>
-        <w:t xml:space="preserve">Kong, W., Dong, Z.Y., Jia, Y., Hill, D.J., Xu, Y. and Zhang, Y., 2019. Short-term residential load forecasting based on LSTM recurrent neural network. IEEE Transactions on Smart Grid, 10(1), pp.841-851. Available at: </w:t>
-      </w:r>
-      <w:hyperlink r:id="rId27" w:history="1">
+        <w:t xml:space="preserve">Kong, W., Dong, Z.Y., Jia, Y., Hill, D.J., Xu, Y. and Zhang, Y., 2019. Short-term residential load forecasting based on LSTM recurrent neural network. IEEE Transactions on Smart Grid, </w:t>
+      </w:r>
+      <w:r>
+        <w:lastRenderedPageBreak/>
+        <w:t xml:space="preserve">10(1), pp.841-851. Available at: </w:t>
+      </w:r>
+      <w:hyperlink r:id="rId29" w:history="1">
         <w:r>
           <w:rPr>
             <w:rStyle w:val="Hyperlink"/>
@@ -11480,7 +11304,13 @@
         <w:t xml:space="preserve"> </w:t>
       </w:r>
       <w:r>
-        <w:t>[Accessed 01 June 2026].</w:t>
+        <w:t xml:space="preserve">[Accessed </w:t>
+      </w:r>
+      <w:r>
+        <w:t>18 June 2026</w:t>
+      </w:r>
+      <w:r>
+        <w:t>].</w:t>
       </w:r>
     </w:p>
     <w:p>
@@ -11488,10 +11318,9 @@
         <w:spacing w:before="240" w:line="360" w:lineRule="auto"/>
       </w:pPr>
       <w:r>
-        <w:lastRenderedPageBreak/>
         <w:t xml:space="preserve">Lim, B., Arik, S.O., Loeff, N. and Pfister, T., 2021. Temporal fusion transformers for interpretable multi-horizon time series forecasting. International Journal of Forecasting, 37(4), pp.1748-1764. Available at: </w:t>
       </w:r>
-      <w:hyperlink r:id="rId28" w:history="1">
+      <w:hyperlink r:id="rId30" w:history="1">
         <w:r>
           <w:rPr>
             <w:rStyle w:val="Hyperlink"/>
@@ -11503,7 +11332,13 @@
         <w:t xml:space="preserve"> </w:t>
       </w:r>
       <w:r>
-        <w:t>[Accessed 01 June 2026].</w:t>
+        <w:t xml:space="preserve">[Accessed </w:t>
+      </w:r>
+      <w:r>
+        <w:t>18 June 2026</w:t>
+      </w:r>
+      <w:r>
+        <w:t>].</w:t>
       </w:r>
     </w:p>
     <w:p>
@@ -11513,7 +11348,7 @@
       <w:r>
         <w:t xml:space="preserve">Taylor, J.W. and McSharry, P.E., 2007. Short-term load forecasting methods: An evaluation based on European data. IEEE Transactions on Power Systems, 22(4), pp.2213-2219. Available at: </w:t>
       </w:r>
-      <w:hyperlink r:id="rId29" w:history="1">
+      <w:hyperlink r:id="rId31" w:history="1">
         <w:r>
           <w:rPr>
             <w:rStyle w:val="Hyperlink"/>
@@ -11525,7 +11360,13 @@
         <w:t xml:space="preserve"> </w:t>
       </w:r>
       <w:r>
-        <w:t>[Accessed 01 June 2026].</w:t>
+        <w:t xml:space="preserve">[Accessed </w:t>
+      </w:r>
+      <w:r>
+        <w:t>18 June 2026</w:t>
+      </w:r>
+      <w:r>
+        <w:t>].</w:t>
       </w:r>
     </w:p>
     <w:p>
@@ -11534,7 +11375,7 @@
       </w:pPr>
     </w:p>
     <w:sectPr>
-      <w:footerReference w:type="default" r:id="rId30"/>
+      <w:footerReference w:type="default" r:id="rId32"/>
       <w:type w:val="continuous"/>
       <w:pgSz w:w="11906" w:h="16838" w:code="9"/>
       <w:pgMar w:top="1440" w:right="1440" w:bottom="1440" w:left="1440" w:header="720" w:footer="720" w:gutter="0"/>
@@ -12054,7 +11895,7 @@
   <w:style w:type="paragraph" w:default="1" w:styleId="Normal">
     <w:name w:val="Normal"/>
     <w:qFormat/>
-    <w:rsid w:val="0063249E"/>
+    <w:rsid w:val="00C45337"/>
     <w:pPr>
       <w:spacing w:after="0"/>
       <w:jc w:val="both"/>
@@ -12264,6 +12105,7 @@
   <w:style w:type="character" w:default="1" w:styleId="DefaultParagraphFont">
     <w:name w:val="Default Paragraph Font"/>
     <w:uiPriority w:val="1"/>
+    <w:semiHidden/>
     <w:unhideWhenUsed/>
   </w:style>
   <w:style w:type="table" w:default="1" w:styleId="TableNormal">
@@ -12778,6 +12620,17 @@
     <w:unhideWhenUsed/>
     <w:rsid w:val="00DA5632"/>
   </w:style>
+  <w:style w:type="paragraph" w:styleId="NormalWeb">
+    <w:name w:val="Normal (Web)"/>
+    <w:basedOn w:val="Normal"/>
+    <w:uiPriority w:val="99"/>
+    <w:semiHidden/>
+    <w:unhideWhenUsed/>
+    <w:rsid w:val="0001342F"/>
+    <w:rPr>
+      <w:rFonts w:cs="Times New Roman"/>
+    </w:rPr>
+  </w:style>
 </w:styles>
 </file>
 

</xml_diff>

<commit_message>
Update report details and fix word limit notes
</commit_message>
<xml_diff>
--- a/Sem1/Machine Learning Fundamentals/project-assignment/report.docx
+++ b/Sem1/Machine Learning Fundamentals/project-assignment/report.docx
@@ -207,6 +207,7 @@
           <w:u w:val="single"/>
         </w:rPr>
       </w:pPr>
+      <w:proofErr w:type="spellStart"/>
       <w:r>
         <w:rPr>
           <w:b/>
@@ -214,46 +215,56 @@
           <w:szCs w:val="28"/>
           <w:u w:val="single"/>
         </w:rPr>
-        <w:t>Programme title:</w:t>
-      </w:r>
-    </w:p>
-    <w:p>
-      <w:pPr>
-        <w:spacing w:line="360" w:lineRule="auto"/>
-        <w:jc w:val="left"/>
-        <w:rPr>
-          <w:bCs/>
-          <w:sz w:val="28"/>
-          <w:szCs w:val="28"/>
-        </w:rPr>
-      </w:pPr>
-      <w:r>
-        <w:rPr>
-          <w:bCs/>
-          <w:sz w:val="28"/>
-          <w:szCs w:val="28"/>
-        </w:rPr>
-        <w:t>MSc Artificial Intelligence</w:t>
-      </w:r>
-    </w:p>
-    <w:p>
-      <w:pPr>
-        <w:spacing w:line="360" w:lineRule="auto"/>
-        <w:jc w:val="left"/>
+        <w:t>Programme</w:t>
+      </w:r>
+      <w:proofErr w:type="spellEnd"/>
+      <w:r>
         <w:rPr>
           <w:b/>
           <w:sz w:val="28"/>
           <w:szCs w:val="28"/>
           <w:u w:val="single"/>
         </w:rPr>
-      </w:pPr>
-      <w:r>
+        <w:t xml:space="preserve"> title:</w:t>
+      </w:r>
+    </w:p>
+    <w:p>
+      <w:pPr>
+        <w:spacing w:line="360" w:lineRule="auto"/>
+        <w:jc w:val="left"/>
+        <w:rPr>
+          <w:bCs/>
+          <w:sz w:val="28"/>
+          <w:szCs w:val="28"/>
+        </w:rPr>
+      </w:pPr>
+      <w:r>
+        <w:rPr>
+          <w:bCs/>
+          <w:sz w:val="28"/>
+          <w:szCs w:val="28"/>
+        </w:rPr>
+        <w:t>MSc Artificial Intelligence</w:t>
+      </w:r>
+    </w:p>
+    <w:p>
+      <w:pPr>
+        <w:spacing w:line="360" w:lineRule="auto"/>
+        <w:jc w:val="left"/>
         <w:rPr>
           <w:b/>
           <w:sz w:val="28"/>
           <w:szCs w:val="28"/>
           <w:u w:val="single"/>
         </w:rPr>
+      </w:pPr>
+      <w:r>
+        <w:rPr>
+          <w:b/>
+          <w:sz w:val="28"/>
+          <w:szCs w:val="28"/>
+          <w:u w:val="single"/>
+        </w:rPr>
         <w:t>Module:</w:t>
       </w:r>
     </w:p>
@@ -324,6 +335,22 @@
           <w:szCs w:val="28"/>
         </w:rPr>
         <w:t>Amaan Mohammed Khalander</w:t>
+      </w:r>
+      <w:r>
+        <w:rPr>
+          <w:bCs/>
+          <w:sz w:val="28"/>
+          <w:szCs w:val="28"/>
+        </w:rPr>
+        <w:t xml:space="preserve"> /</w:t>
+      </w:r>
+      <w:r>
+        <w:rPr>
+          <w:bCs/>
+          <w:sz w:val="28"/>
+          <w:szCs w:val="28"/>
+        </w:rPr>
+        <w:t xml:space="preserve"> Q1132588</w:t>
       </w:r>
     </w:p>
     <w:p>
@@ -477,12 +504,21 @@
         </w:rPr>
         <w:t xml:space="preserve">Dr. </w:t>
       </w:r>
+      <w:proofErr w:type="spellStart"/>
       <w:r>
         <w:rPr>
           <w:sz w:val="28"/>
           <w:szCs w:val="28"/>
         </w:rPr>
-        <w:t>Fahmid Al Farid</w:t>
+        <w:t>Fahmid</w:t>
+      </w:r>
+      <w:proofErr w:type="spellEnd"/>
+      <w:r>
+        <w:rPr>
+          <w:sz w:val="28"/>
+          <w:szCs w:val="28"/>
+        </w:rPr>
+        <w:t xml:space="preserve"> Al Farid</w:t>
       </w:r>
     </w:p>
     <w:p>
@@ -512,6 +548,7 @@
           <w:color w:val="000000" w:themeColor="text1"/>
           <w:sz w:val="32"/>
           <w:szCs w:val="40"/>
+          <w:u w:val="single"/>
         </w:rPr>
       </w:pPr>
       <w:r>
@@ -521,6 +558,7 @@
           <w:color w:val="000000" w:themeColor="text1"/>
           <w:sz w:val="28"/>
           <w:szCs w:val="36"/>
+          <w:u w:val="single"/>
         </w:rPr>
         <w:lastRenderedPageBreak/>
         <w:t>Learner declaration</w:t>
@@ -1351,12 +1389,13 @@
     </w:p>
     <w:p>
       <w:pPr>
-        <w:spacing w:after="240"/>
+        <w:spacing w:line="360" w:lineRule="auto"/>
         <w:rPr>
           <w:b/>
           <w:bCs/>
           <w:sz w:val="28"/>
           <w:szCs w:val="28"/>
+          <w:u w:val="single"/>
         </w:rPr>
       </w:pPr>
       <w:r>
@@ -1365,13 +1404,14 @@
           <w:bCs/>
           <w:sz w:val="28"/>
           <w:szCs w:val="28"/>
+          <w:u w:val="single"/>
         </w:rPr>
         <w:t>Source Code and Relevant Project Links</w:t>
       </w:r>
     </w:p>
     <w:p>
       <w:pPr>
-        <w:spacing w:after="240"/>
+        <w:spacing w:line="360" w:lineRule="auto"/>
         <w:rPr>
           <w:b/>
           <w:bCs/>
@@ -1387,7 +1427,7 @@
     </w:p>
     <w:p>
       <w:pPr>
-        <w:spacing w:after="240"/>
+        <w:spacing w:line="360" w:lineRule="auto"/>
       </w:pPr>
       <w:hyperlink r:id="rId10" w:history="1">
         <w:r>
@@ -1403,7 +1443,7 @@
     </w:p>
     <w:p>
       <w:pPr>
-        <w:spacing w:after="240"/>
+        <w:spacing w:line="360" w:lineRule="auto"/>
         <w:rPr>
           <w:b/>
           <w:bCs/>
@@ -1419,20 +1459,14 @@
     </w:p>
     <w:p>
       <w:pPr>
-        <w:spacing w:after="240"/>
+        <w:spacing w:line="360" w:lineRule="auto"/>
       </w:pPr>
       <w:hyperlink r:id="rId11" w:history="1">
         <w:r>
           <w:rPr>
             <w:rStyle w:val="Hyperlink"/>
           </w:rPr>
-          <w:t>https://archive.ics.uci.edu/ml/datasets/individual+household+electric+power+consumptio</w:t>
-        </w:r>
-        <w:r>
-          <w:rPr>
-            <w:rStyle w:val="Hyperlink"/>
-          </w:rPr>
-          <w:t>n</w:t>
+          <w:t>https://archive.ics.uci.edu/ml/datasets/individual+household+electric+power+consumption</w:t>
         </w:r>
       </w:hyperlink>
       <w:r>
@@ -1441,7 +1475,7 @@
     </w:p>
     <w:p>
       <w:pPr>
-        <w:spacing w:after="240"/>
+        <w:spacing w:line="360" w:lineRule="auto"/>
         <w:rPr>
           <w:b/>
           <w:bCs/>
@@ -1457,16 +1491,24 @@
     </w:p>
     <w:p>
       <w:pPr>
+        <w:spacing w:line="360" w:lineRule="auto"/>
+      </w:pPr>
+      <w:hyperlink r:id="rId12" w:history="1">
+        <w:r>
+          <w:rPr>
+            <w:rStyle w:val="Hyperlink"/>
+          </w:rPr>
+          <w:t>https://github.com/Amaan9136/bsbi-assignments/blob/main/Sem1/Machine%20Learning%20Fundamentals/project-assignment/report.pdf</w:t>
+        </w:r>
+      </w:hyperlink>
+      <w:r>
+        <w:t xml:space="preserve"> </w:t>
+      </w:r>
+    </w:p>
+    <w:p>
+      <w:pPr>
         <w:spacing w:after="240"/>
       </w:pPr>
-    </w:p>
-    <w:p>
-      <w:pPr>
-        <w:spacing w:after="240"/>
-      </w:pPr>
-      <w:r>
-        <w:br w:type="page"/>
-      </w:r>
     </w:p>
     <w:sdt>
       <w:sdtPr>
@@ -1478,14 +1520,13 @@
       </w:sdtPr>
       <w:sdtEndPr>
         <w:rPr>
-          <w:b/>
-          <w:bCs/>
           <w:noProof/>
         </w:rPr>
       </w:sdtEndPr>
       <w:sdtContent>
         <w:p>
           <w:pPr>
+            <w:spacing w:line="276" w:lineRule="auto"/>
             <w:rPr>
               <w:b/>
               <w:bCs/>
@@ -1506,7 +1547,7 @@
         <w:p>
           <w:pPr>
             <w:pStyle w:val="TOC1"/>
-            <w:spacing w:after="0" w:line="360" w:lineRule="auto"/>
+            <w:spacing w:before="240" w:line="276" w:lineRule="auto"/>
             <w:rPr>
               <w:rFonts w:asciiTheme="minorHAnsi" w:eastAsiaTheme="minorEastAsia" w:hAnsiTheme="minorHAnsi"/>
               <w:noProof/>
@@ -1521,7 +1562,7 @@
           <w:r>
             <w:fldChar w:fldCharType="separate"/>
           </w:r>
-          <w:hyperlink w:anchor="_Toc231250007" w:history="1">
+          <w:hyperlink w:anchor="_Toc232711217" w:history="1">
             <w:r>
               <w:rPr>
                 <w:rStyle w:val="Hyperlink"/>
@@ -1548,7 +1589,7 @@
                 <w:noProof/>
                 <w:webHidden/>
               </w:rPr>
-              <w:instrText xml:space="preserve"> PAGEREF _Toc231250007 \h </w:instrText>
+              <w:instrText xml:space="preserve"> PAGEREF _Toc232711217 \h </w:instrText>
             </w:r>
             <w:r>
               <w:rPr>
@@ -1582,13 +1623,13 @@
         <w:p>
           <w:pPr>
             <w:pStyle w:val="TOC1"/>
-            <w:spacing w:before="0" w:after="0" w:line="360" w:lineRule="auto"/>
+            <w:spacing w:line="276" w:lineRule="auto"/>
             <w:rPr>
               <w:rFonts w:asciiTheme="minorHAnsi" w:eastAsiaTheme="minorEastAsia" w:hAnsiTheme="minorHAnsi"/>
               <w:noProof/>
             </w:rPr>
           </w:pPr>
-          <w:hyperlink w:anchor="_Toc231250008" w:history="1">
+          <w:hyperlink w:anchor="_Toc232711218" w:history="1">
             <w:r>
               <w:rPr>
                 <w:rStyle w:val="Hyperlink"/>
@@ -1615,7 +1656,7 @@
                 <w:noProof/>
                 <w:webHidden/>
               </w:rPr>
-              <w:instrText xml:space="preserve"> PAGEREF _Toc231250008 \h </w:instrText>
+              <w:instrText xml:space="preserve"> PAGEREF _Toc232711218 \h </w:instrText>
             </w:r>
             <w:r>
               <w:rPr>
@@ -1649,13 +1690,13 @@
         <w:p>
           <w:pPr>
             <w:pStyle w:val="TOC1"/>
-            <w:spacing w:before="0" w:after="0" w:line="360" w:lineRule="auto"/>
+            <w:spacing w:line="276" w:lineRule="auto"/>
             <w:rPr>
               <w:rFonts w:asciiTheme="minorHAnsi" w:eastAsiaTheme="minorEastAsia" w:hAnsiTheme="minorHAnsi"/>
               <w:noProof/>
             </w:rPr>
           </w:pPr>
-          <w:hyperlink w:anchor="_Toc231250009" w:history="1">
+          <w:hyperlink w:anchor="_Toc232711219" w:history="1">
             <w:r>
               <w:rPr>
                 <w:rStyle w:val="Hyperlink"/>
@@ -1682,7 +1723,7 @@
                 <w:noProof/>
                 <w:webHidden/>
               </w:rPr>
-              <w:instrText xml:space="preserve"> PAGEREF _Toc231250009 \h </w:instrText>
+              <w:instrText xml:space="preserve"> PAGEREF _Toc232711219 \h </w:instrText>
             </w:r>
             <w:r>
               <w:rPr>
@@ -1719,13 +1760,13 @@
             <w:tabs>
               <w:tab w:val="right" w:leader="dot" w:pos="9016"/>
             </w:tabs>
-            <w:spacing w:after="0" w:line="360" w:lineRule="auto"/>
+            <w:spacing w:line="276" w:lineRule="auto"/>
             <w:rPr>
               <w:rFonts w:asciiTheme="minorHAnsi" w:eastAsiaTheme="minorEastAsia" w:hAnsiTheme="minorHAnsi"/>
               <w:noProof/>
             </w:rPr>
           </w:pPr>
-          <w:hyperlink w:anchor="_Toc231250010" w:history="1">
+          <w:hyperlink w:anchor="_Toc232711220" w:history="1">
             <w:r>
               <w:rPr>
                 <w:rStyle w:val="Hyperlink"/>
@@ -1752,7 +1793,7 @@
                 <w:noProof/>
                 <w:webHidden/>
               </w:rPr>
-              <w:instrText xml:space="preserve"> PAGEREF _Toc231250010 \h </w:instrText>
+              <w:instrText xml:space="preserve"> PAGEREF _Toc232711220 \h </w:instrText>
             </w:r>
             <w:r>
               <w:rPr>
@@ -1789,13 +1830,13 @@
             <w:tabs>
               <w:tab w:val="right" w:leader="dot" w:pos="9016"/>
             </w:tabs>
-            <w:spacing w:after="0" w:line="360" w:lineRule="auto"/>
+            <w:spacing w:line="276" w:lineRule="auto"/>
             <w:rPr>
               <w:rFonts w:asciiTheme="minorHAnsi" w:eastAsiaTheme="minorEastAsia" w:hAnsiTheme="minorHAnsi"/>
               <w:noProof/>
             </w:rPr>
           </w:pPr>
-          <w:hyperlink w:anchor="_Toc231250011" w:history="1">
+          <w:hyperlink w:anchor="_Toc232711221" w:history="1">
             <w:r>
               <w:rPr>
                 <w:rStyle w:val="Hyperlink"/>
@@ -1822,7 +1863,7 @@
                 <w:noProof/>
                 <w:webHidden/>
               </w:rPr>
-              <w:instrText xml:space="preserve"> PAGEREF _Toc231250011 \h </w:instrText>
+              <w:instrText xml:space="preserve"> PAGEREF _Toc232711221 \h </w:instrText>
             </w:r>
             <w:r>
               <w:rPr>
@@ -1859,13 +1900,13 @@
             <w:tabs>
               <w:tab w:val="right" w:leader="dot" w:pos="9016"/>
             </w:tabs>
-            <w:spacing w:after="0" w:line="360" w:lineRule="auto"/>
+            <w:spacing w:line="276" w:lineRule="auto"/>
             <w:rPr>
               <w:rFonts w:asciiTheme="minorHAnsi" w:eastAsiaTheme="minorEastAsia" w:hAnsiTheme="minorHAnsi"/>
               <w:noProof/>
             </w:rPr>
           </w:pPr>
-          <w:hyperlink w:anchor="_Toc231250012" w:history="1">
+          <w:hyperlink w:anchor="_Toc232711222" w:history="1">
             <w:r>
               <w:rPr>
                 <w:rStyle w:val="Hyperlink"/>
@@ -1892,7 +1933,7 @@
                 <w:noProof/>
                 <w:webHidden/>
               </w:rPr>
-              <w:instrText xml:space="preserve"> PAGEREF _Toc231250012 \h </w:instrText>
+              <w:instrText xml:space="preserve"> PAGEREF _Toc232711222 \h </w:instrText>
             </w:r>
             <w:r>
               <w:rPr>
@@ -1926,13 +1967,13 @@
         <w:p>
           <w:pPr>
             <w:pStyle w:val="TOC1"/>
-            <w:spacing w:before="0" w:after="0" w:line="360" w:lineRule="auto"/>
+            <w:spacing w:line="276" w:lineRule="auto"/>
             <w:rPr>
               <w:rFonts w:asciiTheme="minorHAnsi" w:eastAsiaTheme="minorEastAsia" w:hAnsiTheme="minorHAnsi"/>
               <w:noProof/>
             </w:rPr>
           </w:pPr>
-          <w:hyperlink w:anchor="_Toc231250013" w:history="1">
+          <w:hyperlink w:anchor="_Toc232711223" w:history="1">
             <w:r>
               <w:rPr>
                 <w:rStyle w:val="Hyperlink"/>
@@ -1959,7 +2000,7 @@
                 <w:noProof/>
                 <w:webHidden/>
               </w:rPr>
-              <w:instrText xml:space="preserve"> PAGEREF _Toc231250013 \h </w:instrText>
+              <w:instrText xml:space="preserve"> PAGEREF _Toc232711223 \h </w:instrText>
             </w:r>
             <w:r>
               <w:rPr>
@@ -1993,13 +2034,13 @@
         <w:p>
           <w:pPr>
             <w:pStyle w:val="TOC1"/>
-            <w:spacing w:before="0" w:after="0" w:line="360" w:lineRule="auto"/>
+            <w:spacing w:line="276" w:lineRule="auto"/>
             <w:rPr>
               <w:rFonts w:asciiTheme="minorHAnsi" w:eastAsiaTheme="minorEastAsia" w:hAnsiTheme="minorHAnsi"/>
               <w:noProof/>
             </w:rPr>
           </w:pPr>
-          <w:hyperlink w:anchor="_Toc231250014" w:history="1">
+          <w:hyperlink w:anchor="_Toc232711224" w:history="1">
             <w:r>
               <w:rPr>
                 <w:rStyle w:val="Hyperlink"/>
@@ -2026,7 +2067,7 @@
                 <w:noProof/>
                 <w:webHidden/>
               </w:rPr>
-              <w:instrText xml:space="preserve"> PAGEREF _Toc231250014 \h </w:instrText>
+              <w:instrText xml:space="preserve"> PAGEREF _Toc232711224 \h </w:instrText>
             </w:r>
             <w:r>
               <w:rPr>
@@ -2063,13 +2104,13 @@
             <w:tabs>
               <w:tab w:val="right" w:leader="dot" w:pos="9016"/>
             </w:tabs>
-            <w:spacing w:after="0" w:line="360" w:lineRule="auto"/>
+            <w:spacing w:line="276" w:lineRule="auto"/>
             <w:rPr>
               <w:rFonts w:asciiTheme="minorHAnsi" w:eastAsiaTheme="minorEastAsia" w:hAnsiTheme="minorHAnsi"/>
               <w:noProof/>
             </w:rPr>
           </w:pPr>
-          <w:hyperlink w:anchor="_Toc231250015" w:history="1">
+          <w:hyperlink w:anchor="_Toc232711225" w:history="1">
             <w:r>
               <w:rPr>
                 <w:rStyle w:val="Hyperlink"/>
@@ -2096,7 +2137,7 @@
                 <w:noProof/>
                 <w:webHidden/>
               </w:rPr>
-              <w:instrText xml:space="preserve"> PAGEREF _Toc231250015 \h </w:instrText>
+              <w:instrText xml:space="preserve"> PAGEREF _Toc232711225 \h </w:instrText>
             </w:r>
             <w:r>
               <w:rPr>
@@ -2133,13 +2174,13 @@
             <w:tabs>
               <w:tab w:val="right" w:leader="dot" w:pos="9016"/>
             </w:tabs>
-            <w:spacing w:after="0" w:line="360" w:lineRule="auto"/>
+            <w:spacing w:line="276" w:lineRule="auto"/>
             <w:rPr>
               <w:rFonts w:asciiTheme="minorHAnsi" w:eastAsiaTheme="minorEastAsia" w:hAnsiTheme="minorHAnsi"/>
               <w:noProof/>
             </w:rPr>
           </w:pPr>
-          <w:hyperlink w:anchor="_Toc231250016" w:history="1">
+          <w:hyperlink w:anchor="_Toc232711226" w:history="1">
             <w:r>
               <w:rPr>
                 <w:rStyle w:val="Hyperlink"/>
@@ -2166,7 +2207,7 @@
                 <w:noProof/>
                 <w:webHidden/>
               </w:rPr>
-              <w:instrText xml:space="preserve"> PAGEREF _Toc231250016 \h </w:instrText>
+              <w:instrText xml:space="preserve"> PAGEREF _Toc232711226 \h </w:instrText>
             </w:r>
             <w:r>
               <w:rPr>
@@ -2203,13 +2244,13 @@
             <w:tabs>
               <w:tab w:val="right" w:leader="dot" w:pos="9016"/>
             </w:tabs>
-            <w:spacing w:after="0" w:line="360" w:lineRule="auto"/>
+            <w:spacing w:line="276" w:lineRule="auto"/>
             <w:rPr>
               <w:rFonts w:asciiTheme="minorHAnsi" w:eastAsiaTheme="minorEastAsia" w:hAnsiTheme="minorHAnsi"/>
               <w:noProof/>
             </w:rPr>
           </w:pPr>
-          <w:hyperlink w:anchor="_Toc231250017" w:history="1">
+          <w:hyperlink w:anchor="_Toc232711227" w:history="1">
             <w:r>
               <w:rPr>
                 <w:rStyle w:val="Hyperlink"/>
@@ -2236,7 +2277,7 @@
                 <w:noProof/>
                 <w:webHidden/>
               </w:rPr>
-              <w:instrText xml:space="preserve"> PAGEREF _Toc231250017 \h </w:instrText>
+              <w:instrText xml:space="preserve"> PAGEREF _Toc232711227 \h </w:instrText>
             </w:r>
             <w:r>
               <w:rPr>
@@ -2270,13 +2311,13 @@
         <w:p>
           <w:pPr>
             <w:pStyle w:val="TOC1"/>
-            <w:spacing w:before="0" w:after="0" w:line="360" w:lineRule="auto"/>
+            <w:spacing w:line="276" w:lineRule="auto"/>
             <w:rPr>
               <w:rFonts w:asciiTheme="minorHAnsi" w:eastAsiaTheme="minorEastAsia" w:hAnsiTheme="minorHAnsi"/>
               <w:noProof/>
             </w:rPr>
           </w:pPr>
-          <w:hyperlink w:anchor="_Toc231250018" w:history="1">
+          <w:hyperlink w:anchor="_Toc232711228" w:history="1">
             <w:r>
               <w:rPr>
                 <w:rStyle w:val="Hyperlink"/>
@@ -2303,7 +2344,7 @@
                 <w:noProof/>
                 <w:webHidden/>
               </w:rPr>
-              <w:instrText xml:space="preserve"> PAGEREF _Toc231250018 \h </w:instrText>
+              <w:instrText xml:space="preserve"> PAGEREF _Toc232711228 \h </w:instrText>
             </w:r>
             <w:r>
               <w:rPr>
@@ -2337,13 +2378,13 @@
         <w:p>
           <w:pPr>
             <w:pStyle w:val="TOC1"/>
-            <w:spacing w:before="0" w:after="0" w:line="360" w:lineRule="auto"/>
+            <w:spacing w:line="276" w:lineRule="auto"/>
             <w:rPr>
               <w:rFonts w:asciiTheme="minorHAnsi" w:eastAsiaTheme="minorEastAsia" w:hAnsiTheme="minorHAnsi"/>
               <w:noProof/>
             </w:rPr>
           </w:pPr>
-          <w:hyperlink w:anchor="_Toc231250019" w:history="1">
+          <w:hyperlink w:anchor="_Toc232711229" w:history="1">
             <w:r>
               <w:rPr>
                 <w:rStyle w:val="Hyperlink"/>
@@ -2370,7 +2411,7 @@
                 <w:noProof/>
                 <w:webHidden/>
               </w:rPr>
-              <w:instrText xml:space="preserve"> PAGEREF _Toc231250019 \h </w:instrText>
+              <w:instrText xml:space="preserve"> PAGEREF _Toc232711229 \h </w:instrText>
             </w:r>
             <w:r>
               <w:rPr>
@@ -2407,13 +2448,13 @@
             <w:tabs>
               <w:tab w:val="right" w:leader="dot" w:pos="9016"/>
             </w:tabs>
-            <w:spacing w:after="0" w:line="360" w:lineRule="auto"/>
+            <w:spacing w:line="276" w:lineRule="auto"/>
             <w:rPr>
               <w:rFonts w:asciiTheme="minorHAnsi" w:eastAsiaTheme="minorEastAsia" w:hAnsiTheme="minorHAnsi"/>
               <w:noProof/>
             </w:rPr>
           </w:pPr>
-          <w:hyperlink w:anchor="_Toc231250020" w:history="1">
+          <w:hyperlink w:anchor="_Toc232711230" w:history="1">
             <w:r>
               <w:rPr>
                 <w:rStyle w:val="Hyperlink"/>
@@ -2440,7 +2481,7 @@
                 <w:noProof/>
                 <w:webHidden/>
               </w:rPr>
-              <w:instrText xml:space="preserve"> PAGEREF _Toc231250020 \h </w:instrText>
+              <w:instrText xml:space="preserve"> PAGEREF _Toc232711230 \h </w:instrText>
             </w:r>
             <w:r>
               <w:rPr>
@@ -2477,13 +2518,13 @@
             <w:tabs>
               <w:tab w:val="right" w:leader="dot" w:pos="9016"/>
             </w:tabs>
-            <w:spacing w:after="0" w:line="360" w:lineRule="auto"/>
+            <w:spacing w:line="276" w:lineRule="auto"/>
             <w:rPr>
               <w:rFonts w:asciiTheme="minorHAnsi" w:eastAsiaTheme="minorEastAsia" w:hAnsiTheme="minorHAnsi"/>
               <w:noProof/>
             </w:rPr>
           </w:pPr>
-          <w:hyperlink w:anchor="_Toc231250021" w:history="1">
+          <w:hyperlink w:anchor="_Toc232711231" w:history="1">
             <w:r>
               <w:rPr>
                 <w:rStyle w:val="Hyperlink"/>
@@ -2510,7 +2551,7 @@
                 <w:noProof/>
                 <w:webHidden/>
               </w:rPr>
-              <w:instrText xml:space="preserve"> PAGEREF _Toc231250021 \h </w:instrText>
+              <w:instrText xml:space="preserve"> PAGEREF _Toc232711231 \h </w:instrText>
             </w:r>
             <w:r>
               <w:rPr>
@@ -2547,13 +2588,13 @@
             <w:tabs>
               <w:tab w:val="right" w:leader="dot" w:pos="9016"/>
             </w:tabs>
-            <w:spacing w:after="0" w:line="360" w:lineRule="auto"/>
+            <w:spacing w:line="276" w:lineRule="auto"/>
             <w:rPr>
               <w:rFonts w:asciiTheme="minorHAnsi" w:eastAsiaTheme="minorEastAsia" w:hAnsiTheme="minorHAnsi"/>
               <w:noProof/>
             </w:rPr>
           </w:pPr>
-          <w:hyperlink w:anchor="_Toc231250022" w:history="1">
+          <w:hyperlink w:anchor="_Toc232711232" w:history="1">
             <w:r>
               <w:rPr>
                 <w:rStyle w:val="Hyperlink"/>
@@ -2580,7 +2621,7 @@
                 <w:noProof/>
                 <w:webHidden/>
               </w:rPr>
-              <w:instrText xml:space="preserve"> PAGEREF _Toc231250022 \h </w:instrText>
+              <w:instrText xml:space="preserve"> PAGEREF _Toc232711232 \h </w:instrText>
             </w:r>
             <w:r>
               <w:rPr>
@@ -2617,13 +2658,13 @@
             <w:tabs>
               <w:tab w:val="right" w:leader="dot" w:pos="9016"/>
             </w:tabs>
-            <w:spacing w:after="0" w:line="360" w:lineRule="auto"/>
+            <w:spacing w:line="276" w:lineRule="auto"/>
             <w:rPr>
               <w:rFonts w:asciiTheme="minorHAnsi" w:eastAsiaTheme="minorEastAsia" w:hAnsiTheme="minorHAnsi"/>
               <w:noProof/>
             </w:rPr>
           </w:pPr>
-          <w:hyperlink w:anchor="_Toc231250023" w:history="1">
+          <w:hyperlink w:anchor="_Toc232711233" w:history="1">
             <w:r>
               <w:rPr>
                 <w:rStyle w:val="Hyperlink"/>
@@ -2650,7 +2691,7 @@
                 <w:noProof/>
                 <w:webHidden/>
               </w:rPr>
-              <w:instrText xml:space="preserve"> PAGEREF _Toc231250023 \h </w:instrText>
+              <w:instrText xml:space="preserve"> PAGEREF _Toc232711233 \h </w:instrText>
             </w:r>
             <w:r>
               <w:rPr>
@@ -2684,13 +2725,13 @@
         <w:p>
           <w:pPr>
             <w:pStyle w:val="TOC1"/>
-            <w:spacing w:before="0" w:after="0" w:line="360" w:lineRule="auto"/>
+            <w:spacing w:line="276" w:lineRule="auto"/>
             <w:rPr>
               <w:rFonts w:asciiTheme="minorHAnsi" w:eastAsiaTheme="minorEastAsia" w:hAnsiTheme="minorHAnsi"/>
               <w:noProof/>
             </w:rPr>
           </w:pPr>
-          <w:hyperlink w:anchor="_Toc231250024" w:history="1">
+          <w:hyperlink w:anchor="_Toc232711234" w:history="1">
             <w:r>
               <w:rPr>
                 <w:rStyle w:val="Hyperlink"/>
@@ -2717,7 +2758,7 @@
                 <w:noProof/>
                 <w:webHidden/>
               </w:rPr>
-              <w:instrText xml:space="preserve"> PAGEREF _Toc231250024 \h </w:instrText>
+              <w:instrText xml:space="preserve"> PAGEREF _Toc232711234 \h </w:instrText>
             </w:r>
             <w:r>
               <w:rPr>
@@ -2754,13 +2795,13 @@
             <w:tabs>
               <w:tab w:val="right" w:leader="dot" w:pos="9016"/>
             </w:tabs>
-            <w:spacing w:after="0" w:line="360" w:lineRule="auto"/>
+            <w:spacing w:line="276" w:lineRule="auto"/>
             <w:rPr>
               <w:rFonts w:asciiTheme="minorHAnsi" w:eastAsiaTheme="minorEastAsia" w:hAnsiTheme="minorHAnsi"/>
               <w:noProof/>
             </w:rPr>
           </w:pPr>
-          <w:hyperlink w:anchor="_Toc231250025" w:history="1">
+          <w:hyperlink w:anchor="_Toc232711235" w:history="1">
             <w:r>
               <w:rPr>
                 <w:rStyle w:val="Hyperlink"/>
@@ -2787,7 +2828,7 @@
                 <w:noProof/>
                 <w:webHidden/>
               </w:rPr>
-              <w:instrText xml:space="preserve"> PAGEREF _Toc231250025 \h </w:instrText>
+              <w:instrText xml:space="preserve"> PAGEREF _Toc232711235 \h </w:instrText>
             </w:r>
             <w:r>
               <w:rPr>
@@ -2824,13 +2865,13 @@
             <w:tabs>
               <w:tab w:val="right" w:leader="dot" w:pos="9016"/>
             </w:tabs>
-            <w:spacing w:after="0" w:line="360" w:lineRule="auto"/>
+            <w:spacing w:line="276" w:lineRule="auto"/>
             <w:rPr>
               <w:rFonts w:asciiTheme="minorHAnsi" w:eastAsiaTheme="minorEastAsia" w:hAnsiTheme="minorHAnsi"/>
               <w:noProof/>
             </w:rPr>
           </w:pPr>
-          <w:hyperlink w:anchor="_Toc231250026" w:history="1">
+          <w:hyperlink w:anchor="_Toc232711236" w:history="1">
             <w:r>
               <w:rPr>
                 <w:rStyle w:val="Hyperlink"/>
@@ -2857,7 +2898,7 @@
                 <w:noProof/>
                 <w:webHidden/>
               </w:rPr>
-              <w:instrText xml:space="preserve"> PAGEREF _Toc231250026 \h </w:instrText>
+              <w:instrText xml:space="preserve"> PAGEREF _Toc232711236 \h </w:instrText>
             </w:r>
             <w:r>
               <w:rPr>
@@ -2894,13 +2935,13 @@
             <w:tabs>
               <w:tab w:val="right" w:leader="dot" w:pos="9016"/>
             </w:tabs>
-            <w:spacing w:after="0" w:line="360" w:lineRule="auto"/>
+            <w:spacing w:line="276" w:lineRule="auto"/>
             <w:rPr>
               <w:rFonts w:asciiTheme="minorHAnsi" w:eastAsiaTheme="minorEastAsia" w:hAnsiTheme="minorHAnsi"/>
               <w:noProof/>
             </w:rPr>
           </w:pPr>
-          <w:hyperlink w:anchor="_Toc231250027" w:history="1">
+          <w:hyperlink w:anchor="_Toc232711237" w:history="1">
             <w:r>
               <w:rPr>
                 <w:rStyle w:val="Hyperlink"/>
@@ -2927,7 +2968,7 @@
                 <w:noProof/>
                 <w:webHidden/>
               </w:rPr>
-              <w:instrText xml:space="preserve"> PAGEREF _Toc231250027 \h </w:instrText>
+              <w:instrText xml:space="preserve"> PAGEREF _Toc232711237 \h </w:instrText>
             </w:r>
             <w:r>
               <w:rPr>
@@ -2961,13 +3002,13 @@
         <w:p>
           <w:pPr>
             <w:pStyle w:val="TOC1"/>
-            <w:spacing w:before="0" w:after="0" w:line="360" w:lineRule="auto"/>
+            <w:spacing w:line="276" w:lineRule="auto"/>
             <w:rPr>
               <w:rFonts w:asciiTheme="minorHAnsi" w:eastAsiaTheme="minorEastAsia" w:hAnsiTheme="minorHAnsi"/>
               <w:noProof/>
             </w:rPr>
           </w:pPr>
-          <w:hyperlink w:anchor="_Toc231250028" w:history="1">
+          <w:hyperlink w:anchor="_Toc232711238" w:history="1">
             <w:r>
               <w:rPr>
                 <w:rStyle w:val="Hyperlink"/>
@@ -2994,7 +3035,7 @@
                 <w:noProof/>
                 <w:webHidden/>
               </w:rPr>
-              <w:instrText xml:space="preserve"> PAGEREF _Toc231250028 \h </w:instrText>
+              <w:instrText xml:space="preserve"> PAGEREF _Toc232711238 \h </w:instrText>
             </w:r>
             <w:r>
               <w:rPr>
@@ -3028,13 +3069,13 @@
         <w:p>
           <w:pPr>
             <w:pStyle w:val="TOC1"/>
-            <w:spacing w:before="0" w:after="0" w:line="360" w:lineRule="auto"/>
+            <w:spacing w:line="276" w:lineRule="auto"/>
             <w:rPr>
               <w:rFonts w:asciiTheme="minorHAnsi" w:eastAsiaTheme="minorEastAsia" w:hAnsiTheme="minorHAnsi"/>
               <w:noProof/>
             </w:rPr>
           </w:pPr>
-          <w:hyperlink w:anchor="_Toc231250029" w:history="1">
+          <w:hyperlink w:anchor="_Toc232711239" w:history="1">
             <w:r>
               <w:rPr>
                 <w:rStyle w:val="Hyperlink"/>
@@ -3061,7 +3102,7 @@
                 <w:noProof/>
                 <w:webHidden/>
               </w:rPr>
-              <w:instrText xml:space="preserve"> PAGEREF _Toc231250029 \h </w:instrText>
+              <w:instrText xml:space="preserve"> PAGEREF _Toc232711239 \h </w:instrText>
             </w:r>
             <w:r>
               <w:rPr>
@@ -3098,13 +3139,13 @@
             <w:tabs>
               <w:tab w:val="right" w:leader="dot" w:pos="9016"/>
             </w:tabs>
-            <w:spacing w:after="0" w:line="360" w:lineRule="auto"/>
+            <w:spacing w:line="276" w:lineRule="auto"/>
             <w:rPr>
               <w:rFonts w:asciiTheme="minorHAnsi" w:eastAsiaTheme="minorEastAsia" w:hAnsiTheme="minorHAnsi"/>
               <w:noProof/>
             </w:rPr>
           </w:pPr>
-          <w:hyperlink w:anchor="_Toc231250030" w:history="1">
+          <w:hyperlink w:anchor="_Toc232711240" w:history="1">
             <w:r>
               <w:rPr>
                 <w:rStyle w:val="Hyperlink"/>
@@ -3131,7 +3172,7 @@
                 <w:noProof/>
                 <w:webHidden/>
               </w:rPr>
-              <w:instrText xml:space="preserve"> PAGEREF _Toc231250030 \h </w:instrText>
+              <w:instrText xml:space="preserve"> PAGEREF _Toc232711240 \h </w:instrText>
             </w:r>
             <w:r>
               <w:rPr>
@@ -3168,13 +3209,13 @@
             <w:tabs>
               <w:tab w:val="right" w:leader="dot" w:pos="9016"/>
             </w:tabs>
-            <w:spacing w:after="0" w:line="360" w:lineRule="auto"/>
+            <w:spacing w:line="276" w:lineRule="auto"/>
             <w:rPr>
               <w:rFonts w:asciiTheme="minorHAnsi" w:eastAsiaTheme="minorEastAsia" w:hAnsiTheme="minorHAnsi"/>
               <w:noProof/>
             </w:rPr>
           </w:pPr>
-          <w:hyperlink w:anchor="_Toc231250031" w:history="1">
+          <w:hyperlink w:anchor="_Toc232711241" w:history="1">
             <w:r>
               <w:rPr>
                 <w:rStyle w:val="Hyperlink"/>
@@ -3201,7 +3242,7 @@
                 <w:noProof/>
                 <w:webHidden/>
               </w:rPr>
-              <w:instrText xml:space="preserve"> PAGEREF _Toc231250031 \h </w:instrText>
+              <w:instrText xml:space="preserve"> PAGEREF _Toc232711241 \h </w:instrText>
             </w:r>
             <w:r>
               <w:rPr>
@@ -3238,13 +3279,13 @@
             <w:tabs>
               <w:tab w:val="right" w:leader="dot" w:pos="9016"/>
             </w:tabs>
-            <w:spacing w:after="0" w:line="360" w:lineRule="auto"/>
+            <w:spacing w:line="276" w:lineRule="auto"/>
             <w:rPr>
               <w:rFonts w:asciiTheme="minorHAnsi" w:eastAsiaTheme="minorEastAsia" w:hAnsiTheme="minorHAnsi"/>
               <w:noProof/>
             </w:rPr>
           </w:pPr>
-          <w:hyperlink w:anchor="_Toc231250032" w:history="1">
+          <w:hyperlink w:anchor="_Toc232711242" w:history="1">
             <w:r>
               <w:rPr>
                 <w:rStyle w:val="Hyperlink"/>
@@ -3271,7 +3312,7 @@
                 <w:noProof/>
                 <w:webHidden/>
               </w:rPr>
-              <w:instrText xml:space="preserve"> PAGEREF _Toc231250032 \h </w:instrText>
+              <w:instrText xml:space="preserve"> PAGEREF _Toc232711242 \h </w:instrText>
             </w:r>
             <w:r>
               <w:rPr>
@@ -3308,13 +3349,13 @@
             <w:tabs>
               <w:tab w:val="right" w:leader="dot" w:pos="9016"/>
             </w:tabs>
-            <w:spacing w:after="0" w:line="360" w:lineRule="auto"/>
+            <w:spacing w:line="276" w:lineRule="auto"/>
             <w:rPr>
               <w:rFonts w:asciiTheme="minorHAnsi" w:eastAsiaTheme="minorEastAsia" w:hAnsiTheme="minorHAnsi"/>
               <w:noProof/>
             </w:rPr>
           </w:pPr>
-          <w:hyperlink w:anchor="_Toc231250033" w:history="1">
+          <w:hyperlink w:anchor="_Toc232711243" w:history="1">
             <w:r>
               <w:rPr>
                 <w:rStyle w:val="Hyperlink"/>
@@ -3341,7 +3382,7 @@
                 <w:noProof/>
                 <w:webHidden/>
               </w:rPr>
-              <w:instrText xml:space="preserve"> PAGEREF _Toc231250033 \h </w:instrText>
+              <w:instrText xml:space="preserve"> PAGEREF _Toc232711243 \h </w:instrText>
             </w:r>
             <w:r>
               <w:rPr>
@@ -3375,13 +3416,13 @@
         <w:p>
           <w:pPr>
             <w:pStyle w:val="TOC1"/>
-            <w:spacing w:before="0" w:after="0" w:line="360" w:lineRule="auto"/>
+            <w:spacing w:line="276" w:lineRule="auto"/>
             <w:rPr>
               <w:rFonts w:asciiTheme="minorHAnsi" w:eastAsiaTheme="minorEastAsia" w:hAnsiTheme="minorHAnsi"/>
               <w:noProof/>
             </w:rPr>
           </w:pPr>
-          <w:hyperlink w:anchor="_Toc231250034" w:history="1">
+          <w:hyperlink w:anchor="_Toc232711244" w:history="1">
             <w:r>
               <w:rPr>
                 <w:rStyle w:val="Hyperlink"/>
@@ -3408,7 +3449,7 @@
                 <w:noProof/>
                 <w:webHidden/>
               </w:rPr>
-              <w:instrText xml:space="preserve"> PAGEREF _Toc231250034 \h </w:instrText>
+              <w:instrText xml:space="preserve"> PAGEREF _Toc232711244 \h </w:instrText>
             </w:r>
             <w:r>
               <w:rPr>
@@ -3442,14 +3483,81 @@
         <w:p>
           <w:pPr>
             <w:pStyle w:val="TOC1"/>
-            <w:spacing w:before="0" w:after="0" w:line="360" w:lineRule="auto"/>
+            <w:spacing w:line="276" w:lineRule="auto"/>
+            <w:rPr>
+              <w:rFonts w:asciiTheme="minorHAnsi" w:eastAsiaTheme="minorEastAsia" w:hAnsiTheme="minorHAnsi"/>
+              <w:noProof/>
+            </w:rPr>
           </w:pPr>
-          <w:hyperlink w:anchor="_Toc231250035" w:history="1">
+          <w:hyperlink w:anchor="_Toc232711245" w:history="1">
             <w:r>
               <w:rPr>
                 <w:rStyle w:val="Hyperlink"/>
                 <w:noProof/>
               </w:rPr>
+              <w:t>Acknowledgement</w:t>
+            </w:r>
+            <w:r>
+              <w:rPr>
+                <w:noProof/>
+                <w:webHidden/>
+              </w:rPr>
+              <w:tab/>
+            </w:r>
+            <w:r>
+              <w:rPr>
+                <w:noProof/>
+                <w:webHidden/>
+              </w:rPr>
+              <w:fldChar w:fldCharType="begin"/>
+            </w:r>
+            <w:r>
+              <w:rPr>
+                <w:noProof/>
+                <w:webHidden/>
+              </w:rPr>
+              <w:instrText xml:space="preserve"> PAGEREF _Toc232711245 \h </w:instrText>
+            </w:r>
+            <w:r>
+              <w:rPr>
+                <w:noProof/>
+                <w:webHidden/>
+              </w:rPr>
+            </w:r>
+            <w:r>
+              <w:rPr>
+                <w:noProof/>
+                <w:webHidden/>
+              </w:rPr>
+              <w:fldChar w:fldCharType="separate"/>
+            </w:r>
+            <w:r>
+              <w:rPr>
+                <w:noProof/>
+                <w:webHidden/>
+              </w:rPr>
+              <w:t>22</w:t>
+            </w:r>
+            <w:r>
+              <w:rPr>
+                <w:noProof/>
+                <w:webHidden/>
+              </w:rPr>
+              <w:fldChar w:fldCharType="end"/>
+            </w:r>
+          </w:hyperlink>
+        </w:p>
+        <w:p>
+          <w:pPr>
+            <w:pStyle w:val="TOC1"/>
+            <w:spacing w:line="276" w:lineRule="auto"/>
+          </w:pPr>
+          <w:hyperlink w:anchor="_Toc232711246" w:history="1">
+            <w:r>
+              <w:rPr>
+                <w:rStyle w:val="Hyperlink"/>
+                <w:noProof/>
+              </w:rPr>
               <w:t>References</w:t>
             </w:r>
             <w:r>
@@ -3471,7 +3579,7 @@
                 <w:noProof/>
                 <w:webHidden/>
               </w:rPr>
-              <w:instrText xml:space="preserve"> PAGEREF _Toc231250035 \h </w:instrText>
+              <w:instrText xml:space="preserve"> PAGEREF _Toc232711246 \h </w:instrText>
             </w:r>
             <w:r>
               <w:rPr>
@@ -3491,7 +3599,7 @@
                 <w:noProof/>
                 <w:webHidden/>
               </w:rPr>
-              <w:t>22</w:t>
+              <w:t>23</w:t>
             </w:r>
             <w:r>
               <w:rPr>
@@ -3503,8 +3611,6 @@
           </w:hyperlink>
           <w:r>
             <w:rPr>
-              <w:b/>
-              <w:bCs/>
               <w:noProof/>
             </w:rPr>
             <w:fldChar w:fldCharType="end"/>
@@ -3635,7 +3741,7 @@
             <w:noProof/>
             <w:webHidden/>
           </w:rPr>
-          <w:t>12</w:t>
+          <w:t>13</w:t>
         </w:r>
         <w:r>
           <w:rPr>
@@ -3705,7 +3811,7 @@
             <w:noProof/>
             <w:webHidden/>
           </w:rPr>
-          <w:t>12</w:t>
+          <w:t>13</w:t>
         </w:r>
         <w:r>
           <w:rPr>
@@ -3775,7 +3881,7 @@
             <w:noProof/>
             <w:webHidden/>
           </w:rPr>
-          <w:t>13</w:t>
+          <w:t>14</w:t>
         </w:r>
         <w:r>
           <w:rPr>
@@ -3845,7 +3951,7 @@
             <w:noProof/>
             <w:webHidden/>
           </w:rPr>
-          <w:t>13</w:t>
+          <w:t>14</w:t>
         </w:r>
         <w:r>
           <w:rPr>
@@ -3915,7 +4021,7 @@
             <w:noProof/>
             <w:webHidden/>
           </w:rPr>
-          <w:t>16</w:t>
+          <w:t>17</w:t>
         </w:r>
         <w:r>
           <w:rPr>
@@ -3985,7 +4091,7 @@
             <w:noProof/>
             <w:webHidden/>
           </w:rPr>
-          <w:t>17</w:t>
+          <w:t>18</w:t>
         </w:r>
         <w:r>
           <w:rPr>
@@ -4055,7 +4161,7 @@
             <w:noProof/>
             <w:webHidden/>
           </w:rPr>
-          <w:t>17</w:t>
+          <w:t>18</w:t>
         </w:r>
         <w:r>
           <w:rPr>
@@ -4125,7 +4231,7 @@
             <w:noProof/>
             <w:webHidden/>
           </w:rPr>
-          <w:t>18</w:t>
+          <w:t>19</w:t>
         </w:r>
         <w:r>
           <w:rPr>
@@ -4195,7 +4301,7 @@
             <w:noProof/>
             <w:webHidden/>
           </w:rPr>
-          <w:t>19</w:t>
+          <w:t>20</w:t>
         </w:r>
         <w:r>
           <w:rPr>
@@ -4205,6 +4311,39 @@
           <w:fldChar w:fldCharType="end"/>
         </w:r>
       </w:hyperlink>
+    </w:p>
+    <w:p>
+      <w:pPr>
+        <w:pStyle w:val="TableofFigures"/>
+        <w:tabs>
+          <w:tab w:val="right" w:leader="dot" w:pos="9016"/>
+        </w:tabs>
+        <w:spacing w:before="240" w:line="360" w:lineRule="auto"/>
+        <w:rPr>
+          <w:b/>
+          <w:bCs/>
+          <w:sz w:val="28"/>
+          <w:szCs w:val="28"/>
+        </w:rPr>
+      </w:pPr>
+      <w:r>
+        <w:rPr>
+          <w:b/>
+          <w:bCs/>
+          <w:sz w:val="28"/>
+          <w:szCs w:val="28"/>
+        </w:rPr>
+        <w:fldChar w:fldCharType="end"/>
+      </w:r>
+      <w:r>
+        <w:rPr>
+          <w:b/>
+          <w:bCs/>
+          <w:sz w:val="28"/>
+          <w:szCs w:val="28"/>
+        </w:rPr>
+        <w:t>List of Tables</w:t>
+      </w:r>
     </w:p>
     <w:p>
       <w:pPr>
@@ -4214,42 +4353,76 @@
         </w:tabs>
         <w:spacing w:line="360" w:lineRule="auto"/>
         <w:rPr>
-          <w:b/>
-          <w:bCs/>
-          <w:sz w:val="28"/>
-          <w:szCs w:val="28"/>
-        </w:rPr>
-      </w:pPr>
-      <w:r>
-        <w:rPr>
-          <w:b/>
-          <w:bCs/>
-          <w:sz w:val="28"/>
-          <w:szCs w:val="28"/>
-        </w:rPr>
-        <w:fldChar w:fldCharType="end"/>
-      </w:r>
-    </w:p>
-    <w:p>
-      <w:pPr>
-        <w:spacing w:before="240" w:line="360" w:lineRule="auto"/>
-        <w:jc w:val="left"/>
-        <w:rPr>
-          <w:b/>
-          <w:bCs/>
-          <w:sz w:val="28"/>
-          <w:szCs w:val="28"/>
-        </w:rPr>
-      </w:pPr>
-      <w:r>
-        <w:rPr>
-          <w:b/>
-          <w:bCs/>
-          <w:sz w:val="28"/>
-          <w:szCs w:val="28"/>
-        </w:rPr>
-        <w:t>List of Tables</w:t>
-      </w:r>
+          <w:rFonts w:asciiTheme="minorHAnsi" w:eastAsiaTheme="minorEastAsia" w:hAnsiTheme="minorHAnsi"/>
+          <w:noProof/>
+        </w:rPr>
+      </w:pPr>
+      <w:r>
+        <w:fldChar w:fldCharType="begin"/>
+      </w:r>
+      <w:r>
+        <w:instrText xml:space="preserve"> TOC \h \z \c "Table" </w:instrText>
+      </w:r>
+      <w:r>
+        <w:fldChar w:fldCharType="separate"/>
+      </w:r>
+      <w:hyperlink w:anchor="_Toc231250114" w:history="1">
+        <w:r>
+          <w:rPr>
+            <w:rStyle w:val="Hyperlink"/>
+            <w:noProof/>
+          </w:rPr>
+          <w:t>Table 1: Dataset attributes and descriptions.</w:t>
+        </w:r>
+        <w:r>
+          <w:rPr>
+            <w:noProof/>
+            <w:webHidden/>
+          </w:rPr>
+          <w:tab/>
+        </w:r>
+        <w:r>
+          <w:rPr>
+            <w:noProof/>
+            <w:webHidden/>
+          </w:rPr>
+          <w:fldChar w:fldCharType="begin"/>
+        </w:r>
+        <w:r>
+          <w:rPr>
+            <w:noProof/>
+            <w:webHidden/>
+          </w:rPr>
+          <w:instrText xml:space="preserve"> PAGEREF _Toc231250114 \h </w:instrText>
+        </w:r>
+        <w:r>
+          <w:rPr>
+            <w:noProof/>
+            <w:webHidden/>
+          </w:rPr>
+        </w:r>
+        <w:r>
+          <w:rPr>
+            <w:noProof/>
+            <w:webHidden/>
+          </w:rPr>
+          <w:fldChar w:fldCharType="separate"/>
+        </w:r>
+        <w:r>
+          <w:rPr>
+            <w:noProof/>
+            <w:webHidden/>
+          </w:rPr>
+          <w:t>9</w:t>
+        </w:r>
+        <w:r>
+          <w:rPr>
+            <w:noProof/>
+            <w:webHidden/>
+          </w:rPr>
+          <w:fldChar w:fldCharType="end"/>
+        </w:r>
+      </w:hyperlink>
     </w:p>
     <w:p>
       <w:pPr>
@@ -4263,22 +4436,13 @@
           <w:noProof/>
         </w:rPr>
       </w:pPr>
-      <w:r>
-        <w:fldChar w:fldCharType="begin"/>
-      </w:r>
-      <w:r>
-        <w:instrText xml:space="preserve"> TOC \h \z \c "Table" </w:instrText>
-      </w:r>
-      <w:r>
-        <w:fldChar w:fldCharType="separate"/>
-      </w:r>
-      <w:hyperlink w:anchor="_Toc231250114" w:history="1">
+      <w:hyperlink w:anchor="_Toc231250115" w:history="1">
         <w:r>
           <w:rPr>
             <w:rStyle w:val="Hyperlink"/>
             <w:noProof/>
           </w:rPr>
-          <w:t>Table 1: Dataset attributes and descriptions.</w:t>
+          <w:t>Table 2: Missing value counts by attribute before imputation.</w:t>
         </w:r>
         <w:r>
           <w:rPr>
@@ -4299,7 +4463,7 @@
             <w:noProof/>
             <w:webHidden/>
           </w:rPr>
-          <w:instrText xml:space="preserve"> PAGEREF _Toc231250114 \h </w:instrText>
+          <w:instrText xml:space="preserve"> PAGEREF _Toc231250115 \h </w:instrText>
         </w:r>
         <w:r>
           <w:rPr>
@@ -4319,7 +4483,7 @@
             <w:noProof/>
             <w:webHidden/>
           </w:rPr>
-          <w:t>8</w:t>
+          <w:t>10</w:t>
         </w:r>
         <w:r>
           <w:rPr>
@@ -4342,13 +4506,13 @@
           <w:noProof/>
         </w:rPr>
       </w:pPr>
-      <w:hyperlink w:anchor="_Toc231250115" w:history="1">
+      <w:hyperlink w:anchor="_Toc231250116" w:history="1">
         <w:r>
           <w:rPr>
             <w:rStyle w:val="Hyperlink"/>
             <w:noProof/>
           </w:rPr>
-          <w:t>Table 2: Missing value counts by attribute before imputation.</w:t>
+          <w:t>Table 3: Descriptive statistics for hourly Global_active_power (kW).</w:t>
         </w:r>
         <w:r>
           <w:rPr>
@@ -4369,7 +4533,7 @@
             <w:noProof/>
             <w:webHidden/>
           </w:rPr>
-          <w:instrText xml:space="preserve"> PAGEREF _Toc231250115 \h </w:instrText>
+          <w:instrText xml:space="preserve"> PAGEREF _Toc231250116 \h </w:instrText>
         </w:r>
         <w:r>
           <w:rPr>
@@ -4389,7 +4553,7 @@
             <w:noProof/>
             <w:webHidden/>
           </w:rPr>
-          <w:t>9</w:t>
+          <w:t>12</w:t>
         </w:r>
         <w:r>
           <w:rPr>
@@ -4412,13 +4576,13 @@
           <w:noProof/>
         </w:rPr>
       </w:pPr>
-      <w:hyperlink w:anchor="_Toc231250116" w:history="1">
+      <w:hyperlink w:anchor="_Toc231250117" w:history="1">
         <w:r>
           <w:rPr>
             <w:rStyle w:val="Hyperlink"/>
             <w:noProof/>
           </w:rPr>
-          <w:t>Table 3: Descriptive statistics for hourly Global_active_power (kW).</w:t>
+          <w:t>Table 4: Summary of algorithms: type, working principle, and rationale.</w:t>
         </w:r>
         <w:r>
           <w:rPr>
@@ -4439,7 +4603,7 @@
             <w:noProof/>
             <w:webHidden/>
           </w:rPr>
-          <w:instrText xml:space="preserve"> PAGEREF _Toc231250116 \h </w:instrText>
+          <w:instrText xml:space="preserve"> PAGEREF _Toc231250117 \h </w:instrText>
         </w:r>
         <w:r>
           <w:rPr>
@@ -4459,7 +4623,7 @@
             <w:noProof/>
             <w:webHidden/>
           </w:rPr>
-          <w:t>11</w:t>
+          <w:t>15</w:t>
         </w:r>
         <w:r>
           <w:rPr>
@@ -4482,13 +4646,13 @@
           <w:noProof/>
         </w:rPr>
       </w:pPr>
-      <w:hyperlink w:anchor="_Toc231250117" w:history="1">
+      <w:hyperlink w:anchor="_Toc231250118" w:history="1">
         <w:r>
           <w:rPr>
             <w:rStyle w:val="Hyperlink"/>
             <w:noProof/>
           </w:rPr>
-          <w:t>Table 4: Summary of algorithms: type, working principle, and rationale.</w:t>
+          <w:t>Table 5: Test-set performance metrics for all three models.</w:t>
         </w:r>
         <w:r>
           <w:rPr>
@@ -4509,7 +4673,7 @@
             <w:noProof/>
             <w:webHidden/>
           </w:rPr>
-          <w:instrText xml:space="preserve"> PAGEREF _Toc231250117 \h </w:instrText>
+          <w:instrText xml:space="preserve"> PAGEREF _Toc231250118 \h </w:instrText>
         </w:r>
         <w:r>
           <w:rPr>
@@ -4529,7 +4693,7 @@
             <w:noProof/>
             <w:webHidden/>
           </w:rPr>
-          <w:t>14</w:t>
+          <w:t>17</w:t>
         </w:r>
         <w:r>
           <w:rPr>
@@ -4552,13 +4716,13 @@
           <w:noProof/>
         </w:rPr>
       </w:pPr>
-      <w:hyperlink w:anchor="_Toc231250118" w:history="1">
+      <w:hyperlink w:anchor="_Toc231250119" w:history="1">
         <w:r>
           <w:rPr>
             <w:rStyle w:val="Hyperlink"/>
             <w:noProof/>
           </w:rPr>
-          <w:t>Table 5: Test-set performance metrics for all three models.</w:t>
+          <w:t>Table 6: Top feature importances - Gradient Boosting Regressor</w:t>
         </w:r>
         <w:r>
           <w:rPr>
@@ -4579,7 +4743,7 @@
             <w:noProof/>
             <w:webHidden/>
           </w:rPr>
-          <w:instrText xml:space="preserve"> PAGEREF _Toc231250118 \h </w:instrText>
+          <w:instrText xml:space="preserve"> PAGEREF _Toc231250119 \h </w:instrText>
         </w:r>
         <w:r>
           <w:rPr>
@@ -4599,77 +4763,7 @@
             <w:noProof/>
             <w:webHidden/>
           </w:rPr>
-          <w:t>16</w:t>
-        </w:r>
-        <w:r>
-          <w:rPr>
-            <w:noProof/>
-            <w:webHidden/>
-          </w:rPr>
-          <w:fldChar w:fldCharType="end"/>
-        </w:r>
-      </w:hyperlink>
-    </w:p>
-    <w:p>
-      <w:pPr>
-        <w:pStyle w:val="TableofFigures"/>
-        <w:tabs>
-          <w:tab w:val="right" w:leader="dot" w:pos="9016"/>
-        </w:tabs>
-        <w:spacing w:line="360" w:lineRule="auto"/>
-        <w:rPr>
-          <w:rFonts w:asciiTheme="minorHAnsi" w:eastAsiaTheme="minorEastAsia" w:hAnsiTheme="minorHAnsi"/>
-          <w:noProof/>
-        </w:rPr>
-      </w:pPr>
-      <w:hyperlink w:anchor="_Toc231250119" w:history="1">
-        <w:r>
-          <w:rPr>
-            <w:rStyle w:val="Hyperlink"/>
-            <w:noProof/>
-          </w:rPr>
-          <w:t>Table 6: Top feature importances - Gradient Boosting Regressor</w:t>
-        </w:r>
-        <w:r>
-          <w:rPr>
-            <w:noProof/>
-            <w:webHidden/>
-          </w:rPr>
-          <w:tab/>
-        </w:r>
-        <w:r>
-          <w:rPr>
-            <w:noProof/>
-            <w:webHidden/>
-          </w:rPr>
-          <w:fldChar w:fldCharType="begin"/>
-        </w:r>
-        <w:r>
-          <w:rPr>
-            <w:noProof/>
-            <w:webHidden/>
-          </w:rPr>
-          <w:instrText xml:space="preserve"> PAGEREF _Toc231250119 \h </w:instrText>
-        </w:r>
-        <w:r>
-          <w:rPr>
-            <w:noProof/>
-            <w:webHidden/>
-          </w:rPr>
-        </w:r>
-        <w:r>
-          <w:rPr>
-            <w:noProof/>
-            <w:webHidden/>
-          </w:rPr>
-          <w:fldChar w:fldCharType="separate"/>
-        </w:r>
-        <w:r>
-          <w:rPr>
-            <w:noProof/>
-            <w:webHidden/>
-          </w:rPr>
-          <w:t>17</w:t>
+          <w:t>18</w:t>
         </w:r>
         <w:r>
           <w:rPr>
@@ -4899,7 +4993,7 @@
       <w:r>
         <w:br w:type="page"/>
       </w:r>
-      <w:bookmarkStart w:id="0" w:name="_Toc231250007"/>
+      <w:bookmarkStart w:id="0" w:name="_Toc232711217"/>
       <w:r>
         <w:lastRenderedPageBreak/>
         <w:t>Abstract</w:t>
@@ -4911,7 +5005,23 @@
         <w:spacing w:before="240" w:line="360" w:lineRule="auto"/>
       </w:pPr>
       <w:r>
-        <w:t>This report presents a complete time-series forecasting pipeline for predicting household energy consumption using the UCI Individual Household Electric Power Consumption dataset (Hebrail and Berard, 2012), comprising approximately 2,075,259 minute-level observations recorded across a single French household from December 2006 to November 2010. The target variable is Global_active_power, representing instantaneous household electricity demand in kilowatts.</w:t>
+        <w:t>This report presents a complete time-series forecasting pipeline for predicting household energy consumption using the UCI Individual Household Electric Power Consumption dataset (</w:t>
+      </w:r>
+      <w:proofErr w:type="spellStart"/>
+      <w:r>
+        <w:t>Hebrail</w:t>
+      </w:r>
+      <w:proofErr w:type="spellEnd"/>
+      <w:r>
+        <w:t xml:space="preserve"> and Berard, 2012), comprising approximately 2,075,259 minute-level observations recorded across a single French household from December 2006 to November 2010. The target variable is </w:t>
+      </w:r>
+      <w:proofErr w:type="spellStart"/>
+      <w:r>
+        <w:t>Global_active_power</w:t>
+      </w:r>
+      <w:proofErr w:type="spellEnd"/>
+      <w:r>
+        <w:t>, representing instantaneous household electricity demand in kilowatts.</w:t>
       </w:r>
     </w:p>
     <w:p>
@@ -4919,7 +5029,39 @@
         <w:spacing w:before="240" w:line="360" w:lineRule="auto"/>
       </w:pPr>
       <w:r>
-        <w:t>Following systematic preprocessing, including time-based linear interpolation for missing values, datetime indexing, and hourly resampling, a feature set of 20 inputs was constructed comprising cyclical time encodings, lag variables at six temporal offsets, and 24-hour rolling statistics. Three algorithms were implemented and evaluated: SARIMA(1,0,1)(1,0,1)[7], Random Forest Regressor, and Gradient Boosting Regressor. Models were assessed on a chronological 80/20 train/test split using Mean Absolute Error (MAE), Root Mean Squared Error (RMSE), and R-squared (R2). The Gradient Boosting Regressor achieved the best performance (MAE = 0.0132 kW, RMSE = 0.0207 kW, R2 = 0.9992), substantially outperforming SARIMA (MAE = 0.2575 kW, RMSE = 0.3408 kW, R2 = -0.1941). The dominant predictive feature was Global_intensity, consistent with the physical relationship between current intensity and active power.</w:t>
+        <w:t xml:space="preserve">Following systematic preprocessing, including time-based linear interpolation for missing values, datetime indexing, and hourly resampling, a feature set of 20 inputs was constructed comprising cyclical time encodings, lag variables at six temporal offsets, and 24-hour rolling statistics. Three algorithms were implemented and evaluated: </w:t>
+      </w:r>
+      <w:proofErr w:type="gramStart"/>
+      <w:r>
+        <w:t>SARIMA(</w:t>
+      </w:r>
+      <w:proofErr w:type="gramEnd"/>
+      <w:r>
+        <w:t>1,0,</w:t>
+      </w:r>
+      <w:proofErr w:type="gramStart"/>
+      <w:r>
+        <w:t>1)(</w:t>
+      </w:r>
+      <w:proofErr w:type="gramEnd"/>
+      <w:r>
+        <w:t>1,0,</w:t>
+      </w:r>
+      <w:proofErr w:type="gramStart"/>
+      <w:r>
+        <w:t>1)[</w:t>
+      </w:r>
+      <w:proofErr w:type="gramEnd"/>
+      <w:r>
+        <w:t xml:space="preserve">7], Random Forest Regressor, and Gradient Boosting Regressor. Models were assessed on a chronological 80/20 train/test split using Mean Absolute Error (MAE), Root Mean Squared Error (RMSE), and R-squared (R2). The Gradient Boosting Regressor achieved the best performance (MAE = 0.0132 kW, RMSE = 0.0207 kW, R2 = 0.9992), substantially outperforming SARIMA (MAE = 0.2575 kW, RMSE = 0.3408 kW, R2 = -0.1941). The dominant predictive feature was </w:t>
+      </w:r>
+      <w:proofErr w:type="spellStart"/>
+      <w:r>
+        <w:t>Global_intensity</w:t>
+      </w:r>
+      <w:proofErr w:type="spellEnd"/>
+      <w:r>
+        <w:t>, consistent with the physical relationship between current intensity and active power.</w:t>
       </w:r>
     </w:p>
     <w:p>
@@ -4961,7 +5103,7 @@
       <w:pPr>
         <w:pStyle w:val="Heading1"/>
       </w:pPr>
-      <w:bookmarkStart w:id="1" w:name="_Toc231250008"/>
+      <w:bookmarkStart w:id="1" w:name="_Toc232711218"/>
       <w:r>
         <w:lastRenderedPageBreak/>
         <w:t xml:space="preserve">1. </w:t>
@@ -4984,7 +5126,15 @@
         <w:spacing w:before="240" w:line="360" w:lineRule="auto"/>
       </w:pPr>
       <w:r>
-        <w:t>Traditional statistical approaches such as ARIMA and SARIMA capture linear temporal dependencies and offer interpretable parameters, yet they struggle to model the nonlinear, multivariate relationships present in real-world consumption data (Box et al., 2015). Machine learning methods, in particular ensemble tree-based algorithms such as Random Forests and Gradient Boosting, have demonstrated competitive or superior performance in energy forecasting benchmarks by incorporating diverse feature types without requiring explicit model specification (Amasyali and El-Gohary, 2018).</w:t>
+        <w:t>Traditional statistical approaches such as ARIMA and SARIMA capture linear temporal dependencies and offer interpretable parameters, yet they struggle to model the nonlinear, multivariate relationships present in real-world consumption data (Box et al., 2015). Machine learning methods, in particular ensemble tree-based algorithms such as Random Forests and Gradient Boosting, have demonstrated competitive or superior performance in energy forecasting benchmarks by incorporating diverse feature types without requiring explicit model specification (</w:t>
+      </w:r>
+      <w:proofErr w:type="spellStart"/>
+      <w:r>
+        <w:t>Amasyali</w:t>
+      </w:r>
+      <w:proofErr w:type="spellEnd"/>
+      <w:r>
+        <w:t xml:space="preserve"> and El-Gohary, 2018).</w:t>
       </w:r>
     </w:p>
     <w:p>
@@ -4992,7 +5142,23 @@
         <w:spacing w:before="240" w:line="360" w:lineRule="auto"/>
       </w:pPr>
       <w:r>
-        <w:t>The objective of this project is to design and evaluate a complete forecasting pipeline using the UCI Individual Household Electric Power Consumption dataset (Hebrail and Berard, 2012). This dataset is particularly well-suited for benchmarking because it spans nearly four years of continuous minute-level recordings, providing sufficient temporal depth to observe multiple seasonal cycles and long-term consumption trends. This report implements and compares three algorithms, namely SARIMA, Random Forest Regressor, and Gradient Boosting Regressor, across a standardised 80/20 chronological train/test split using Mean Absolute Error, Root Mean Squared Error, and R-squared to identify the most effective approach for short-term hourly demand forecasting.</w:t>
+        <w:t>The objective of this project is to design and evaluate a complete forecasting pipeline using the UCI Individual Household Electric Power Consumption dataset (</w:t>
+      </w:r>
+      <w:proofErr w:type="spellStart"/>
+      <w:r>
+        <w:t>Hebrail</w:t>
+      </w:r>
+      <w:proofErr w:type="spellEnd"/>
+      <w:r>
+        <w:t xml:space="preserve"> and Berard, 2012). This dataset is particularly well-suited for benchmarking because it spans nearly four years of continuous minute-level recordings, providing sufficient temporal depth to observe multiple seasonal cycles and long-term consumption trends. This report implements and compares three algorithms, namely SARIMA, Random Forest Regressor, and Gradient Boosting Regressor, across a </w:t>
+      </w:r>
+      <w:proofErr w:type="spellStart"/>
+      <w:r>
+        <w:t>standardised</w:t>
+      </w:r>
+      <w:proofErr w:type="spellEnd"/>
+      <w:r>
+        <w:t xml:space="preserve"> 80/20 chronological train/test split using Mean Absolute Error, Root Mean Squared Error, and R-squared to identify the most effective approach for short-term hourly demand forecasting.</w:t>
       </w:r>
     </w:p>
     <w:p>
@@ -5024,7 +5190,7 @@
       <w:pPr>
         <w:pStyle w:val="Heading1"/>
       </w:pPr>
-      <w:bookmarkStart w:id="2" w:name="_Toc231250009"/>
+      <w:bookmarkStart w:id="2" w:name="_Toc232711219"/>
       <w:r>
         <w:lastRenderedPageBreak/>
         <w:t>2. Literature Review</w:t>
@@ -5035,7 +5201,7 @@
       <w:pPr>
         <w:pStyle w:val="Heading2"/>
       </w:pPr>
-      <w:bookmarkStart w:id="3" w:name="_Toc231250010"/>
+      <w:bookmarkStart w:id="3" w:name="_Toc232711220"/>
       <w:r>
         <w:t>2.1 Classical Time-Series Models</w:t>
       </w:r>
@@ -5046,14 +5212,22 @@
         <w:spacing w:before="240" w:line="360" w:lineRule="auto"/>
       </w:pPr>
       <w:r>
-        <w:t xml:space="preserve">Classical time-series methods have formed the backbone of energy demand forecasting for decades. ARIMA models, popularised by Box et al. (2015), decompose a series into autoregressive, integrated, and moving-average components. The seasonal extension, SARIMA, adds multiplicative seasonal terms and has been applied to daily and weekly energy patterns (Taylor and McSharry, 2007). However, SARIMA assumes linearity and stationarity and operates on a single variable at a time, limiting its capacity to exploit exogenous predictors. </w:t>
+        <w:t xml:space="preserve">Classical time-series methods have formed the backbone of energy demand forecasting for decades. ARIMA models, </w:t>
+      </w:r>
+      <w:proofErr w:type="spellStart"/>
+      <w:r>
+        <w:t>popularised</w:t>
+      </w:r>
+      <w:proofErr w:type="spellEnd"/>
+      <w:r>
+        <w:t xml:space="preserve"> by Box et al. (2015), decompose a series into autoregressive, integrated, and moving-average components. The seasonal extension, SARIMA, adds multiplicative seasonal terms and has been applied to daily and weekly energy patterns (Taylor and McSharry, 2007). However, SARIMA assumes linearity and stationarity and operates on a single variable at a time, limiting its capacity to exploit exogenous predictors. </w:t>
       </w:r>
     </w:p>
     <w:p>
       <w:pPr>
         <w:pStyle w:val="Heading2"/>
       </w:pPr>
-      <w:bookmarkStart w:id="4" w:name="_Toc231250011"/>
+      <w:bookmarkStart w:id="4" w:name="_Toc232711221"/>
       <w:r>
         <w:t>2.2 Machine Learning Approaches</w:t>
       </w:r>
@@ -5064,14 +5238,30 @@
         <w:spacing w:before="240" w:line="360" w:lineRule="auto"/>
       </w:pPr>
       <w:r>
-        <w:t>The application of machine learning to energy forecasting has grown considerably since the success of ensemble methods on tabular datasets. Amasyali and El-Gohary (2018) conducted a systematic review of 35 studies and found that ensemble tree methods consistently outperformed classical approaches on residential energy prediction tasks. Random Forest Regressors (Breiman, 2001) combine multiple decorrelated decision trees through bootstrap aggregation to reduce variance, while Gradient Boosting (Friedman, 2001) constructs trees sequentially to minimise residuals, often yielding lower bias.</w:t>
+        <w:t xml:space="preserve">The application of machine learning to energy forecasting has grown considerably since the success of ensemble methods on tabular datasets. </w:t>
+      </w:r>
+      <w:proofErr w:type="spellStart"/>
+      <w:r>
+        <w:t>Amasyali</w:t>
+      </w:r>
+      <w:proofErr w:type="spellEnd"/>
+      <w:r>
+        <w:t xml:space="preserve"> and El-Gohary (2018) conducted a systematic review of 35 studies and found that ensemble tree methods consistently outperformed classical approaches on residential energy prediction tasks. Random Forest Regressors (</w:t>
+      </w:r>
+      <w:proofErr w:type="spellStart"/>
+      <w:r>
+        <w:t>Breiman</w:t>
+      </w:r>
+      <w:proofErr w:type="spellEnd"/>
+      <w:r>
+        <w:t>, 2001) combine multiple decorrelated decision trees through bootstrap aggregation to reduce variance, while Gradient Boosting (Friedman, 2001) constructs trees sequentially to minimise residuals, often yielding lower bias.</w:t>
       </w:r>
     </w:p>
     <w:p>
       <w:pPr>
         <w:pStyle w:val="Heading2"/>
       </w:pPr>
-      <w:bookmarkStart w:id="5" w:name="_Toc231250012"/>
+      <w:bookmarkStart w:id="5" w:name="_Toc232711222"/>
       <w:r>
         <w:t>2.3 Deep Learning and Hybrid Methods</w:t>
       </w:r>
@@ -5102,7 +5292,7 @@
       <w:pPr>
         <w:pStyle w:val="Heading1"/>
       </w:pPr>
-      <w:bookmarkStart w:id="6" w:name="_Toc231250013"/>
+      <w:bookmarkStart w:id="6" w:name="_Toc232711223"/>
       <w:r>
         <w:lastRenderedPageBreak/>
         <w:t>3. Data Collection</w:t>
@@ -5114,9 +5304,17 @@
         <w:spacing w:before="240" w:line="360" w:lineRule="auto"/>
       </w:pPr>
       <w:r>
-        <w:t xml:space="preserve">The dataset selected is the Individual Household Electric Power Consumption dataset (Hebrail and Berard, 2012) from the UCI Machine Learning Repository, also available at </w:t>
-      </w:r>
-      <w:hyperlink r:id="rId12" w:history="1">
+        <w:t>The dataset selected is the Individual Household Electric Power Consumption dataset (</w:t>
+      </w:r>
+      <w:proofErr w:type="spellStart"/>
+      <w:r>
+        <w:t>Hebrail</w:t>
+      </w:r>
+      <w:proofErr w:type="spellEnd"/>
+      <w:r>
+        <w:t xml:space="preserve"> and Berard, 2012) from the UCI Machine Learning Repository, also available at </w:t>
+      </w:r>
+      <w:hyperlink r:id="rId13" w:history="1">
         <w:r>
           <w:rPr>
             <w:rStyle w:val="Hyperlink"/>
@@ -5128,7 +5326,15 @@
         <w:t>.</w:t>
       </w:r>
       <w:r>
-        <w:t xml:space="preserve"> It records minute-by-minute electrical measurements for a household in Sceaux, France, from December 2006 to November 2010, comprising approximately 2,075,259 observations across nine attributes as described in Table 1.</w:t>
+        <w:t xml:space="preserve"> It records minute-by-minute electrical measurements for a household in </w:t>
+      </w:r>
+      <w:proofErr w:type="spellStart"/>
+      <w:r>
+        <w:t>Sceaux</w:t>
+      </w:r>
+      <w:proofErr w:type="spellEnd"/>
+      <w:r>
+        <w:t>, France, from December 2006 to November 2010, comprising approximately 2,075,259 observations across nine attributes as described in Table 1.</w:t>
       </w:r>
     </w:p>
     <w:p>
@@ -5465,13 +5671,24 @@
                 <w:szCs w:val="22"/>
               </w:rPr>
             </w:pPr>
-            <w:r>
-              <w:rPr>
-                <w:sz w:val="22"/>
-                <w:szCs w:val="22"/>
-              </w:rPr>
-              <w:t>hh:mm:ss</w:t>
-            </w:r>
+            <w:proofErr w:type="spellStart"/>
+            <w:r>
+              <w:rPr>
+                <w:sz w:val="22"/>
+                <w:szCs w:val="22"/>
+              </w:rPr>
+              <w:t>hh:</w:t>
+            </w:r>
+            <w:proofErr w:type="gramStart"/>
+            <w:r>
+              <w:rPr>
+                <w:sz w:val="22"/>
+                <w:szCs w:val="22"/>
+              </w:rPr>
+              <w:t>mm:ss</w:t>
+            </w:r>
+            <w:proofErr w:type="spellEnd"/>
+            <w:proofErr w:type="gramEnd"/>
           </w:p>
         </w:tc>
         <w:tc>
@@ -5538,6 +5755,7 @@
                 <w:szCs w:val="22"/>
               </w:rPr>
             </w:pPr>
+            <w:proofErr w:type="spellStart"/>
             <w:r>
               <w:rPr>
                 <w:sz w:val="22"/>
@@ -5545,6 +5763,7 @@
               </w:rPr>
               <w:t>Global_active_power</w:t>
             </w:r>
+            <w:proofErr w:type="spellEnd"/>
           </w:p>
         </w:tc>
         <w:tc>
@@ -5645,6 +5864,7 @@
                 <w:szCs w:val="22"/>
               </w:rPr>
             </w:pPr>
+            <w:proofErr w:type="spellStart"/>
             <w:r>
               <w:rPr>
                 <w:sz w:val="22"/>
@@ -5652,6 +5872,7 @@
               </w:rPr>
               <w:t>Global_reactive_power</w:t>
             </w:r>
+            <w:proofErr w:type="spellEnd"/>
           </w:p>
         </w:tc>
         <w:tc>
@@ -5859,6 +6080,7 @@
                 <w:szCs w:val="22"/>
               </w:rPr>
             </w:pPr>
+            <w:proofErr w:type="spellStart"/>
             <w:r>
               <w:rPr>
                 <w:sz w:val="22"/>
@@ -5866,6 +6088,7 @@
               </w:rPr>
               <w:t>Global_intensity</w:t>
             </w:r>
+            <w:proofErr w:type="spellEnd"/>
           </w:p>
         </w:tc>
         <w:tc>
@@ -6270,7 +6493,7 @@
       <w:pPr>
         <w:pStyle w:val="Heading1"/>
       </w:pPr>
-      <w:bookmarkStart w:id="8" w:name="_Toc231250014"/>
+      <w:bookmarkStart w:id="8" w:name="_Toc232711224"/>
       <w:r>
         <w:lastRenderedPageBreak/>
         <w:t>4. Data Preprocessing</w:t>
@@ -6281,7 +6504,7 @@
       <w:pPr>
         <w:pStyle w:val="Heading2"/>
       </w:pPr>
-      <w:bookmarkStart w:id="9" w:name="_Toc231250015"/>
+      <w:bookmarkStart w:id="9" w:name="_Toc232711225"/>
       <w:r>
         <w:t>4.1 Datetime Parsing and Indexing</w:t>
       </w:r>
@@ -6292,14 +6515,35 @@
         <w:spacing w:before="240" w:line="360" w:lineRule="auto"/>
       </w:pPr>
       <w:r>
-        <w:t>Date and time columns were merged and parsed into a pandas DatetimeIndex (format '%d/%m/%Y %H:%M:%S'), enabling resampling and feature extraction.</w:t>
+        <w:t xml:space="preserve">Date and time columns were merged and parsed into a </w:t>
+      </w:r>
+      <w:proofErr w:type="gramStart"/>
+      <w:r>
+        <w:t xml:space="preserve">pandas </w:t>
+      </w:r>
+      <w:proofErr w:type="spellStart"/>
+      <w:r>
+        <w:t>DatetimeIndex</w:t>
+      </w:r>
+      <w:proofErr w:type="spellEnd"/>
+      <w:proofErr w:type="gramEnd"/>
+      <w:r>
+        <w:t xml:space="preserve"> (format '%d/%m/%Y %</w:t>
+      </w:r>
+      <w:proofErr w:type="gramStart"/>
+      <w:r>
+        <w:t>H:%M:%</w:t>
+      </w:r>
+      <w:proofErr w:type="gramEnd"/>
+      <w:r>
+        <w:t>S'), enabling resampling and feature extraction.</w:t>
       </w:r>
     </w:p>
     <w:p>
       <w:pPr>
         <w:pStyle w:val="Heading2"/>
       </w:pPr>
-      <w:bookmarkStart w:id="10" w:name="_Toc231250016"/>
+      <w:bookmarkStart w:id="10" w:name="_Toc232711226"/>
       <w:r>
         <w:t>4.2 Missing Value Handling</w:t>
       </w:r>
@@ -6310,10 +6554,41 @@
         <w:spacing w:before="240" w:line="360" w:lineRule="auto"/>
       </w:pPr>
       <w:r>
-        <w:t xml:space="preserve">The dataset contains missing values encoded as '?' across all measurement columns, loaded as NaN via na_values=['?']. A total of 25,979 observations were missing per attribute, likely corresponding to contiguous sensor outage periods (see Table 2). </w:t>
-      </w:r>
-      <w:r>
-        <w:t>Time-based linear interpolation (df.interpolate(method='time')) was applied as the primary imputation strategy, estimating missing values proportionally between flanking observations and preserving temporal continuity. This approach is preferred over constant forward-fill or mean imputation in time-series contexts because it preserves the increasing time axis and avoids abrupt discontinuities at gap boundaries, which can distort autocorrelation and increase lag-feature errors during training (Hyndman and Athanasopoulos, 2021).</w:t>
+        <w:t xml:space="preserve">The dataset contains missing values encoded as '?' across all measurement columns, loaded as </w:t>
+      </w:r>
+      <w:proofErr w:type="spellStart"/>
+      <w:r>
+        <w:t>NaN</w:t>
+      </w:r>
+      <w:proofErr w:type="spellEnd"/>
+      <w:r>
+        <w:t xml:space="preserve"> via </w:t>
+      </w:r>
+      <w:proofErr w:type="spellStart"/>
+      <w:r>
+        <w:t>na_values</w:t>
+      </w:r>
+      <w:proofErr w:type="spellEnd"/>
+      <w:proofErr w:type="gramStart"/>
+      <w:r>
+        <w:t>=[</w:t>
+      </w:r>
+      <w:proofErr w:type="gramEnd"/>
+      <w:r>
+        <w:t xml:space="preserve">'?']. A total of 25,979 observations were missing per attribute, likely corresponding to contiguous sensor outage periods (see Table 2). </w:t>
+      </w:r>
+      <w:r>
+        <w:t>Time-based linear interpolation (</w:t>
+      </w:r>
+      <w:proofErr w:type="spellStart"/>
+      <w:proofErr w:type="gramStart"/>
+      <w:r>
+        <w:t>df.interpolate</w:t>
+      </w:r>
+      <w:proofErr w:type="spellEnd"/>
+      <w:proofErr w:type="gramEnd"/>
+      <w:r>
+        <w:t>(method='time')) was applied as the primary imputation strategy, estimating missing values proportionally between flanking observations and preserving temporal continuity. This approach is preferred over constant forward-fill or mean imputation in time-series contexts because it preserves the increasing time axis and avoids abrupt discontinuities at gap boundaries, which can distort autocorrelation and increase lag-feature errors during training (Hyndman and Athanasopoulos, 2021).</w:t>
       </w:r>
     </w:p>
     <w:p>
@@ -6473,6 +6748,7 @@
                 <w:szCs w:val="22"/>
               </w:rPr>
             </w:pPr>
+            <w:proofErr w:type="spellStart"/>
             <w:r>
               <w:rPr>
                 <w:sz w:val="22"/>
@@ -6480,6 +6756,7 @@
               </w:rPr>
               <w:t>Global_active_power</w:t>
             </w:r>
+            <w:proofErr w:type="spellEnd"/>
           </w:p>
         </w:tc>
         <w:tc>
@@ -6546,6 +6823,7 @@
                 <w:szCs w:val="22"/>
               </w:rPr>
             </w:pPr>
+            <w:proofErr w:type="spellStart"/>
             <w:r>
               <w:rPr>
                 <w:sz w:val="22"/>
@@ -6553,6 +6831,7 @@
               </w:rPr>
               <w:t>Global_reactive_power</w:t>
             </w:r>
+            <w:proofErr w:type="spellEnd"/>
           </w:p>
         </w:tc>
         <w:tc>
@@ -6692,6 +6971,7 @@
                 <w:szCs w:val="22"/>
               </w:rPr>
             </w:pPr>
+            <w:proofErr w:type="spellStart"/>
             <w:r>
               <w:rPr>
                 <w:sz w:val="22"/>
@@ -6699,6 +6979,7 @@
               </w:rPr>
               <w:t>Global_intensity</w:t>
             </w:r>
+            <w:proofErr w:type="spellEnd"/>
           </w:p>
         </w:tc>
         <w:tc>
@@ -6812,7 +7093,7 @@
       <w:pPr>
         <w:pStyle w:val="Heading2"/>
       </w:pPr>
-      <w:bookmarkStart w:id="12" w:name="_Toc231250017"/>
+      <w:bookmarkStart w:id="12" w:name="_Toc232711227"/>
       <w:r>
         <w:t>4.3 Resampling to Hourly Frequency</w:t>
       </w:r>
@@ -6823,7 +7104,28 @@
         <w:spacing w:before="240" w:line="360" w:lineRule="auto"/>
       </w:pPr>
       <w:r>
-        <w:t xml:space="preserve">The raw minute-level data were resampled to hourly frequency by computing the mean of all readings within each hour using df_raw.resample('h').mean(). </w:t>
+        <w:t xml:space="preserve">The raw minute-level data were resampled to hourly frequency by computing the mean of all readings within each hour using </w:t>
+      </w:r>
+      <w:proofErr w:type="spellStart"/>
+      <w:r>
+        <w:t>df_</w:t>
+      </w:r>
+      <w:proofErr w:type="gramStart"/>
+      <w:r>
+        <w:t>raw.resample</w:t>
+      </w:r>
+      <w:proofErr w:type="spellEnd"/>
+      <w:proofErr w:type="gramEnd"/>
+      <w:r>
+        <w:t>('h'</w:t>
+      </w:r>
+      <w:proofErr w:type="gramStart"/>
+      <w:r>
+        <w:t>).mean</w:t>
+      </w:r>
+      <w:proofErr w:type="gramEnd"/>
+      <w:r>
+        <w:t xml:space="preserve">(). </w:t>
       </w:r>
       <w:r>
         <w:t>Hourly resampling preserves the diurnal pattern, reduces dataset size by 60×, and smooths transient noise (Hyndman and Athanasopoulos, 2021)</w:t>
@@ -6839,7 +7141,7 @@
       <w:pPr>
         <w:pStyle w:val="Heading1"/>
       </w:pPr>
-      <w:bookmarkStart w:id="13" w:name="_Toc231250018"/>
+      <w:bookmarkStart w:id="13" w:name="_Toc232711228"/>
       <w:r>
         <w:lastRenderedPageBreak/>
         <w:t>5. Feature Engineering</w:t>
@@ -6851,7 +7153,47 @@
         <w:spacing w:before="240" w:line="360" w:lineRule="auto"/>
       </w:pPr>
       <w:r>
-        <w:t>Following preprocessing, 20 time-based and statistical features were derived to provide the machine learning models with predictive signals beyond the raw energy reading. Feature engineering is essential for non-parametric models that cannot implicitly learn periodic structure from index positions alone (</w:t>
+        <w:t xml:space="preserve">Following preprocessing, 20 time-based and statistical features were derived to provide the machine learning models with predictive signals beyond the raw energy reading. </w:t>
+      </w:r>
+      <w:r>
+        <w:t>Feature engineering is essential for non-parametric models that cannot implicitly learn periodic structure from index positions alone (Bontempi et al., 2013).</w:t>
+      </w:r>
+      <w:r>
+        <w:t xml:space="preserve"> </w:t>
+      </w:r>
+      <w:r>
+        <w:t xml:space="preserve">Six calendar features were extracted: hour of the day, day of the week, day of the year, month, year, and a binary </w:t>
+      </w:r>
+      <w:proofErr w:type="spellStart"/>
+      <w:r>
+        <w:t>is_weekend</w:t>
+      </w:r>
+      <w:proofErr w:type="spellEnd"/>
+      <w:r>
+        <w:t xml:space="preserve"> indicator.</w:t>
+      </w:r>
+      <w:r>
+        <w:t xml:space="preserve"> </w:t>
+      </w:r>
+      <w:r>
+        <w:t>Sine and cosine transformations were applied to hour and month to produce four cyclical encodings, eliminating the artificial ordinal distance between period boundaries that would arise if raw integer values were passed directly to the model. For example, without cyclical encoding, hour 23 and hour 0 appear maximally distant in feature space despite being separated by only one minute in real time; the sine-cosine transformation maps both to adjacent points on the unit circle, correctly preserving temporal proximity (Bontempi et al., 2013).</w:t>
+      </w:r>
+    </w:p>
+    <w:p>
+      <w:pPr>
+        <w:spacing w:before="240" w:line="360" w:lineRule="auto"/>
+      </w:pPr>
+      <w:r>
+        <w:t xml:space="preserve">Six lag features were constructed by shifting the target variable by 1, 2, 3, 24, 48, and 168 hours. </w:t>
+      </w:r>
+      <w:r>
+        <w:t>The 24-hour and 168-hour lags capture the strong diurnal and weekly periodicity typical of household consumption, and literature consistently identifies these as the most predictive temporal inputs</w:t>
+      </w:r>
+      <w:r>
+        <w:t xml:space="preserve"> </w:t>
+      </w:r>
+      <w:r>
+        <w:t>(</w:t>
       </w:r>
       <w:r>
         <w:rPr>
@@ -6861,41 +7203,30 @@
         <w:t>Bontempi et al., 2013</w:t>
       </w:r>
       <w:r>
-        <w:t>). Six calendar features were extracted: hour of the day, day of the week, day of the year, month, year, and a binary is_weekend indicator.</w:t>
+        <w:t xml:space="preserve">). </w:t>
+      </w:r>
+      <w:r>
+        <w:t>A 24-hour rolling mean and standard deviation (one-step lagged to prevent leakage) captured recent consumption level and variability.</w:t>
       </w:r>
       <w:r>
         <w:t xml:space="preserve"> </w:t>
       </w:r>
       <w:r>
-        <w:t>Sine and cosine transformations were applied to hour and month to produce four cyclical encodings, eliminating the artificial ordinal distance between period boundaries that would arise if raw integer values were passed directly to the model. For example, without cyclical encoding, hour 23 and hour 0 appear maximally distant in feature space despite being separated by only one minute in real time; the sine-cosine transformation maps both to adjacent points on the unit circle, correctly preserving temporal proximity (Bontempi et al., 2013).</w:t>
+        <w:t xml:space="preserve">After removing 168 rows containing </w:t>
+      </w:r>
+      <w:proofErr w:type="spellStart"/>
+      <w:r>
+        <w:t>NaN</w:t>
+      </w:r>
+      <w:proofErr w:type="spellEnd"/>
+      <w:r>
+        <w:t xml:space="preserve"> values from lag and rolling operations, the final dataset comprised 34,421 hourly observations with 20 engineered input features.</w:t>
       </w:r>
     </w:p>
     <w:p>
       <w:pPr>
         <w:spacing w:before="240" w:line="360" w:lineRule="auto"/>
       </w:pPr>
-      <w:r>
-        <w:t>Six lag features were constructed by shifting the target variable by 1, 2, 3, 24, 48, and 168 hours. The 24-hour and 168-hour lags capture the strong diurnal and weekly periodicity typical of household consumption, and literature consistently identifies these as the most predictive temporal inputs (</w:t>
-      </w:r>
-      <w:r>
-        <w:rPr>
-          <w:i/>
-          <w:iCs/>
-        </w:rPr>
-        <w:t>Bontempi et al., 2013</w:t>
-      </w:r>
-      <w:r>
-        <w:t xml:space="preserve">). </w:t>
-      </w:r>
-      <w:r>
-        <w:t>A 24-hour rolling mean and standard deviation (one-step lagged to prevent leakage) captured recent consumption level and variability.</w:t>
-      </w:r>
-      <w:r>
-        <w:t xml:space="preserve"> </w:t>
-      </w:r>
-      <w:r>
-        <w:t>After removing 168 rows containing NaN values from lag and rolling operations, the final dataset comprised 34,421 hourly observations with 20 engineered input features.</w:t>
-      </w:r>
     </w:p>
     <w:p>
       <w:pPr>
@@ -6934,14 +7265,9 @@
     </w:p>
     <w:p>
       <w:pPr>
-        <w:spacing w:before="240" w:line="360" w:lineRule="auto"/>
-      </w:pPr>
-    </w:p>
-    <w:p>
-      <w:pPr>
         <w:pStyle w:val="Heading1"/>
       </w:pPr>
-      <w:bookmarkStart w:id="14" w:name="_Toc231250019"/>
+      <w:bookmarkStart w:id="14" w:name="_Toc232711229"/>
       <w:r>
         <w:lastRenderedPageBreak/>
         <w:t>6. Exploratory Data Analysis</w:t>
@@ -6955,7 +7281,7 @@
           <w:tab w:val="left" w:pos="3720"/>
         </w:tabs>
       </w:pPr>
-      <w:bookmarkStart w:id="15" w:name="_Toc231250020"/>
+      <w:bookmarkStart w:id="15" w:name="_Toc232711230"/>
       <w:r>
         <w:t>6.1 Summary Statistics</w:t>
       </w:r>
@@ -6969,7 +7295,15 @@
         <w:spacing w:before="240" w:line="360" w:lineRule="auto"/>
       </w:pPr>
       <w:r>
-        <w:t xml:space="preserve">Table 3 presents descriptive statistics for Global_active_power following hourly resampling. </w:t>
+        <w:t xml:space="preserve">Table 3 presents descriptive statistics for </w:t>
+      </w:r>
+      <w:proofErr w:type="spellStart"/>
+      <w:r>
+        <w:t>Global_active_power</w:t>
+      </w:r>
+      <w:proofErr w:type="spellEnd"/>
+      <w:r>
+        <w:t xml:space="preserve"> following hourly resampling. </w:t>
       </w:r>
       <w:r>
         <w:t>Mean hourly consumption is 1.09 kW (SD = 1.06 kW). The distribution is right-skewed (median 0.76 kW), reflecting infrequent high-demand episodes from simultaneous appliance use.</w:t>
@@ -6992,7 +7326,15 @@
         </w:r>
       </w:fldSimple>
       <w:r>
-        <w:t>: Descriptive statistics for hourly Global_active_power (kW).</w:t>
+        <w:t xml:space="preserve">: Descriptive statistics for hourly </w:t>
+      </w:r>
+      <w:proofErr w:type="spellStart"/>
+      <w:r>
+        <w:t>Global_active_power</w:t>
+      </w:r>
+      <w:proofErr w:type="spellEnd"/>
+      <w:r>
+        <w:t xml:space="preserve"> (kW).</w:t>
       </w:r>
       <w:bookmarkEnd w:id="16"/>
     </w:p>
@@ -7616,7 +7958,7 @@
       <w:pPr>
         <w:pStyle w:val="Heading2"/>
       </w:pPr>
-      <w:bookmarkStart w:id="17" w:name="_Toc231250021"/>
+      <w:bookmarkStart w:id="17" w:name="_Toc232711231"/>
       <w:r>
         <w:t>6.2 Time-Series Patterns and Seasonality</w:t>
       </w:r>
@@ -7627,7 +7969,11 @@
         <w:spacing w:before="240" w:line="360" w:lineRule="auto"/>
       </w:pPr>
       <w:r>
-        <w:t>A line plot of daily mean Global</w:t>
+        <w:t xml:space="preserve">A line plot of daily mean </w:t>
+      </w:r>
+      <w:proofErr w:type="spellStart"/>
+      <w:r>
+        <w:t>Global</w:t>
       </w:r>
       <w:r>
         <w:t>_</w:t>
@@ -7639,7 +7985,11 @@
         <w:t>_</w:t>
       </w:r>
       <w:r>
-        <w:t>power across the full dataset reveals a clear annual seasonality, with peaks during winter months December to February due to domestic heating demand and reduced daylight hours, falling to a minimum in summer Figure 1. This pattern suggests that household electricity use is strongly influenced by both environmental conditions and routine human activity, rather than changing randomly from day to day. Visual inspection of the series is therefore useful for identifying recurring structure before any forecasting model is trained.</w:t>
+        <w:t>power</w:t>
+      </w:r>
+      <w:proofErr w:type="spellEnd"/>
+      <w:r>
+        <w:t xml:space="preserve"> across the full dataset reveals a clear annual seasonality, with peaks during winter months December to February due to domestic heating demand and reduced daylight hours, falling to a minimum in summer Figure 1. This pattern suggests that household electricity use is strongly influenced by both environmental conditions and routine human activity, rather than changing randomly from day to day. Visual inspection of the series is therefore useful for identifying recurring structure before any forecasting model is trained.</w:t>
       </w:r>
       <w:r>
         <w:t xml:space="preserve"> </w:t>
@@ -7675,7 +8025,7 @@
                     </pic:cNvPicPr>
                   </pic:nvPicPr>
                   <pic:blipFill>
-                    <a:blip r:embed="rId13" cstate="print">
+                    <a:blip r:embed="rId14" cstate="print">
                       <a:extLst>
                         <a:ext uri="{28A0092B-C50C-407E-A947-70E740481C1C}">
                           <a14:useLocalDpi xmlns:a14="http://schemas.microsoft.com/office/drawing/2010/main" val="0"/>
@@ -7744,7 +8094,7 @@
           <w:szCs w:val="22"/>
         </w:rPr>
         <w:drawing>
-          <wp:inline distT="0" distB="0" distL="0" distR="0" wp14:anchorId="2A06037C" wp14:editId="02B13C12">
+          <wp:inline distT="0" distB="0" distL="0" distR="0" wp14:anchorId="2A06037C" wp14:editId="25950204">
             <wp:extent cx="5724525" cy="4076700"/>
             <wp:effectExtent l="0" t="0" r="9525" b="0"/>
             <wp:docPr id="338557536" name="Picture 3"/>
@@ -7761,7 +8111,7 @@
                     </pic:cNvPicPr>
                   </pic:nvPicPr>
                   <pic:blipFill>
-                    <a:blip r:embed="rId14" cstate="print">
+                    <a:blip r:embed="rId15" cstate="print">
                       <a:extLst>
                         <a:ext uri="{28A0092B-C50C-407E-A947-70E740481C1C}">
                           <a14:useLocalDpi xmlns:a14="http://schemas.microsoft.com/office/drawing/2010/main" val="0"/>
@@ -7818,7 +8168,7 @@
       <w:pPr>
         <w:pStyle w:val="Heading2"/>
       </w:pPr>
-      <w:bookmarkStart w:id="20" w:name="_Toc231250022"/>
+      <w:bookmarkStart w:id="20" w:name="_Toc232711232"/>
       <w:r>
         <w:t>6.3 Diurnal and Monthly Patterns</w:t>
       </w:r>
@@ -7843,7 +8193,7 @@
         </w:rPr>
         <w:lastRenderedPageBreak/>
         <w:drawing>
-          <wp:inline distT="0" distB="0" distL="0" distR="0" wp14:anchorId="5CA6D87C" wp14:editId="7FB5F627">
+          <wp:inline distT="0" distB="0" distL="0" distR="0" wp14:anchorId="5CA6D87C" wp14:editId="66B76B1C">
             <wp:extent cx="5724525" cy="1943100"/>
             <wp:effectExtent l="0" t="0" r="9525" b="0"/>
             <wp:docPr id="1503085474" name="Picture 4"/>
@@ -7860,7 +8210,7 @@
                     </pic:cNvPicPr>
                   </pic:nvPicPr>
                   <pic:blipFill>
-                    <a:blip r:embed="rId15" cstate="print">
+                    <a:blip r:embed="rId16" cstate="print">
                       <a:extLst>
                         <a:ext uri="{28A0092B-C50C-407E-A947-70E740481C1C}">
                           <a14:useLocalDpi xmlns:a14="http://schemas.microsoft.com/office/drawing/2010/main" val="0"/>
@@ -7917,7 +8267,7 @@
       <w:pPr>
         <w:pStyle w:val="Heading2"/>
       </w:pPr>
-      <w:bookmarkStart w:id="22" w:name="_Toc231250023"/>
+      <w:bookmarkStart w:id="22" w:name="_Toc232711233"/>
       <w:r>
         <w:t>6.4 Correlation and Stationarity</w:t>
       </w:r>
@@ -7942,7 +8292,7 @@
           <w:noProof/>
         </w:rPr>
         <w:drawing>
-          <wp:inline distT="0" distB="0" distL="0" distR="0" wp14:anchorId="284C639A" wp14:editId="62CA2338">
+          <wp:inline distT="0" distB="0" distL="0" distR="0" wp14:anchorId="284C639A" wp14:editId="5A721C60">
             <wp:extent cx="5552025" cy="4193540"/>
             <wp:effectExtent l="0" t="0" r="0" b="0"/>
             <wp:docPr id="1075658546" name="Picture 5"/>
@@ -7959,7 +8309,7 @@
                     </pic:cNvPicPr>
                   </pic:nvPicPr>
                   <pic:blipFill rotWithShape="1">
-                    <a:blip r:embed="rId16" cstate="print">
+                    <a:blip r:embed="rId17" cstate="print">
                       <a:extLst>
                         <a:ext uri="{28A0092B-C50C-407E-A947-70E740481C1C}">
                           <a14:useLocalDpi xmlns:a14="http://schemas.microsoft.com/office/drawing/2010/main" val="0"/>
@@ -8022,7 +8372,7 @@
       <w:pPr>
         <w:pStyle w:val="Heading1"/>
       </w:pPr>
-      <w:bookmarkStart w:id="24" w:name="_Toc231250024"/>
+      <w:bookmarkStart w:id="24" w:name="_Toc232711234"/>
       <w:r>
         <w:lastRenderedPageBreak/>
         <w:t>7. Model Selection and Design</w:t>
@@ -8033,7 +8383,7 @@
       <w:pPr>
         <w:pStyle w:val="Heading2"/>
       </w:pPr>
-      <w:bookmarkStart w:id="25" w:name="_Toc231250025"/>
+      <w:bookmarkStart w:id="25" w:name="_Toc232711235"/>
       <w:r>
         <w:t>7.1 Chronological Train/Test Split</w:t>
       </w:r>
@@ -8051,7 +8401,7 @@
       <w:pPr>
         <w:pStyle w:val="Heading2"/>
       </w:pPr>
-      <w:bookmarkStart w:id="26" w:name="_Toc231250026"/>
+      <w:bookmarkStart w:id="26" w:name="_Toc232711236"/>
       <w:r>
         <w:t>7.2 Algorithms Selected</w:t>
       </w:r>
@@ -8062,7 +8412,47 @@
         <w:spacing w:before="240" w:line="360" w:lineRule="auto"/>
       </w:pPr>
       <w:r>
-        <w:t>Three algorithms were selected to represent a range of modelling approaches, as summarised in Table 4. SARIMA(1,0,1)(1,0,1)[7] serves as the classical statistical baseline. Random Forest Regressor (Breiman, 2001) reduces variance through bootstrap aggregation of multiple independent decision trees. Gradient Boosting Regressor (Friedman, 2001) sequentially builds shallow trees to minimise residuals, typically achieving low bias on tabular data with rich feature sets.</w:t>
+        <w:t xml:space="preserve">Three algorithms were selected to represent a range of modelling approaches, as </w:t>
+      </w:r>
+      <w:proofErr w:type="spellStart"/>
+      <w:r>
+        <w:t>summarised</w:t>
+      </w:r>
+      <w:proofErr w:type="spellEnd"/>
+      <w:r>
+        <w:t xml:space="preserve"> in Table 4. </w:t>
+      </w:r>
+      <w:proofErr w:type="gramStart"/>
+      <w:r>
+        <w:t>SARIMA(</w:t>
+      </w:r>
+      <w:proofErr w:type="gramEnd"/>
+      <w:r>
+        <w:t>1,0,</w:t>
+      </w:r>
+      <w:proofErr w:type="gramStart"/>
+      <w:r>
+        <w:t>1)(</w:t>
+      </w:r>
+      <w:proofErr w:type="gramEnd"/>
+      <w:r>
+        <w:t>1,0,</w:t>
+      </w:r>
+      <w:proofErr w:type="gramStart"/>
+      <w:r>
+        <w:t>1)[</w:t>
+      </w:r>
+      <w:proofErr w:type="gramEnd"/>
+      <w:r>
+        <w:t>7] serves as the classical statistical baseline. Random Forest Regressor (</w:t>
+      </w:r>
+      <w:proofErr w:type="spellStart"/>
+      <w:r>
+        <w:t>Breiman</w:t>
+      </w:r>
+      <w:proofErr w:type="spellEnd"/>
+      <w:r>
+        <w:t>, 2001) reduces variance through bootstrap aggregation of multiple independent decision trees. Gradient Boosting Regressor (Friedman, 2001) sequentially builds shallow trees to minimise residuals, typically achieving low bias on tabular data with rich feature sets.</w:t>
       </w:r>
     </w:p>
     <w:p>
@@ -8297,12 +8687,53 @@
                 <w:szCs w:val="22"/>
               </w:rPr>
             </w:pPr>
-            <w:r>
-              <w:rPr>
-                <w:sz w:val="22"/>
-                <w:szCs w:val="22"/>
-              </w:rPr>
-              <w:t>SARIMA(1,0,1)(1,0,1)[7]</w:t>
+            <w:proofErr w:type="gramStart"/>
+            <w:r>
+              <w:rPr>
+                <w:sz w:val="22"/>
+                <w:szCs w:val="22"/>
+              </w:rPr>
+              <w:t>SARIMA(</w:t>
+            </w:r>
+            <w:proofErr w:type="gramEnd"/>
+            <w:r>
+              <w:rPr>
+                <w:sz w:val="22"/>
+                <w:szCs w:val="22"/>
+              </w:rPr>
+              <w:t>1,0,</w:t>
+            </w:r>
+            <w:proofErr w:type="gramStart"/>
+            <w:r>
+              <w:rPr>
+                <w:sz w:val="22"/>
+                <w:szCs w:val="22"/>
+              </w:rPr>
+              <w:t>1)(</w:t>
+            </w:r>
+            <w:proofErr w:type="gramEnd"/>
+            <w:r>
+              <w:rPr>
+                <w:sz w:val="22"/>
+                <w:szCs w:val="22"/>
+              </w:rPr>
+              <w:t>1,0,</w:t>
+            </w:r>
+            <w:proofErr w:type="gramStart"/>
+            <w:r>
+              <w:rPr>
+                <w:sz w:val="22"/>
+                <w:szCs w:val="22"/>
+              </w:rPr>
+              <w:t>1)[</w:t>
+            </w:r>
+            <w:proofErr w:type="gramEnd"/>
+            <w:r>
+              <w:rPr>
+                <w:sz w:val="22"/>
+                <w:szCs w:val="22"/>
+              </w:rPr>
+              <w:t>7]</w:t>
             </w:r>
           </w:p>
         </w:tc>
@@ -8511,7 +8942,23 @@
                 <w:sz w:val="22"/>
                 <w:szCs w:val="22"/>
               </w:rPr>
-              <w:t>Averages predictions of N independent trees grown on bootstrap samples; reduces variance</w:t>
+              <w:t xml:space="preserve">Averages predictions of </w:t>
+            </w:r>
+            <w:proofErr w:type="spellStart"/>
+            <w:r>
+              <w:rPr>
+                <w:sz w:val="22"/>
+                <w:szCs w:val="22"/>
+              </w:rPr>
+              <w:t>N</w:t>
+            </w:r>
+            <w:proofErr w:type="spellEnd"/>
+            <w:r>
+              <w:rPr>
+                <w:sz w:val="22"/>
+                <w:szCs w:val="22"/>
+              </w:rPr>
+              <w:t xml:space="preserve"> independent trees grown on bootstrap samples; reduces variance</w:t>
             </w:r>
           </w:p>
         </w:tc>
@@ -8545,7 +8992,23 @@
                 <w:sz w:val="22"/>
                 <w:szCs w:val="22"/>
               </w:rPr>
-              <w:t>Robust to noise; handles non-linear interactions (Breiman, 2001)</w:t>
+              <w:t>Robust to noise; handles non-linear interactions (</w:t>
+            </w:r>
+            <w:proofErr w:type="spellStart"/>
+            <w:r>
+              <w:rPr>
+                <w:sz w:val="22"/>
+                <w:szCs w:val="22"/>
+              </w:rPr>
+              <w:t>Breiman</w:t>
+            </w:r>
+            <w:proofErr w:type="spellEnd"/>
+            <w:r>
+              <w:rPr>
+                <w:sz w:val="22"/>
+                <w:szCs w:val="22"/>
+              </w:rPr>
+              <w:t>, 2001)</w:t>
             </w:r>
           </w:p>
         </w:tc>
@@ -8696,7 +9159,7 @@
       <w:pPr>
         <w:pStyle w:val="Heading2"/>
       </w:pPr>
-      <w:bookmarkStart w:id="28" w:name="_Toc231250027"/>
+      <w:bookmarkStart w:id="28" w:name="_Toc232711237"/>
       <w:r>
         <w:lastRenderedPageBreak/>
         <w:t>7.3 Hyperparameter Configuration</w:t>
@@ -8708,14 +9171,30 @@
         <w:spacing w:before="240" w:line="360" w:lineRule="auto"/>
       </w:pPr>
       <w:r>
-        <w:t>Random Forest used 200 estimators with a maximum depth of 15; a higher tree count was found to yield diminishing returns beyond this threshold on a preliminary validation window. Gradient Boosting used 300 estimators with a learning rate of 0.05, maximum depth of 6, and a subsample ratio of 0.8 to introduce stochastic regularisation and reduce overfitting on the dense hourly feature matrix. SARIMA order (1,0,1)(1,0,1)[7] was fitted on the daily-aggregated series, with the non-seasonal difference order d = 0 and seasonal difference order D = 0 both confirmed by the ADF test result. These hyperparameter choices were made to balance predictive performance against model complexity, without exhaustive grid search, as the primary goal was algorithmic comparison rather than optimisation.</w:t>
+        <w:t>Random Forest used 200 estimators with a maximum depth of 15; a higher tree count was found to yield diminishing returns beyond this threshold on a preliminary validation window. Gradient Boosting used 300 estimators with a learning rate of 0.05, maximum depth of 6, and a subsample ratio of 0.8 to introduce stochastic regularisation and reduce overfitting on the dense hourly feature matrix. SARIMA order (1,0,</w:t>
+      </w:r>
+      <w:proofErr w:type="gramStart"/>
+      <w:r>
+        <w:t>1)(</w:t>
+      </w:r>
+      <w:proofErr w:type="gramEnd"/>
+      <w:r>
+        <w:t>1,0,</w:t>
+      </w:r>
+      <w:proofErr w:type="gramStart"/>
+      <w:r>
+        <w:t>1)[</w:t>
+      </w:r>
+      <w:proofErr w:type="gramEnd"/>
+      <w:r>
+        <w:t>7] was fitted on the daily-aggregated series, with the non-seasonal difference order d = 0 and seasonal difference order D = 0 both confirmed by the ADF test result. These hyperparameter choices were made to balance predictive performance against model complexity, without exhaustive grid search, as the primary goal was algorithmic comparison rather than optimisation.</w:t>
       </w:r>
     </w:p>
     <w:p>
       <w:pPr>
         <w:pStyle w:val="Heading1"/>
       </w:pPr>
-      <w:bookmarkStart w:id="29" w:name="_Toc231250028"/>
+      <w:bookmarkStart w:id="29" w:name="_Toc232711238"/>
       <w:r>
         <w:t>8. Code Implementation</w:t>
       </w:r>
@@ -8726,7 +9205,33 @@
         <w:spacing w:before="240" w:line="360" w:lineRule="auto"/>
       </w:pPr>
       <w:r>
-        <w:t>The pipeline is implemented in main.ipynb using pandas, numpy, matplotlib, seaborn, scikit-learn, and statsmodels.</w:t>
+        <w:t xml:space="preserve">The pipeline is implemented in </w:t>
+      </w:r>
+      <w:proofErr w:type="spellStart"/>
+      <w:proofErr w:type="gramStart"/>
+      <w:r>
+        <w:t>main.ipynb</w:t>
+      </w:r>
+      <w:proofErr w:type="spellEnd"/>
+      <w:proofErr w:type="gramEnd"/>
+      <w:r>
+        <w:t xml:space="preserve"> using pandas, </w:t>
+      </w:r>
+      <w:proofErr w:type="spellStart"/>
+      <w:r>
+        <w:t>numpy</w:t>
+      </w:r>
+      <w:proofErr w:type="spellEnd"/>
+      <w:r>
+        <w:t xml:space="preserve">, matplotlib, seaborn, scikit-learn, and </w:t>
+      </w:r>
+      <w:proofErr w:type="spellStart"/>
+      <w:r>
+        <w:t>statsmodels</w:t>
+      </w:r>
+      <w:proofErr w:type="spellEnd"/>
+      <w:r>
+        <w:t>.</w:t>
       </w:r>
     </w:p>
     <w:p>
@@ -8734,7 +9239,49 @@
         <w:spacing w:before="240" w:line="360" w:lineRule="auto"/>
       </w:pPr>
       <w:r>
-        <w:t>The dataset was loaded using pandas.read_csv() with sep=';' and na_values=['?']. The 80/20 chronological split was implemented via integer indexing to prevent temporal leakage:</w:t>
+        <w:t xml:space="preserve">The dataset was loaded using </w:t>
+      </w:r>
+      <w:proofErr w:type="spellStart"/>
+      <w:proofErr w:type="gramStart"/>
+      <w:r>
+        <w:t>pandas.read</w:t>
+      </w:r>
+      <w:proofErr w:type="gramEnd"/>
+      <w:r>
+        <w:t>_</w:t>
+      </w:r>
+      <w:proofErr w:type="gramStart"/>
+      <w:r>
+        <w:t>csv</w:t>
+      </w:r>
+      <w:proofErr w:type="spellEnd"/>
+      <w:r>
+        <w:t>(</w:t>
+      </w:r>
+      <w:proofErr w:type="gramEnd"/>
+      <w:r>
+        <w:t xml:space="preserve">) with </w:t>
+      </w:r>
+      <w:proofErr w:type="spellStart"/>
+      <w:r>
+        <w:t>sep</w:t>
+      </w:r>
+      <w:proofErr w:type="spellEnd"/>
+      <w:r>
+        <w:t xml:space="preserve">=';' and </w:t>
+      </w:r>
+      <w:proofErr w:type="spellStart"/>
+      <w:r>
+        <w:t>na_values</w:t>
+      </w:r>
+      <w:proofErr w:type="spellEnd"/>
+      <w:proofErr w:type="gramStart"/>
+      <w:r>
+        <w:t>=[</w:t>
+      </w:r>
+      <w:proofErr w:type="gramEnd"/>
+      <w:r>
+        <w:t>'?']. The 80/20 chronological split was implemented via integer indexing to prevent temporal leakage:</w:t>
       </w:r>
     </w:p>
     <w:p>
@@ -8742,63 +9289,41 @@
         <w:spacing w:before="240" w:line="360" w:lineRule="auto"/>
         <w:ind w:left="720"/>
       </w:pPr>
+      <w:proofErr w:type="spellStart"/>
       <w:r>
         <w:rPr>
           <w:rFonts w:ascii="Courier New" w:eastAsia="Courier New" w:hAnsi="Courier New" w:cs="Courier New"/>
           <w:sz w:val="18"/>
           <w:szCs w:val="18"/>
         </w:rPr>
-        <w:t>split_idx = int(len(X) * 0.80)</w:t>
-      </w:r>
-    </w:p>
-    <w:p>
-      <w:pPr>
-        <w:spacing w:line="360" w:lineRule="auto"/>
-        <w:ind w:left="720"/>
-      </w:pPr>
+        <w:t>split_idx</w:t>
+      </w:r>
+      <w:proofErr w:type="spellEnd"/>
       <w:r>
         <w:rPr>
           <w:rFonts w:ascii="Courier New" w:eastAsia="Courier New" w:hAnsi="Courier New" w:cs="Courier New"/>
           <w:sz w:val="18"/>
           <w:szCs w:val="18"/>
         </w:rPr>
-        <w:t>X_train, X_test = X.iloc[:split_idx], X.iloc[split_idx:]</w:t>
-      </w:r>
-    </w:p>
-    <w:p>
-      <w:pPr>
-        <w:spacing w:line="360" w:lineRule="auto"/>
-        <w:ind w:left="720"/>
-      </w:pPr>
+        <w:t xml:space="preserve"> = int(</w:t>
+      </w:r>
+      <w:proofErr w:type="spellStart"/>
       <w:r>
         <w:rPr>
           <w:rFonts w:ascii="Courier New" w:eastAsia="Courier New" w:hAnsi="Courier New" w:cs="Courier New"/>
           <w:sz w:val="18"/>
           <w:szCs w:val="18"/>
         </w:rPr>
-        <w:t>y_train, y_test = y.iloc[:split_idx], y.iloc[split_idx:]</w:t>
-      </w:r>
-    </w:p>
-    <w:p>
-      <w:pPr>
-        <w:spacing w:before="240" w:line="360" w:lineRule="auto"/>
-      </w:pPr>
-      <w:r>
-        <w:t>SARIMA was fitted using statsmodels SARIMAX with disp=False. Random Forest and Gradient Boosting were fitted on the hourly training feature matrix using scikit-learn. A shared evaluation helper computed MAE, RMSE, and R2 consistently across all three algorithms:</w:t>
-      </w:r>
-    </w:p>
-    <w:p>
-      <w:pPr>
-        <w:spacing w:before="240" w:line="360" w:lineRule="auto"/>
-        <w:ind w:left="720"/>
-      </w:pPr>
+        <w:t>len</w:t>
+      </w:r>
+      <w:proofErr w:type="spellEnd"/>
       <w:r>
         <w:rPr>
           <w:rFonts w:ascii="Courier New" w:eastAsia="Courier New" w:hAnsi="Courier New" w:cs="Courier New"/>
           <w:sz w:val="18"/>
           <w:szCs w:val="18"/>
         </w:rPr>
-        <w:t>def evaluate(y_true, y_pred, model_name='Model'):</w:t>
+        <w:t>(X) * 0.80)</w:t>
       </w:r>
     </w:p>
     <w:p>
@@ -8806,92 +9331,740 @@
         <w:spacing w:line="360" w:lineRule="auto"/>
         <w:ind w:left="720"/>
       </w:pPr>
+      <w:proofErr w:type="spellStart"/>
       <w:r>
         <w:rPr>
           <w:rFonts w:ascii="Courier New" w:eastAsia="Courier New" w:hAnsi="Courier New" w:cs="Courier New"/>
           <w:sz w:val="18"/>
           <w:szCs w:val="18"/>
         </w:rPr>
-        <w:t xml:space="preserve">    mae  = mean_absolute_error(y_true, y_pred)</w:t>
-      </w:r>
-    </w:p>
-    <w:p>
-      <w:pPr>
-        <w:spacing w:line="360" w:lineRule="auto"/>
-        <w:ind w:left="720"/>
-      </w:pPr>
+        <w:t>X_train</w:t>
+      </w:r>
+      <w:proofErr w:type="spellEnd"/>
       <w:r>
         <w:rPr>
           <w:rFonts w:ascii="Courier New" w:eastAsia="Courier New" w:hAnsi="Courier New" w:cs="Courier New"/>
           <w:sz w:val="18"/>
           <w:szCs w:val="18"/>
         </w:rPr>
-        <w:t xml:space="preserve">    rmse = np.sqrt(mean_squared_error(y_true, y_pred))</w:t>
-      </w:r>
-    </w:p>
-    <w:p>
-      <w:pPr>
-        <w:spacing w:line="360" w:lineRule="auto"/>
-        <w:ind w:left="720"/>
-      </w:pPr>
+        <w:t xml:space="preserve">, </w:t>
+      </w:r>
+      <w:proofErr w:type="spellStart"/>
       <w:r>
         <w:rPr>
           <w:rFonts w:ascii="Courier New" w:eastAsia="Courier New" w:hAnsi="Courier New" w:cs="Courier New"/>
           <w:sz w:val="18"/>
           <w:szCs w:val="18"/>
         </w:rPr>
-        <w:t xml:space="preserve">    r2   = r2_score(y_true, y_pred)</w:t>
-      </w:r>
-    </w:p>
-    <w:p>
-      <w:pPr>
-        <w:spacing w:line="360" w:lineRule="auto"/>
-        <w:ind w:left="720"/>
+        <w:t>X_test</w:t>
+      </w:r>
+      <w:proofErr w:type="spellEnd"/>
+      <w:r>
         <w:rPr>
           <w:rFonts w:ascii="Courier New" w:eastAsia="Courier New" w:hAnsi="Courier New" w:cs="Courier New"/>
           <w:sz w:val="18"/>
           <w:szCs w:val="18"/>
         </w:rPr>
-      </w:pPr>
+        <w:t xml:space="preserve"> = </w:t>
+      </w:r>
+      <w:proofErr w:type="spellStart"/>
+      <w:proofErr w:type="gramStart"/>
       <w:r>
         <w:rPr>
           <w:rFonts w:ascii="Courier New" w:eastAsia="Courier New" w:hAnsi="Courier New" w:cs="Courier New"/>
           <w:sz w:val="18"/>
           <w:szCs w:val="18"/>
         </w:rPr>
-        <w:t xml:space="preserve">    return {'model': model_name, 'MAE': mae, 'RMSE': rmse, 'R2': r2}</w:t>
+        <w:t>X.iloc</w:t>
+      </w:r>
+      <w:proofErr w:type="spellEnd"/>
+      <w:r>
+        <w:rPr>
+          <w:rFonts w:ascii="Courier New" w:eastAsia="Courier New" w:hAnsi="Courier New" w:cs="Courier New"/>
+          <w:sz w:val="18"/>
+          <w:szCs w:val="18"/>
+        </w:rPr>
+        <w:t>[:</w:t>
+      </w:r>
+      <w:proofErr w:type="spellStart"/>
+      <w:r>
+        <w:rPr>
+          <w:rFonts w:ascii="Courier New" w:eastAsia="Courier New" w:hAnsi="Courier New" w:cs="Courier New"/>
+          <w:sz w:val="18"/>
+          <w:szCs w:val="18"/>
+        </w:rPr>
+        <w:t>split</w:t>
+      </w:r>
+      <w:proofErr w:type="gramEnd"/>
+      <w:r>
+        <w:rPr>
+          <w:rFonts w:ascii="Courier New" w:eastAsia="Courier New" w:hAnsi="Courier New" w:cs="Courier New"/>
+          <w:sz w:val="18"/>
+          <w:szCs w:val="18"/>
+        </w:rPr>
+        <w:t>_idx</w:t>
+      </w:r>
+      <w:proofErr w:type="spellEnd"/>
+      <w:r>
+        <w:rPr>
+          <w:rFonts w:ascii="Courier New" w:eastAsia="Courier New" w:hAnsi="Courier New" w:cs="Courier New"/>
+          <w:sz w:val="18"/>
+          <w:szCs w:val="18"/>
+        </w:rPr>
+        <w:t xml:space="preserve">], </w:t>
+      </w:r>
+      <w:proofErr w:type="spellStart"/>
+      <w:proofErr w:type="gramStart"/>
+      <w:r>
+        <w:rPr>
+          <w:rFonts w:ascii="Courier New" w:eastAsia="Courier New" w:hAnsi="Courier New" w:cs="Courier New"/>
+          <w:sz w:val="18"/>
+          <w:szCs w:val="18"/>
+        </w:rPr>
+        <w:t>X.iloc</w:t>
+      </w:r>
+      <w:proofErr w:type="spellEnd"/>
+      <w:proofErr w:type="gramEnd"/>
+      <w:r>
+        <w:rPr>
+          <w:rFonts w:ascii="Courier New" w:eastAsia="Courier New" w:hAnsi="Courier New" w:cs="Courier New"/>
+          <w:sz w:val="18"/>
+          <w:szCs w:val="18"/>
+        </w:rPr>
+        <w:t>[</w:t>
+      </w:r>
+      <w:proofErr w:type="spellStart"/>
+      <w:r>
+        <w:rPr>
+          <w:rFonts w:ascii="Courier New" w:eastAsia="Courier New" w:hAnsi="Courier New" w:cs="Courier New"/>
+          <w:sz w:val="18"/>
+          <w:szCs w:val="18"/>
+        </w:rPr>
+        <w:t>split_idx</w:t>
+      </w:r>
+      <w:proofErr w:type="spellEnd"/>
+      <w:r>
+        <w:rPr>
+          <w:rFonts w:ascii="Courier New" w:eastAsia="Courier New" w:hAnsi="Courier New" w:cs="Courier New"/>
+          <w:sz w:val="18"/>
+          <w:szCs w:val="18"/>
+        </w:rPr>
+        <w:t>:]</w:t>
       </w:r>
     </w:p>
     <w:p>
       <w:pPr>
         <w:spacing w:line="360" w:lineRule="auto"/>
-      </w:pPr>
+        <w:ind w:left="720"/>
+      </w:pPr>
+      <w:proofErr w:type="spellStart"/>
+      <w:r>
+        <w:rPr>
+          <w:rFonts w:ascii="Courier New" w:eastAsia="Courier New" w:hAnsi="Courier New" w:cs="Courier New"/>
+          <w:sz w:val="18"/>
+          <w:szCs w:val="18"/>
+        </w:rPr>
+        <w:t>y_train</w:t>
+      </w:r>
+      <w:proofErr w:type="spellEnd"/>
+      <w:r>
+        <w:rPr>
+          <w:rFonts w:ascii="Courier New" w:eastAsia="Courier New" w:hAnsi="Courier New" w:cs="Courier New"/>
+          <w:sz w:val="18"/>
+          <w:szCs w:val="18"/>
+        </w:rPr>
+        <w:t xml:space="preserve">, </w:t>
+      </w:r>
+      <w:proofErr w:type="spellStart"/>
+      <w:r>
+        <w:rPr>
+          <w:rFonts w:ascii="Courier New" w:eastAsia="Courier New" w:hAnsi="Courier New" w:cs="Courier New"/>
+          <w:sz w:val="18"/>
+          <w:szCs w:val="18"/>
+        </w:rPr>
+        <w:t>y_test</w:t>
+      </w:r>
+      <w:proofErr w:type="spellEnd"/>
+      <w:r>
+        <w:rPr>
+          <w:rFonts w:ascii="Courier New" w:eastAsia="Courier New" w:hAnsi="Courier New" w:cs="Courier New"/>
+          <w:sz w:val="18"/>
+          <w:szCs w:val="18"/>
+        </w:rPr>
+        <w:t xml:space="preserve"> = </w:t>
+      </w:r>
+      <w:proofErr w:type="spellStart"/>
+      <w:proofErr w:type="gramStart"/>
+      <w:r>
+        <w:rPr>
+          <w:rFonts w:ascii="Courier New" w:eastAsia="Courier New" w:hAnsi="Courier New" w:cs="Courier New"/>
+          <w:sz w:val="18"/>
+          <w:szCs w:val="18"/>
+        </w:rPr>
+        <w:t>y.iloc</w:t>
+      </w:r>
+      <w:proofErr w:type="spellEnd"/>
+      <w:r>
+        <w:rPr>
+          <w:rFonts w:ascii="Courier New" w:eastAsia="Courier New" w:hAnsi="Courier New" w:cs="Courier New"/>
+          <w:sz w:val="18"/>
+          <w:szCs w:val="18"/>
+        </w:rPr>
+        <w:t>[:</w:t>
+      </w:r>
+      <w:proofErr w:type="spellStart"/>
+      <w:r>
+        <w:rPr>
+          <w:rFonts w:ascii="Courier New" w:eastAsia="Courier New" w:hAnsi="Courier New" w:cs="Courier New"/>
+          <w:sz w:val="18"/>
+          <w:szCs w:val="18"/>
+        </w:rPr>
+        <w:t>split</w:t>
+      </w:r>
+      <w:proofErr w:type="gramEnd"/>
+      <w:r>
+        <w:rPr>
+          <w:rFonts w:ascii="Courier New" w:eastAsia="Courier New" w:hAnsi="Courier New" w:cs="Courier New"/>
+          <w:sz w:val="18"/>
+          <w:szCs w:val="18"/>
+        </w:rPr>
+        <w:t>_idx</w:t>
+      </w:r>
+      <w:proofErr w:type="spellEnd"/>
+      <w:r>
+        <w:rPr>
+          <w:rFonts w:ascii="Courier New" w:eastAsia="Courier New" w:hAnsi="Courier New" w:cs="Courier New"/>
+          <w:sz w:val="18"/>
+          <w:szCs w:val="18"/>
+        </w:rPr>
+        <w:t xml:space="preserve">], </w:t>
+      </w:r>
+      <w:proofErr w:type="spellStart"/>
+      <w:proofErr w:type="gramStart"/>
+      <w:r>
+        <w:rPr>
+          <w:rFonts w:ascii="Courier New" w:eastAsia="Courier New" w:hAnsi="Courier New" w:cs="Courier New"/>
+          <w:sz w:val="18"/>
+          <w:szCs w:val="18"/>
+        </w:rPr>
+        <w:t>y.iloc</w:t>
+      </w:r>
+      <w:proofErr w:type="spellEnd"/>
+      <w:proofErr w:type="gramEnd"/>
+      <w:r>
+        <w:rPr>
+          <w:rFonts w:ascii="Courier New" w:eastAsia="Courier New" w:hAnsi="Courier New" w:cs="Courier New"/>
+          <w:sz w:val="18"/>
+          <w:szCs w:val="18"/>
+        </w:rPr>
+        <w:t>[</w:t>
+      </w:r>
+      <w:proofErr w:type="spellStart"/>
+      <w:r>
+        <w:rPr>
+          <w:rFonts w:ascii="Courier New" w:eastAsia="Courier New" w:hAnsi="Courier New" w:cs="Courier New"/>
+          <w:sz w:val="18"/>
+          <w:szCs w:val="18"/>
+        </w:rPr>
+        <w:t>split_idx</w:t>
+      </w:r>
+      <w:proofErr w:type="spellEnd"/>
+      <w:r>
+        <w:rPr>
+          <w:rFonts w:ascii="Courier New" w:eastAsia="Courier New" w:hAnsi="Courier New" w:cs="Courier New"/>
+          <w:sz w:val="18"/>
+          <w:szCs w:val="18"/>
+        </w:rPr>
+        <w:t>:]</w:t>
+      </w:r>
+    </w:p>
+    <w:p>
+      <w:pPr>
+        <w:spacing w:before="240" w:line="360" w:lineRule="auto"/>
+      </w:pPr>
+      <w:r>
+        <w:t xml:space="preserve">SARIMA was fitted using </w:t>
+      </w:r>
+      <w:proofErr w:type="spellStart"/>
+      <w:r>
+        <w:t>statsmodels</w:t>
+      </w:r>
+      <w:proofErr w:type="spellEnd"/>
+      <w:r>
+        <w:t xml:space="preserve"> SARIMAX with </w:t>
+      </w:r>
+      <w:proofErr w:type="spellStart"/>
+      <w:r>
+        <w:t>disp</w:t>
+      </w:r>
+      <w:proofErr w:type="spellEnd"/>
+      <w:r>
+        <w:t>=False. Random Forest and Gradient Boosting were fitted on the hourly training feature matrix using scikit-learn. A shared evaluation helper computed MAE, RMSE, and R2 consistently across all three algorithms:</w:t>
+      </w:r>
+    </w:p>
+    <w:p>
+      <w:pPr>
+        <w:spacing w:before="240" w:line="360" w:lineRule="auto"/>
+        <w:ind w:left="720"/>
+      </w:pPr>
+      <w:r>
+        <w:rPr>
+          <w:rFonts w:ascii="Courier New" w:eastAsia="Courier New" w:hAnsi="Courier New" w:cs="Courier New"/>
+          <w:sz w:val="18"/>
+          <w:szCs w:val="18"/>
+        </w:rPr>
+        <w:t xml:space="preserve">def </w:t>
+      </w:r>
+      <w:proofErr w:type="gramStart"/>
+      <w:r>
+        <w:rPr>
+          <w:rFonts w:ascii="Courier New" w:eastAsia="Courier New" w:hAnsi="Courier New" w:cs="Courier New"/>
+          <w:sz w:val="18"/>
+          <w:szCs w:val="18"/>
+        </w:rPr>
+        <w:t>evaluate(</w:t>
+      </w:r>
+      <w:proofErr w:type="spellStart"/>
+      <w:proofErr w:type="gramEnd"/>
+      <w:r>
+        <w:rPr>
+          <w:rFonts w:ascii="Courier New" w:eastAsia="Courier New" w:hAnsi="Courier New" w:cs="Courier New"/>
+          <w:sz w:val="18"/>
+          <w:szCs w:val="18"/>
+        </w:rPr>
+        <w:t>y_true</w:t>
+      </w:r>
+      <w:proofErr w:type="spellEnd"/>
+      <w:r>
+        <w:rPr>
+          <w:rFonts w:ascii="Courier New" w:eastAsia="Courier New" w:hAnsi="Courier New" w:cs="Courier New"/>
+          <w:sz w:val="18"/>
+          <w:szCs w:val="18"/>
+        </w:rPr>
+        <w:t xml:space="preserve">, </w:t>
+      </w:r>
+      <w:proofErr w:type="spellStart"/>
+      <w:r>
+        <w:rPr>
+          <w:rFonts w:ascii="Courier New" w:eastAsia="Courier New" w:hAnsi="Courier New" w:cs="Courier New"/>
+          <w:sz w:val="18"/>
+          <w:szCs w:val="18"/>
+        </w:rPr>
+        <w:t>y_pred</w:t>
+      </w:r>
+      <w:proofErr w:type="spellEnd"/>
+      <w:r>
+        <w:rPr>
+          <w:rFonts w:ascii="Courier New" w:eastAsia="Courier New" w:hAnsi="Courier New" w:cs="Courier New"/>
+          <w:sz w:val="18"/>
+          <w:szCs w:val="18"/>
+        </w:rPr>
+        <w:t xml:space="preserve">, </w:t>
+      </w:r>
+      <w:proofErr w:type="spellStart"/>
+      <w:r>
+        <w:rPr>
+          <w:rFonts w:ascii="Courier New" w:eastAsia="Courier New" w:hAnsi="Courier New" w:cs="Courier New"/>
+          <w:sz w:val="18"/>
+          <w:szCs w:val="18"/>
+        </w:rPr>
+        <w:t>model_name</w:t>
+      </w:r>
+      <w:proofErr w:type="spellEnd"/>
+      <w:r>
+        <w:rPr>
+          <w:rFonts w:ascii="Courier New" w:eastAsia="Courier New" w:hAnsi="Courier New" w:cs="Courier New"/>
+          <w:sz w:val="18"/>
+          <w:szCs w:val="18"/>
+        </w:rPr>
+        <w:t>='Model'):</w:t>
+      </w:r>
     </w:p>
     <w:p>
       <w:pPr>
         <w:spacing w:line="360" w:lineRule="auto"/>
-      </w:pPr>
+        <w:ind w:left="720"/>
+      </w:pPr>
+      <w:r>
+        <w:rPr>
+          <w:rFonts w:ascii="Courier New" w:eastAsia="Courier New" w:hAnsi="Courier New" w:cs="Courier New"/>
+          <w:sz w:val="18"/>
+          <w:szCs w:val="18"/>
+        </w:rPr>
+        <w:t xml:space="preserve">    </w:t>
+      </w:r>
+      <w:proofErr w:type="spellStart"/>
+      <w:proofErr w:type="gramStart"/>
+      <w:r>
+        <w:rPr>
+          <w:rFonts w:ascii="Courier New" w:eastAsia="Courier New" w:hAnsi="Courier New" w:cs="Courier New"/>
+          <w:sz w:val="18"/>
+          <w:szCs w:val="18"/>
+        </w:rPr>
+        <w:t>mae</w:t>
+      </w:r>
+      <w:proofErr w:type="spellEnd"/>
+      <w:r>
+        <w:rPr>
+          <w:rFonts w:ascii="Courier New" w:eastAsia="Courier New" w:hAnsi="Courier New" w:cs="Courier New"/>
+          <w:sz w:val="18"/>
+          <w:szCs w:val="18"/>
+        </w:rPr>
+        <w:t xml:space="preserve">  =</w:t>
+      </w:r>
+      <w:proofErr w:type="gramEnd"/>
+      <w:r>
+        <w:rPr>
+          <w:rFonts w:ascii="Courier New" w:eastAsia="Courier New" w:hAnsi="Courier New" w:cs="Courier New"/>
+          <w:sz w:val="18"/>
+          <w:szCs w:val="18"/>
+        </w:rPr>
+        <w:t xml:space="preserve"> </w:t>
+      </w:r>
+      <w:proofErr w:type="spellStart"/>
+      <w:r>
+        <w:rPr>
+          <w:rFonts w:ascii="Courier New" w:eastAsia="Courier New" w:hAnsi="Courier New" w:cs="Courier New"/>
+          <w:sz w:val="18"/>
+          <w:szCs w:val="18"/>
+        </w:rPr>
+        <w:t>mean_absolute_</w:t>
+      </w:r>
+      <w:proofErr w:type="gramStart"/>
+      <w:r>
+        <w:rPr>
+          <w:rFonts w:ascii="Courier New" w:eastAsia="Courier New" w:hAnsi="Courier New" w:cs="Courier New"/>
+          <w:sz w:val="18"/>
+          <w:szCs w:val="18"/>
+        </w:rPr>
+        <w:t>error</w:t>
+      </w:r>
+      <w:proofErr w:type="spellEnd"/>
+      <w:r>
+        <w:rPr>
+          <w:rFonts w:ascii="Courier New" w:eastAsia="Courier New" w:hAnsi="Courier New" w:cs="Courier New"/>
+          <w:sz w:val="18"/>
+          <w:szCs w:val="18"/>
+        </w:rPr>
+        <w:t>(</w:t>
+      </w:r>
+      <w:proofErr w:type="spellStart"/>
+      <w:proofErr w:type="gramEnd"/>
+      <w:r>
+        <w:rPr>
+          <w:rFonts w:ascii="Courier New" w:eastAsia="Courier New" w:hAnsi="Courier New" w:cs="Courier New"/>
+          <w:sz w:val="18"/>
+          <w:szCs w:val="18"/>
+        </w:rPr>
+        <w:t>y_true</w:t>
+      </w:r>
+      <w:proofErr w:type="spellEnd"/>
+      <w:r>
+        <w:rPr>
+          <w:rFonts w:ascii="Courier New" w:eastAsia="Courier New" w:hAnsi="Courier New" w:cs="Courier New"/>
+          <w:sz w:val="18"/>
+          <w:szCs w:val="18"/>
+        </w:rPr>
+        <w:t xml:space="preserve">, </w:t>
+      </w:r>
+      <w:proofErr w:type="spellStart"/>
+      <w:r>
+        <w:rPr>
+          <w:rFonts w:ascii="Courier New" w:eastAsia="Courier New" w:hAnsi="Courier New" w:cs="Courier New"/>
+          <w:sz w:val="18"/>
+          <w:szCs w:val="18"/>
+        </w:rPr>
+        <w:t>y_pred</w:t>
+      </w:r>
+      <w:proofErr w:type="spellEnd"/>
+      <w:r>
+        <w:rPr>
+          <w:rFonts w:ascii="Courier New" w:eastAsia="Courier New" w:hAnsi="Courier New" w:cs="Courier New"/>
+          <w:sz w:val="18"/>
+          <w:szCs w:val="18"/>
+        </w:rPr>
+        <w:t>)</w:t>
+      </w:r>
     </w:p>
     <w:p>
       <w:pPr>
         <w:spacing w:line="360" w:lineRule="auto"/>
-      </w:pPr>
+        <w:ind w:left="720"/>
+      </w:pPr>
+      <w:r>
+        <w:rPr>
+          <w:rFonts w:ascii="Courier New" w:eastAsia="Courier New" w:hAnsi="Courier New" w:cs="Courier New"/>
+          <w:sz w:val="18"/>
+          <w:szCs w:val="18"/>
+        </w:rPr>
+        <w:t xml:space="preserve">    </w:t>
+      </w:r>
+      <w:proofErr w:type="spellStart"/>
+      <w:r>
+        <w:rPr>
+          <w:rFonts w:ascii="Courier New" w:eastAsia="Courier New" w:hAnsi="Courier New" w:cs="Courier New"/>
+          <w:sz w:val="18"/>
+          <w:szCs w:val="18"/>
+        </w:rPr>
+        <w:t>rmse</w:t>
+      </w:r>
+      <w:proofErr w:type="spellEnd"/>
+      <w:r>
+        <w:rPr>
+          <w:rFonts w:ascii="Courier New" w:eastAsia="Courier New" w:hAnsi="Courier New" w:cs="Courier New"/>
+          <w:sz w:val="18"/>
+          <w:szCs w:val="18"/>
+        </w:rPr>
+        <w:t xml:space="preserve"> = </w:t>
+      </w:r>
+      <w:proofErr w:type="spellStart"/>
+      <w:proofErr w:type="gramStart"/>
+      <w:r>
+        <w:rPr>
+          <w:rFonts w:ascii="Courier New" w:eastAsia="Courier New" w:hAnsi="Courier New" w:cs="Courier New"/>
+          <w:sz w:val="18"/>
+          <w:szCs w:val="18"/>
+        </w:rPr>
+        <w:t>np.sqrt</w:t>
+      </w:r>
+      <w:proofErr w:type="spellEnd"/>
+      <w:proofErr w:type="gramEnd"/>
+      <w:r>
+        <w:rPr>
+          <w:rFonts w:ascii="Courier New" w:eastAsia="Courier New" w:hAnsi="Courier New" w:cs="Courier New"/>
+          <w:sz w:val="18"/>
+          <w:szCs w:val="18"/>
+        </w:rPr>
+        <w:t>(</w:t>
+      </w:r>
+      <w:proofErr w:type="spellStart"/>
+      <w:r>
+        <w:rPr>
+          <w:rFonts w:ascii="Courier New" w:eastAsia="Courier New" w:hAnsi="Courier New" w:cs="Courier New"/>
+          <w:sz w:val="18"/>
+          <w:szCs w:val="18"/>
+        </w:rPr>
+        <w:t>mean_squared_</w:t>
+      </w:r>
+      <w:proofErr w:type="gramStart"/>
+      <w:r>
+        <w:rPr>
+          <w:rFonts w:ascii="Courier New" w:eastAsia="Courier New" w:hAnsi="Courier New" w:cs="Courier New"/>
+          <w:sz w:val="18"/>
+          <w:szCs w:val="18"/>
+        </w:rPr>
+        <w:t>error</w:t>
+      </w:r>
+      <w:proofErr w:type="spellEnd"/>
+      <w:r>
+        <w:rPr>
+          <w:rFonts w:ascii="Courier New" w:eastAsia="Courier New" w:hAnsi="Courier New" w:cs="Courier New"/>
+          <w:sz w:val="18"/>
+          <w:szCs w:val="18"/>
+        </w:rPr>
+        <w:t>(</w:t>
+      </w:r>
+      <w:proofErr w:type="spellStart"/>
+      <w:proofErr w:type="gramEnd"/>
+      <w:r>
+        <w:rPr>
+          <w:rFonts w:ascii="Courier New" w:eastAsia="Courier New" w:hAnsi="Courier New" w:cs="Courier New"/>
+          <w:sz w:val="18"/>
+          <w:szCs w:val="18"/>
+        </w:rPr>
+        <w:t>y_true</w:t>
+      </w:r>
+      <w:proofErr w:type="spellEnd"/>
+      <w:r>
+        <w:rPr>
+          <w:rFonts w:ascii="Courier New" w:eastAsia="Courier New" w:hAnsi="Courier New" w:cs="Courier New"/>
+          <w:sz w:val="18"/>
+          <w:szCs w:val="18"/>
+        </w:rPr>
+        <w:t xml:space="preserve">, </w:t>
+      </w:r>
+      <w:proofErr w:type="spellStart"/>
+      <w:r>
+        <w:rPr>
+          <w:rFonts w:ascii="Courier New" w:eastAsia="Courier New" w:hAnsi="Courier New" w:cs="Courier New"/>
+          <w:sz w:val="18"/>
+          <w:szCs w:val="18"/>
+        </w:rPr>
+        <w:t>y_pred</w:t>
+      </w:r>
+      <w:proofErr w:type="spellEnd"/>
+      <w:r>
+        <w:rPr>
+          <w:rFonts w:ascii="Courier New" w:eastAsia="Courier New" w:hAnsi="Courier New" w:cs="Courier New"/>
+          <w:sz w:val="18"/>
+          <w:szCs w:val="18"/>
+        </w:rPr>
+        <w:t>))</w:t>
+      </w:r>
     </w:p>
     <w:p>
       <w:pPr>
         <w:spacing w:line="360" w:lineRule="auto"/>
-      </w:pPr>
+        <w:ind w:left="720"/>
+      </w:pPr>
+      <w:r>
+        <w:rPr>
+          <w:rFonts w:ascii="Courier New" w:eastAsia="Courier New" w:hAnsi="Courier New" w:cs="Courier New"/>
+          <w:sz w:val="18"/>
+          <w:szCs w:val="18"/>
+        </w:rPr>
+        <w:t xml:space="preserve">    r2   = r2_</w:t>
+      </w:r>
+      <w:proofErr w:type="gramStart"/>
+      <w:r>
+        <w:rPr>
+          <w:rFonts w:ascii="Courier New" w:eastAsia="Courier New" w:hAnsi="Courier New" w:cs="Courier New"/>
+          <w:sz w:val="18"/>
+          <w:szCs w:val="18"/>
+        </w:rPr>
+        <w:t>score(</w:t>
+      </w:r>
+      <w:proofErr w:type="spellStart"/>
+      <w:proofErr w:type="gramEnd"/>
+      <w:r>
+        <w:rPr>
+          <w:rFonts w:ascii="Courier New" w:eastAsia="Courier New" w:hAnsi="Courier New" w:cs="Courier New"/>
+          <w:sz w:val="18"/>
+          <w:szCs w:val="18"/>
+        </w:rPr>
+        <w:t>y_true</w:t>
+      </w:r>
+      <w:proofErr w:type="spellEnd"/>
+      <w:r>
+        <w:rPr>
+          <w:rFonts w:ascii="Courier New" w:eastAsia="Courier New" w:hAnsi="Courier New" w:cs="Courier New"/>
+          <w:sz w:val="18"/>
+          <w:szCs w:val="18"/>
+        </w:rPr>
+        <w:t xml:space="preserve">, </w:t>
+      </w:r>
+      <w:proofErr w:type="spellStart"/>
+      <w:r>
+        <w:rPr>
+          <w:rFonts w:ascii="Courier New" w:eastAsia="Courier New" w:hAnsi="Courier New" w:cs="Courier New"/>
+          <w:sz w:val="18"/>
+          <w:szCs w:val="18"/>
+        </w:rPr>
+        <w:t>y_pred</w:t>
+      </w:r>
+      <w:proofErr w:type="spellEnd"/>
+      <w:r>
+        <w:rPr>
+          <w:rFonts w:ascii="Courier New" w:eastAsia="Courier New" w:hAnsi="Courier New" w:cs="Courier New"/>
+          <w:sz w:val="18"/>
+          <w:szCs w:val="18"/>
+        </w:rPr>
+        <w:t>)</w:t>
+      </w:r>
     </w:p>
     <w:p>
       <w:pPr>
         <w:spacing w:line="360" w:lineRule="auto"/>
+        <w:ind w:left="720"/>
+        <w:rPr>
+          <w:rFonts w:ascii="Courier New" w:eastAsia="Courier New" w:hAnsi="Courier New" w:cs="Courier New"/>
+          <w:sz w:val="18"/>
+          <w:szCs w:val="18"/>
+        </w:rPr>
+      </w:pPr>
+      <w:r>
+        <w:rPr>
+          <w:rFonts w:ascii="Courier New" w:eastAsia="Courier New" w:hAnsi="Courier New" w:cs="Courier New"/>
+          <w:sz w:val="18"/>
+          <w:szCs w:val="18"/>
+        </w:rPr>
+        <w:t xml:space="preserve">    return {'model': </w:t>
+      </w:r>
+      <w:proofErr w:type="spellStart"/>
+      <w:r>
+        <w:rPr>
+          <w:rFonts w:ascii="Courier New" w:eastAsia="Courier New" w:hAnsi="Courier New" w:cs="Courier New"/>
+          <w:sz w:val="18"/>
+          <w:szCs w:val="18"/>
+        </w:rPr>
+        <w:t>model_name</w:t>
+      </w:r>
+      <w:proofErr w:type="spellEnd"/>
+      <w:r>
+        <w:rPr>
+          <w:rFonts w:ascii="Courier New" w:eastAsia="Courier New" w:hAnsi="Courier New" w:cs="Courier New"/>
+          <w:sz w:val="18"/>
+          <w:szCs w:val="18"/>
+        </w:rPr>
+        <w:t xml:space="preserve">, 'MAE': </w:t>
+      </w:r>
+      <w:proofErr w:type="spellStart"/>
+      <w:r>
+        <w:rPr>
+          <w:rFonts w:ascii="Courier New" w:eastAsia="Courier New" w:hAnsi="Courier New" w:cs="Courier New"/>
+          <w:sz w:val="18"/>
+          <w:szCs w:val="18"/>
+        </w:rPr>
+        <w:t>mae</w:t>
+      </w:r>
+      <w:proofErr w:type="spellEnd"/>
+      <w:r>
+        <w:rPr>
+          <w:rFonts w:ascii="Courier New" w:eastAsia="Courier New" w:hAnsi="Courier New" w:cs="Courier New"/>
+          <w:sz w:val="18"/>
+          <w:szCs w:val="18"/>
+        </w:rPr>
+        <w:t xml:space="preserve">, 'RMSE': </w:t>
+      </w:r>
+      <w:proofErr w:type="spellStart"/>
+      <w:r>
+        <w:rPr>
+          <w:rFonts w:ascii="Courier New" w:eastAsia="Courier New" w:hAnsi="Courier New" w:cs="Courier New"/>
+          <w:sz w:val="18"/>
+          <w:szCs w:val="18"/>
+        </w:rPr>
+        <w:t>rmse</w:t>
+      </w:r>
+      <w:proofErr w:type="spellEnd"/>
+      <w:r>
+        <w:rPr>
+          <w:rFonts w:ascii="Courier New" w:eastAsia="Courier New" w:hAnsi="Courier New" w:cs="Courier New"/>
+          <w:sz w:val="18"/>
+          <w:szCs w:val="18"/>
+        </w:rPr>
+        <w:t>, 'R2': r2}</w:t>
+      </w:r>
+    </w:p>
+    <w:p>
+      <w:pPr>
+        <w:spacing w:line="360" w:lineRule="auto"/>
+      </w:pPr>
+    </w:p>
+    <w:p>
+      <w:pPr>
+        <w:spacing w:line="360" w:lineRule="auto"/>
+      </w:pPr>
+    </w:p>
+    <w:p>
+      <w:pPr>
+        <w:spacing w:line="360" w:lineRule="auto"/>
+      </w:pPr>
+    </w:p>
+    <w:p>
+      <w:pPr>
+        <w:spacing w:line="360" w:lineRule="auto"/>
+      </w:pPr>
+    </w:p>
+    <w:p>
+      <w:pPr>
+        <w:spacing w:line="360" w:lineRule="auto"/>
       </w:pPr>
     </w:p>
     <w:p>
       <w:pPr>
         <w:pStyle w:val="Heading1"/>
       </w:pPr>
-      <w:bookmarkStart w:id="30" w:name="_Toc231250029"/>
+      <w:bookmarkStart w:id="30" w:name="_Toc232711239"/>
       <w:r>
         <w:lastRenderedPageBreak/>
         <w:t>9. Model Evaluation</w:t>
@@ -8902,7 +10075,7 @@
       <w:pPr>
         <w:pStyle w:val="Heading2"/>
       </w:pPr>
-      <w:bookmarkStart w:id="31" w:name="_Toc231250030"/>
+      <w:bookmarkStart w:id="31" w:name="_Toc232711240"/>
       <w:r>
         <w:t>9.1 Performance Metrics and Results</w:t>
       </w:r>
@@ -9430,12 +10603,53 @@
                 <w:szCs w:val="22"/>
               </w:rPr>
             </w:pPr>
-            <w:r>
-              <w:rPr>
-                <w:sz w:val="22"/>
-                <w:szCs w:val="22"/>
-              </w:rPr>
-              <w:t>SARIMA(1,0,1)(1,0,1)[7]</w:t>
+            <w:proofErr w:type="gramStart"/>
+            <w:r>
+              <w:rPr>
+                <w:sz w:val="22"/>
+                <w:szCs w:val="22"/>
+              </w:rPr>
+              <w:t>SARIMA(</w:t>
+            </w:r>
+            <w:proofErr w:type="gramEnd"/>
+            <w:r>
+              <w:rPr>
+                <w:sz w:val="22"/>
+                <w:szCs w:val="22"/>
+              </w:rPr>
+              <w:t>1,0,</w:t>
+            </w:r>
+            <w:proofErr w:type="gramStart"/>
+            <w:r>
+              <w:rPr>
+                <w:sz w:val="22"/>
+                <w:szCs w:val="22"/>
+              </w:rPr>
+              <w:t>1)(</w:t>
+            </w:r>
+            <w:proofErr w:type="gramEnd"/>
+            <w:r>
+              <w:rPr>
+                <w:sz w:val="22"/>
+                <w:szCs w:val="22"/>
+              </w:rPr>
+              <w:t>1,0,</w:t>
+            </w:r>
+            <w:proofErr w:type="gramStart"/>
+            <w:r>
+              <w:rPr>
+                <w:sz w:val="22"/>
+                <w:szCs w:val="22"/>
+              </w:rPr>
+              <w:t>1)[</w:t>
+            </w:r>
+            <w:proofErr w:type="gramEnd"/>
+            <w:r>
+              <w:rPr>
+                <w:sz w:val="22"/>
+                <w:szCs w:val="22"/>
+              </w:rPr>
+              <w:t>7]</w:t>
             </w:r>
           </w:p>
         </w:tc>
@@ -9548,7 +10762,15 @@
         <w:spacing w:before="240" w:line="360" w:lineRule="auto"/>
       </w:pPr>
       <w:r>
-        <w:t>The bar chart in Figure 5 visualises all three metrics simultaneously, confirming that Gradient Boosting outperforms Random Forest, which in turn substantially outperforms SARIMA across all evaluation criteria. Both ensemble methods achieved R2 above 0.999, indicating near-perfect fit on the test set.</w:t>
+        <w:t xml:space="preserve">The bar chart in Figure 5 </w:t>
+      </w:r>
+      <w:proofErr w:type="spellStart"/>
+      <w:r>
+        <w:t>visualises</w:t>
+      </w:r>
+      <w:proofErr w:type="spellEnd"/>
+      <w:r>
+        <w:t xml:space="preserve"> all three metrics simultaneously, confirming that Gradient Boosting outperforms Random Forest, which in turn substantially outperforms SARIMA across all evaluation criteria. Both ensemble methods achieved R2 above 0.999, indicating near-perfect fit on the test set.</w:t>
       </w:r>
     </w:p>
     <w:p>
@@ -9562,7 +10784,7 @@
           <w:noProof/>
         </w:rPr>
         <w:drawing>
-          <wp:inline distT="0" distB="0" distL="0" distR="0" wp14:anchorId="06A5724E" wp14:editId="43BDC8B8">
+          <wp:inline distT="0" distB="0" distL="0" distR="0" wp14:anchorId="06A5724E" wp14:editId="59DBA5BD">
             <wp:extent cx="5715000" cy="2095500"/>
             <wp:effectExtent l="0" t="0" r="0" b="0"/>
             <wp:docPr id="838314499" name="Picture 6"/>
@@ -9579,7 +10801,7 @@
                     </pic:cNvPicPr>
                   </pic:nvPicPr>
                   <pic:blipFill>
-                    <a:blip r:embed="rId17" cstate="print">
+                    <a:blip r:embed="rId18" cstate="print">
                       <a:extLst>
                         <a:ext uri="{28A0092B-C50C-407E-A947-70E740481C1C}">
                           <a14:useLocalDpi xmlns:a14="http://schemas.microsoft.com/office/drawing/2010/main" val="0"/>
@@ -9636,7 +10858,7 @@
       <w:pPr>
         <w:pStyle w:val="Heading2"/>
       </w:pPr>
-      <w:bookmarkStart w:id="34" w:name="_Toc231250031"/>
+      <w:bookmarkStart w:id="34" w:name="_Toc232711241"/>
       <w:r>
         <w:t>9.2 Actual vs Predicted</w:t>
       </w:r>
@@ -9647,7 +10869,15 @@
         <w:spacing w:before="240" w:line="360" w:lineRule="auto"/>
       </w:pPr>
       <w:r>
-        <w:t>Figure 6 presents the actual and Gradient Boosting predicted Global_active_power values over the final 14 days of the test set. The predicted series closely tracks the actual consumption, faithfully reproducing both the diurnal pattern and the magnitude of daily peaks. Minor discrepancies occur at sharp transient spikes, where simultaneous appliance usage produces brief demand surges that are difficult to predict from historical lag features alone.</w:t>
+        <w:t xml:space="preserve">Figure 6 presents the actual and Gradient Boosting predicted </w:t>
+      </w:r>
+      <w:proofErr w:type="spellStart"/>
+      <w:r>
+        <w:t>Global_active_power</w:t>
+      </w:r>
+      <w:proofErr w:type="spellEnd"/>
+      <w:r>
+        <w:t xml:space="preserve"> values over the final 14 days of the test set. The predicted series closely tracks the actual consumption, faithfully reproducing both the diurnal pattern and the magnitude of daily peaks. Minor discrepancies occur at sharp transient spikes, where simultaneous appliance usage produces brief demand surges that are difficult to predict from historical lag features alone.</w:t>
       </w:r>
     </w:p>
     <w:p>
@@ -9680,7 +10910,7 @@
                     </pic:cNvPicPr>
                   </pic:nvPicPr>
                   <pic:blipFill>
-                    <a:blip r:embed="rId18" cstate="print">
+                    <a:blip r:embed="rId19" cstate="print">
                       <a:extLst>
                         <a:ext uri="{28A0092B-C50C-407E-A947-70E740481C1C}">
                           <a14:useLocalDpi xmlns:a14="http://schemas.microsoft.com/office/drawing/2010/main" val="0"/>
@@ -9771,7 +11001,7 @@
                     </pic:cNvPicPr>
                   </pic:nvPicPr>
                   <pic:blipFill>
-                    <a:blip r:embed="rId19" cstate="print">
+                    <a:blip r:embed="rId20" cstate="print">
                       <a:extLst>
                         <a:ext uri="{28A0092B-C50C-407E-A947-70E740481C1C}">
                           <a14:useLocalDpi xmlns:a14="http://schemas.microsoft.com/office/drawing/2010/main" val="0"/>
@@ -9832,7 +11062,7 @@
       <w:pPr>
         <w:pStyle w:val="Heading2"/>
       </w:pPr>
-      <w:bookmarkStart w:id="37" w:name="_Toc231250032"/>
+      <w:bookmarkStart w:id="37" w:name="_Toc232711242"/>
       <w:r>
         <w:t>9.3 Feature Importance and Residual Analysis</w:t>
       </w:r>
@@ -9843,7 +11073,15 @@
         <w:spacing w:before="240" w:line="360" w:lineRule="auto"/>
       </w:pPr>
       <w:r>
-        <w:t>Feature importances from the Gradient Boosting model (Table 6, Figure 8) reveal that Global_intensity dominates prediction with an importance score of 0.9993, reflecting the direct physical relationship P = V x I between active power, voltage, and current intensity. Voltage contributes a further 0.0003, while the remaining 18 engineered features collectively account for less than 0.0005 of total importance. This confirms that when electrical attributes are present in the feature set, temporal and lag features contribute marginally to prediction accuracy.</w:t>
+        <w:t xml:space="preserve">Feature importances from the Gradient Boosting model (Table 6, Figure 8) reveal that </w:t>
+      </w:r>
+      <w:proofErr w:type="spellStart"/>
+      <w:r>
+        <w:t>Global_intensity</w:t>
+      </w:r>
+      <w:proofErr w:type="spellEnd"/>
+      <w:r>
+        <w:t xml:space="preserve"> dominates prediction with an importance score of 0.9993, reflecting the direct physical relationship P = V x I between active power, voltage, and current intensity. Voltage contributes a further 0.0003, while the remaining 18 engineered features collectively account for less than 0.0005 of total importance. This confirms that when electrical attributes are present in the feature set, temporal and lag features contribute marginally to prediction accuracy.</w:t>
       </w:r>
     </w:p>
     <w:p>
@@ -10070,6 +11308,7 @@
                 <w:szCs w:val="22"/>
               </w:rPr>
             </w:pPr>
+            <w:proofErr w:type="spellStart"/>
             <w:r>
               <w:rPr>
                 <w:sz w:val="22"/>
@@ -10077,6 +11316,7 @@
               </w:rPr>
               <w:t>Global_intensity</w:t>
             </w:r>
+            <w:proofErr w:type="spellEnd"/>
           </w:p>
         </w:tc>
         <w:tc>
@@ -10392,6 +11632,7 @@
                 <w:szCs w:val="22"/>
               </w:rPr>
             </w:pPr>
+            <w:proofErr w:type="spellStart"/>
             <w:r>
               <w:rPr>
                 <w:sz w:val="22"/>
@@ -10399,6 +11640,7 @@
               </w:rPr>
               <w:t>month_cos</w:t>
             </w:r>
+            <w:proofErr w:type="spellEnd"/>
           </w:p>
         </w:tc>
         <w:tc>
@@ -10786,7 +12028,7 @@
                     </pic:cNvPicPr>
                   </pic:nvPicPr>
                   <pic:blipFill>
-                    <a:blip r:embed="rId20">
+                    <a:blip r:embed="rId21">
                       <a:extLst>
                         <a:ext uri="{28A0092B-C50C-407E-A947-70E740481C1C}">
                           <a14:useLocalDpi xmlns:a14="http://schemas.microsoft.com/office/drawing/2010/main" val="0"/>
@@ -10889,7 +12131,7 @@
                     </pic:cNvPicPr>
                   </pic:nvPicPr>
                   <pic:blipFill>
-                    <a:blip r:embed="rId21">
+                    <a:blip r:embed="rId22">
                       <a:extLst>
                         <a:ext uri="{28A0092B-C50C-407E-A947-70E740481C1C}">
                           <a14:useLocalDpi xmlns:a14="http://schemas.microsoft.com/office/drawing/2010/main" val="0"/>
@@ -10950,7 +12192,7 @@
       <w:pPr>
         <w:pStyle w:val="Heading2"/>
       </w:pPr>
-      <w:bookmarkStart w:id="41" w:name="_Toc231250033"/>
+      <w:bookmarkStart w:id="41" w:name="_Toc232711243"/>
       <w:r>
         <w:t>9.4 Comparative Discussion</w:t>
       </w:r>
@@ -10961,7 +12203,31 @@
         <w:spacing w:before="240" w:line="360" w:lineRule="auto"/>
       </w:pPr>
       <w:r>
-        <w:t>The superiority of ensemble methods over SARIMA can be attributed to three primary factors. First, Random Forest and Gradient Boosting exploit the full 20-feature multivariate input, including electrically informative attributes such as Global_intensity and sub-metering readings, whereas SARIMA operates on a univariate daily series. Second, Global_intensity effectively provides the models with near-direct algebraic access to the target through the physics of P = V x I. Third, the ensemble models represent non-linear interactions between temporal and electrical features through tree splits, which SARIMA cannot replicate. These findings align with Taylor and McSharry (2007), who reported rapid performance deterioration of ARIMA-class models beyond one-week horizons on residential load data, and with Amasyali and El-Gohary (2018), who found ensemble methods consistently outperform statistical baselines in residential forecasting.</w:t>
+        <w:t xml:space="preserve">The superiority of ensemble methods over SARIMA can be attributed to three primary factors. First, Random Forest and Gradient Boosting exploit the full 20-feature multivariate input, including electrically informative attributes such as </w:t>
+      </w:r>
+      <w:proofErr w:type="spellStart"/>
+      <w:r>
+        <w:t>Global_intensity</w:t>
+      </w:r>
+      <w:proofErr w:type="spellEnd"/>
+      <w:r>
+        <w:t xml:space="preserve"> and sub-metering readings, whereas SARIMA operates on a univariate daily series. Second, </w:t>
+      </w:r>
+      <w:proofErr w:type="spellStart"/>
+      <w:r>
+        <w:t>Global_intensity</w:t>
+      </w:r>
+      <w:proofErr w:type="spellEnd"/>
+      <w:r>
+        <w:t xml:space="preserve"> effectively provides the models with near-direct algebraic access to the target through the physics of P = V x I. Third, the ensemble models represent non-linear interactions between temporal and electrical features through tree splits, which SARIMA cannot replicate. These findings align with Taylor and McSharry (2007), who reported rapid performance deterioration of ARIMA-class models beyond one-week horizons on residential load data, and with </w:t>
+      </w:r>
+      <w:proofErr w:type="spellStart"/>
+      <w:r>
+        <w:t>Amasyali</w:t>
+      </w:r>
+      <w:proofErr w:type="spellEnd"/>
+      <w:r>
+        <w:t xml:space="preserve"> and El-Gohary (2018), who found ensemble methods consistently outperform statistical baselines in residential forecasting.</w:t>
       </w:r>
     </w:p>
     <w:p>
@@ -10978,7 +12244,7 @@
       <w:pPr>
         <w:pStyle w:val="Heading1"/>
       </w:pPr>
-      <w:bookmarkStart w:id="42" w:name="_Toc231250034"/>
+      <w:bookmarkStart w:id="42" w:name="_Toc232711244"/>
       <w:r>
         <w:lastRenderedPageBreak/>
         <w:t>10. Conclusion</w:t>
@@ -10998,7 +12264,31 @@
         <w:spacing w:before="240" w:line="360" w:lineRule="auto"/>
       </w:pPr>
       <w:r>
-        <w:t>Three algorithms were assessed on a chronological 80/20 train/test split. The Gradient Boosting Regressor achieved the highest test-set accuracy (MAE = 0.0132 kW, RMSE = 0.0207 kW, R2 = 0.9992), marginally outperforming Random Forest (MAE = 0.0146 kW, R2 = 0.9990). Both ensemble methods substantially outperformed SARIMA(1,0,1)(1,0,1)[7] (R2 = -0.1941),</w:t>
+        <w:t xml:space="preserve">Three algorithms were assessed on a chronological 80/20 train/test split. The Gradient Boosting Regressor achieved the highest test-set accuracy (MAE = 0.0132 kW, RMSE = 0.0207 kW, R2 = 0.9992), marginally outperforming Random Forest (MAE = 0.0146 kW, R2 = 0.9990). Both ensemble methods substantially outperformed </w:t>
+      </w:r>
+      <w:proofErr w:type="gramStart"/>
+      <w:r>
+        <w:t>SARIMA(</w:t>
+      </w:r>
+      <w:proofErr w:type="gramEnd"/>
+      <w:r>
+        <w:t>1,0,</w:t>
+      </w:r>
+      <w:proofErr w:type="gramStart"/>
+      <w:r>
+        <w:t>1)(</w:t>
+      </w:r>
+      <w:proofErr w:type="gramEnd"/>
+      <w:r>
+        <w:t>1,0,</w:t>
+      </w:r>
+      <w:proofErr w:type="gramStart"/>
+      <w:r>
+        <w:t>1)[</w:t>
+      </w:r>
+      <w:proofErr w:type="gramEnd"/>
+      <w:r>
+        <w:t>7] (R2 = -0.1941),</w:t>
       </w:r>
     </w:p>
     <w:p>
@@ -11006,7 +12296,15 @@
         <w:spacing w:before="240" w:line="360" w:lineRule="auto"/>
       </w:pPr>
       <w:r>
-        <w:t>It should be noted that the near-perfect performance of ensemble models is largely driven by the inclusion of Global_intensity as a feature, which provides a direct physical proxy for the target variable. For purely forecasting applications where sub-metering and electrical attributes are unavailable at prediction time, a model architecture relying solely on lag and calendar features would provide a more practically relevant evaluation.</w:t>
+        <w:t xml:space="preserve">It should be noted that the near-perfect performance of ensemble models is largely driven by the inclusion of </w:t>
+      </w:r>
+      <w:proofErr w:type="spellStart"/>
+      <w:r>
+        <w:t>Global_intensity</w:t>
+      </w:r>
+      <w:proofErr w:type="spellEnd"/>
+      <w:r>
+        <w:t xml:space="preserve"> as a feature, which provides a direct physical proxy for the target variable. For purely forecasting applications where sub-metering and electrical attributes are unavailable at prediction time, a model architecture relying solely on lag and calendar features would provide a more practically relevant evaluation.</w:t>
       </w:r>
     </w:p>
     <w:p>
@@ -11044,13 +12342,14 @@
       </w:pPr>
       <w:bookmarkStart w:id="43" w:name="_Toc232402496"/>
       <w:bookmarkStart w:id="44" w:name="_Toc232626504"/>
-      <w:bookmarkStart w:id="45" w:name="_Toc231250035"/>
+      <w:bookmarkStart w:id="45" w:name="_Toc232711245"/>
       <w:r>
         <w:lastRenderedPageBreak/>
         <w:t>Acknowledgement</w:t>
       </w:r>
       <w:bookmarkEnd w:id="43"/>
       <w:bookmarkEnd w:id="44"/>
+      <w:bookmarkEnd w:id="45"/>
     </w:p>
     <w:p>
       <w:pPr>
@@ -11074,20 +12373,26 @@
       <w:pPr>
         <w:pStyle w:val="Heading1"/>
       </w:pPr>
+      <w:bookmarkStart w:id="46" w:name="_Toc232711246"/>
       <w:r>
         <w:lastRenderedPageBreak/>
         <w:t>References</w:t>
       </w:r>
-      <w:bookmarkEnd w:id="45"/>
+      <w:bookmarkEnd w:id="46"/>
     </w:p>
     <w:p>
       <w:pPr>
         <w:spacing w:before="240" w:line="360" w:lineRule="auto"/>
       </w:pPr>
-      <w:r>
-        <w:t xml:space="preserve">Amasyali, K. and El-Gohary, N.M., 2018. A review of data-driven building energy consumption prediction studies. Renewable and Sustainable Energy Reviews, 81(1), pp.1192-1205. Available at: </w:t>
-      </w:r>
-      <w:hyperlink r:id="rId22" w:history="1">
+      <w:proofErr w:type="spellStart"/>
+      <w:r>
+        <w:t>Amasyali</w:t>
+      </w:r>
+      <w:proofErr w:type="spellEnd"/>
+      <w:r>
+        <w:t xml:space="preserve">, K. and El-Gohary, N.M., 2018. A review of data-driven building energy consumption prediction studies. Renewable and Sustainable Energy Reviews, 81(1), pp.1192-1205. Available at: </w:t>
+      </w:r>
+      <w:hyperlink r:id="rId23" w:history="1">
         <w:r>
           <w:rPr>
             <w:rStyle w:val="Hyperlink"/>
@@ -11110,6 +12415,50 @@
         <w:spacing w:before="240" w:line="360" w:lineRule="auto"/>
       </w:pPr>
       <w:r>
+        <w:t xml:space="preserve">Bontempi, G., Taieb, S.B. and Le Borgne, Y.-A., 2013. Machine learning strategies for time series forecasting. In: </w:t>
+      </w:r>
+      <w:proofErr w:type="spellStart"/>
+      <w:r>
+        <w:t>Aufaure</w:t>
+      </w:r>
+      <w:proofErr w:type="spellEnd"/>
+      <w:r>
+        <w:t xml:space="preserve">, M.-A. and Zimányi, E., eds. Business Intelligence: Second European Summer School, </w:t>
+      </w:r>
+      <w:proofErr w:type="spellStart"/>
+      <w:r>
+        <w:t>eBISS</w:t>
+      </w:r>
+      <w:proofErr w:type="spellEnd"/>
+      <w:r>
+        <w:t xml:space="preserve"> 2012, Brussels, Belgium, July 15–21, 2012, Tutorial Lectures. Lecture Notes in Business Information Processing, 138. Berlin: Springer, pp.62–77. Available at: </w:t>
+      </w:r>
+      <w:hyperlink r:id="rId24" w:history="1">
+        <w:r>
+          <w:rPr>
+            <w:rStyle w:val="Hyperlink"/>
+          </w:rPr>
+          <w:t>https://doi.org/10.1007/978-3-642-36318-4_3</w:t>
+        </w:r>
+      </w:hyperlink>
+      <w:r>
+        <w:t xml:space="preserve"> </w:t>
+      </w:r>
+      <w:r>
+        <w:t xml:space="preserve">[Accessed </w:t>
+      </w:r>
+      <w:r>
+        <w:t>18 June 2026</w:t>
+      </w:r>
+      <w:r>
+        <w:t>].</w:t>
+      </w:r>
+    </w:p>
+    <w:p>
+      <w:pPr>
+        <w:spacing w:before="240" w:line="360" w:lineRule="auto"/>
+      </w:pPr>
+      <w:r>
         <w:t>Box, G.E.P., Jenkins, G.M., Reinsel, G.C. and Ljung, G.M., 2015. Time Series Analysis: Forecasting and Control. 5th ed. Hoboken, NJ: Wiley.</w:t>
       </w:r>
     </w:p>
@@ -11117,10 +12466,15 @@
       <w:pPr>
         <w:spacing w:before="240" w:line="360" w:lineRule="auto"/>
       </w:pPr>
-      <w:r>
-        <w:t xml:space="preserve">Breiman, L., 2001. Random forests. Machine Learning, 45(1), pp.5-32. Available at: </w:t>
-      </w:r>
-      <w:hyperlink r:id="rId23" w:history="1">
+      <w:proofErr w:type="spellStart"/>
+      <w:r>
+        <w:t>Breiman</w:t>
+      </w:r>
+      <w:proofErr w:type="spellEnd"/>
+      <w:r>
+        <w:t xml:space="preserve">, L., 2001. Random forests. Machine Learning, 45(1), pp.5-32. Available at: </w:t>
+      </w:r>
+      <w:hyperlink r:id="rId25" w:history="1">
         <w:r>
           <w:rPr>
             <w:rStyle w:val="Hyperlink"/>
@@ -11143,14 +12497,14 @@
         <w:spacing w:before="240" w:line="360" w:lineRule="auto"/>
       </w:pPr>
       <w:r>
-        <w:t xml:space="preserve">Bontempi, G., Taieb, S.B. and Le Borgne, Y.-A., 2013. Machine learning strategies for time series forecasting. In: Aufaure, M.-A. and Zimányi, E., eds. Business Intelligence: Second European Summer School, eBISS 2012, Brussels, Belgium, July 15–21, 2012, Tutorial Lectures. Lecture Notes in Business Information Processing, 138. Berlin: Springer, pp.62–77. Available at: </w:t>
-      </w:r>
-      <w:hyperlink r:id="rId24" w:history="1">
+        <w:t xml:space="preserve">Friedman, J.H., 2001. Greedy function approximation: A gradient boosting machine. Annals of Statistics, 29(5), pp.1189-1232. Available at: </w:t>
+      </w:r>
+      <w:hyperlink r:id="rId26" w:history="1">
         <w:r>
           <w:rPr>
             <w:rStyle w:val="Hyperlink"/>
           </w:rPr>
-          <w:t>https://doi.org/10.1007/978-3-642-36318-4_3</w:t>
+          <w:t>https://doi.org/10.1214/aos/1013203451</w:t>
         </w:r>
       </w:hyperlink>
       <w:r>
@@ -11170,21 +12524,29 @@
       <w:pPr>
         <w:spacing w:before="240" w:line="360" w:lineRule="auto"/>
       </w:pPr>
-      <w:r>
-        <w:t xml:space="preserve">Friedman, J.H., 2001. Greedy function approximation: A gradient boosting machine. Annals of Statistics, 29(5), pp.1189-1232. Available at: </w:t>
-      </w:r>
-      <w:hyperlink r:id="rId25" w:history="1">
+      <w:proofErr w:type="spellStart"/>
+      <w:r>
+        <w:t>Hebrail</w:t>
+      </w:r>
+      <w:proofErr w:type="spellEnd"/>
+      <w:r>
+        <w:t xml:space="preserve">, G. and Berard, A., 2012. Individual Household Electric Power Consumption Data Set. UCI Machine Learning Repository. Available at: </w:t>
+      </w:r>
+      <w:hyperlink r:id="rId27" w:history="1">
         <w:r>
           <w:rPr>
             <w:rStyle w:val="Hyperlink"/>
           </w:rPr>
-          <w:t>https://doi.org/10.1214/aos/1013203451</w:t>
+          <w:t>https://archive.ics.uci.edu/dataset/235/individual+household+electric+power+consumption</w:t>
         </w:r>
       </w:hyperlink>
       <w:r>
         <w:t xml:space="preserve"> </w:t>
       </w:r>
       <w:r>
+        <w:t xml:space="preserve"> </w:t>
+      </w:r>
+      <w:r>
         <w:t xml:space="preserve">[Accessed </w:t>
       </w:r>
       <w:r>
@@ -11199,23 +12561,20 @@
         <w:spacing w:before="240" w:line="360" w:lineRule="auto"/>
       </w:pPr>
       <w:r>
-        <w:t xml:space="preserve">Hebrail, G. and Berard, A., 2012. Individual Household Electric Power Consumption Data Set. UCI Machine Learning Repository. Available at: </w:t>
-      </w:r>
-      <w:hyperlink r:id="rId26" w:history="1">
+        <w:t xml:space="preserve">Hong, T. and Fan, S., 2016. Probabilistic electric load forecasting: A tutorial review. International Journal of Forecasting, 32(3), pp.914-938. Available at: </w:t>
+      </w:r>
+      <w:hyperlink r:id="rId28" w:history="1">
         <w:r>
           <w:rPr>
             <w:rStyle w:val="Hyperlink"/>
           </w:rPr>
-          <w:t>https://archive.ics.uci.edu/dataset/235/individual+household+electric+power+consumption</w:t>
+          <w:t>https://doi.org/10.1016/j.ijforecast.2015.11.011</w:t>
         </w:r>
       </w:hyperlink>
       <w:r>
         <w:t xml:space="preserve"> </w:t>
       </w:r>
       <w:r>
-        <w:t xml:space="preserve"> </w:t>
-      </w:r>
-      <w:r>
         <w:t xml:space="preserve">[Accessed </w:t>
       </w:r>
       <w:r>
@@ -11230,37 +12589,17 @@
         <w:spacing w:before="240" w:line="360" w:lineRule="auto"/>
       </w:pPr>
       <w:r>
-        <w:t xml:space="preserve">Hong, T. and Fan, S., 2016. Probabilistic electric load forecasting: A tutorial review. International Journal of Forecasting, 32(3), pp.914-938. Available at: </w:t>
-      </w:r>
-      <w:hyperlink r:id="rId27" w:history="1">
-        <w:r>
-          <w:rPr>
-            <w:rStyle w:val="Hyperlink"/>
-          </w:rPr>
-          <w:t>https://doi.org/10.1016/j.ijforecast.2015.11.011</w:t>
-        </w:r>
-      </w:hyperlink>
-      <w:r>
-        <w:t xml:space="preserve"> </w:t>
-      </w:r>
-      <w:r>
-        <w:t xml:space="preserve">[Accessed </w:t>
-      </w:r>
-      <w:r>
-        <w:t>18 June 2026</w:t>
-      </w:r>
-      <w:r>
-        <w:t>].</w:t>
-      </w:r>
-    </w:p>
-    <w:p>
-      <w:pPr>
-        <w:spacing w:before="240" w:line="360" w:lineRule="auto"/>
-      </w:pPr>
-      <w:r>
-        <w:t xml:space="preserve">Hyndman, R.J. and Athanasopoulos, G., 2021. Forecasting: Principles and Practice. 3rd ed. Melbourne: OTexts. Available at: </w:t>
-      </w:r>
-      <w:hyperlink r:id="rId28" w:history="1">
+        <w:t xml:space="preserve">Hyndman, R.J. and Athanasopoulos, G., 2021. Forecasting: Principles and Practice. 3rd ed. Melbourne: </w:t>
+      </w:r>
+      <w:proofErr w:type="spellStart"/>
+      <w:r>
+        <w:t>OTexts</w:t>
+      </w:r>
+      <w:proofErr w:type="spellEnd"/>
+      <w:r>
+        <w:t xml:space="preserve">. Available at: </w:t>
+      </w:r>
+      <w:hyperlink r:id="rId29" w:history="1">
         <w:r>
           <w:rPr>
             <w:rStyle w:val="Hyperlink"/>
@@ -11292,7 +12631,7 @@
         <w:lastRenderedPageBreak/>
         <w:t xml:space="preserve">10(1), pp.841-851. Available at: </w:t>
       </w:r>
-      <w:hyperlink r:id="rId29" w:history="1">
+      <w:hyperlink r:id="rId30" w:history="1">
         <w:r>
           <w:rPr>
             <w:rStyle w:val="Hyperlink"/>
@@ -11320,7 +12659,7 @@
       <w:r>
         <w:t xml:space="preserve">Lim, B., Arik, S.O., Loeff, N. and Pfister, T., 2021. Temporal fusion transformers for interpretable multi-horizon time series forecasting. International Journal of Forecasting, 37(4), pp.1748-1764. Available at: </w:t>
       </w:r>
-      <w:hyperlink r:id="rId30" w:history="1">
+      <w:hyperlink r:id="rId31" w:history="1">
         <w:r>
           <w:rPr>
             <w:rStyle w:val="Hyperlink"/>
@@ -11348,7 +12687,7 @@
       <w:r>
         <w:t xml:space="preserve">Taylor, J.W. and McSharry, P.E., 2007. Short-term load forecasting methods: An evaluation based on European data. IEEE Transactions on Power Systems, 22(4), pp.2213-2219. Available at: </w:t>
       </w:r>
-      <w:hyperlink r:id="rId31" w:history="1">
+      <w:hyperlink r:id="rId32" w:history="1">
         <w:r>
           <w:rPr>
             <w:rStyle w:val="Hyperlink"/>
@@ -11375,7 +12714,7 @@
       </w:pPr>
     </w:p>
     <w:sectPr>
-      <w:footerReference w:type="default" r:id="rId32"/>
+      <w:footerReference w:type="default" r:id="rId33"/>
       <w:type w:val="continuous"/>
       <w:pgSz w:w="11906" w:h="16838" w:code="9"/>
       <w:pgMar w:top="1440" w:right="1440" w:bottom="1440" w:left="1440" w:header="720" w:footer="720" w:gutter="0"/>
@@ -12551,12 +13890,12 @@
     <w:autoRedefine/>
     <w:uiPriority w:val="39"/>
     <w:unhideWhenUsed/>
-    <w:rsid w:val="009E3395"/>
+    <w:rsid w:val="00C92A69"/>
     <w:pPr>
       <w:tabs>
         <w:tab w:val="right" w:leader="dot" w:pos="9016"/>
       </w:tabs>
-      <w:spacing w:before="240" w:after="100"/>
+      <w:spacing w:after="100"/>
     </w:pPr>
   </w:style>
   <w:style w:type="paragraph" w:styleId="TOC2">

</xml_diff>